<commit_message>
Polish manuscript to submission candidate
Rewrite text for a journal audience with a new title, add the 2026 AHA
statistical update and Ansong et al. 2026 to the references, remove all
process narration from the manuscript and supplement, restyle Word output
(12-pt Times New Roman, double spacing, continuous line numbers, AMA-style
references, journal table formatting) and rebuild figures as two-panel
publication figures with PNG, TIFF and PDF exports.

Co-Authored-By: Claude Fable 5.1 <noreply@anthropic.com>
</commit_message>
<xml_diff>
--- a/manuscript/manuscript.docx
+++ b/manuscript/manuscript.docx
@@ -7,17 +7,16 @@
         <w:pStyle w:val="Title"/>
       </w:pPr>
       <w:r>
-        <w:t>Cost-Related Healthcare Affordability Barriers Among US Stroke Survivors From 2019 Through 2025</w:t>
+        <w:t>Cost-Related Barriers to Care and Medications Among US Stroke Survivors, 2019–2025</w:t>
       </w:r>
     </w:p>
     <w:p>
+      <w:pPr>
+        <w:spacing w:line="276" w:lineRule="auto" w:after="160"/>
+        <w:jc w:val="center"/>
+      </w:pPr>
       <w:r>
-        <w:t>Working research manuscript prepared 18 September 2026</w:t>
-      </w:r>
-    </w:p>
-    <w:p>
-      <w:r>
-        <w:t>Authors: G. Blake Pierpoint</w:t>
+        <w:t>G. Blake Pierpoint</w:t>
       </w:r>
       <w:r>
         <w:rPr>
@@ -34,10 +33,11 @@
         </w:rPr>
         <w:t>1,2,3</w:t>
       </w:r>
-      <w:r/>
     </w:p>
     <w:p>
-      <w:r/>
+      <w:pPr>
+        <w:spacing w:line="276" w:lineRule="auto" w:after="160"/>
+      </w:pPr>
       <w:r>
         <w:rPr>
           <w:vertAlign w:val="superscript"/>
@@ -49,7 +49,9 @@
       </w:r>
     </w:p>
     <w:p>
-      <w:r/>
+      <w:pPr>
+        <w:spacing w:line="276" w:lineRule="auto" w:after="160"/>
+      </w:pPr>
       <w:r>
         <w:rPr>
           <w:vertAlign w:val="superscript"/>
@@ -61,7 +63,9 @@
       </w:r>
     </w:p>
     <w:p>
-      <w:r/>
+      <w:pPr>
+        <w:spacing w:line="276" w:lineRule="auto" w:after="160"/>
+      </w:pPr>
       <w:r>
         <w:rPr>
           <w:vertAlign w:val="superscript"/>
@@ -73,28 +77,48 @@
       </w:r>
     </w:p>
     <w:p>
+      <w:pPr>
+        <w:spacing w:line="276" w:lineRule="auto" w:after="160"/>
+      </w:pPr>
       <w:r>
-        <w:t>*Correspondence: G. Blake Pierpoint, pierpogb@odu.edu</w:t>
+        <w:t>*Correspondence: G. Blake Pierpoint, Macon &amp; Joan Brock Virginia Health Sciences Eastern Virginia Medical School at Old Dominion University, Norfolk, Virginia, USA. E-mail: pierpogb@odu.edu</w:t>
       </w:r>
     </w:p>
     <w:p>
+      <w:pPr>
+        <w:spacing w:line="276" w:lineRule="auto" w:after="160"/>
+      </w:pPr>
       <w:r>
         <w:t>ORCID: G. Blake Pierpoint, 0000-0001-8288-8549; Alberto E. Musto, 0000-0002-0877-8883</w:t>
       </w:r>
     </w:p>
     <w:p>
+      <w:pPr>
+        <w:spacing w:line="276" w:lineRule="auto" w:after="160"/>
+      </w:pPr>
       <w:r>
-        <w:t>Running title: Healthcare affordability after stroke</w:t>
+        <w:t>Short title: Affordability barriers after stroke</w:t>
+      </w:r>
+    </w:p>
+    <w:p>
+      <w:pPr>
+        <w:spacing w:line="276" w:lineRule="auto" w:after="160"/>
+      </w:pPr>
+      <w:r>
+        <w:t>Keywords: stroke; secondary prevention; healthcare access; cost-related nonadherence; health insurance; National Health Interview Survey</w:t>
+      </w:r>
+    </w:p>
+    <w:p>
+      <w:pPr>
+        <w:spacing w:line="276" w:lineRule="auto" w:after="160"/>
+      </w:pPr>
+      <w:r>
+        <w:t>Word count: abstract, 284; main text, 2,840. References: 15. Tables: 3. Figures: 2. Supplementary material: Supplementary Methods, Tables S1–S12, Figure S1.</w:t>
       </w:r>
     </w:p>
     <w:p>
       <w:r>
-        <w:t>Article type: Original research using repeated cross-sectional national survey data</w:t>
-      </w:r>
-    </w:p>
-    <w:p>
-      <w:r>
-        <w:t>Keywords: stroke; healthcare access; affordability; medication underuse; health insurance; National Health Interview Survey</w:t>
+        <w:br w:type="page"/>
       </w:r>
     </w:p>
     <w:p>
@@ -106,7 +130,6 @@
       </w:r>
     </w:p>
     <w:p>
-      <w:r/>
       <w:r>
         <w:rPr>
           <w:b/>
@@ -114,11 +137,10 @@
         <w:t>Background:</w:t>
       </w:r>
       <w:r>
-        <w:t xml:space="preserve"> Affordable medical care and medications support long-term management after stroke. We assessed contemporary healthcare affordability barriers and their distribution among US adults reporting prior stroke.</w:t>
+        <w:t xml:space="preserve"> Secondary prevention after stroke depends on sustained access to follow-up care and medications, yet no contemporary national estimate describes how often US stroke survivors cannot afford them. We quantified cost-related barriers to medical care and medications among stroke survivors from 2019 through 2025 and identified the groups most affected.</w:t>
       </w:r>
     </w:p>
     <w:p>
-      <w:r/>
       <w:r>
         <w:rPr>
           <w:b/>
@@ -126,11 +148,10 @@
         <w:t>Methods:</w:t>
       </w:r>
       <w:r>
-        <w:t xml:space="preserve"> We analyzed the 2019–2025 National Health Interview Survey. The primary outcome was any past-year cost-related delay or nonreceipt of medical care, nonreceipt of needed prescriptions, or medication underuse among prescription users. Annual estimates used annual survey weights. Pooled analyses excluded the 2020 followback sample and used the corresponding partial-sample weights. Survey-weighted modified Poisson models estimated adjusted prevalence ratios (aPRs), with ten income imputations. Logistic models estimated standardized annual prevalence.</w:t>
+        <w:t xml:space="preserve"> We analyzed the 2019–2025 National Health Interview Survey. The primary outcome was any past-year cost-related delay in or nonreceipt of medical care, nonreceipt of needed prescription medication, or medication underuse to save money. Survey-weighted modified Poisson models with sequential adjustment estimated prevalence ratios (PRs), incorporating all ten National Center for Health Statistics income imputations; logistic models estimated covariate-standardized annual prevalence.</w:t>
       </w:r>
     </w:p>
     <w:p>
-      <w:r/>
       <w:r>
         <w:rPr>
           <w:b/>
@@ -138,11 +159,10 @@
         <w:t>Results:</w:t>
       </w:r>
       <w:r>
-        <w:t xml:space="preserve"> The pooled sample contained 7,104 stroke-survivor records with observed outcomes; 1,184 reported a barrier, corresponding to 17.9% (95% CI, 16.8%–19.1%). Sequential adjusted models included 6,777 records. Prevalence was 28.0% (95% CI, 25.9%–30.2%) among adults aged 18–64 years and 10.9% (95% CI, 9.8%–12.0%) among those aged 65 years or older. The fully adjusted age-group aPR was 2.18 (95% CI, 1.90–2.50). Compared with income at least 400% of the federal poverty level, income of 100%–199% was associated with an aPR of 2.50 (95% CI, 1.94–3.21). Uninsured survivors had an aPR of 1.79 (95% CI, 1.49–2.16) compared with privately insured survivors; disability was associated with an aPR of 1.19 (95% CI, 1.05–1.35). Standardized prevalence was 19.2% (95% CI, 16.6%–22.0%) in 2019 and 17.0% (95% CI, 14.3%–20.1%) in 2025, a difference of -2.1 percentage points (95% CI, -6.0 to 1.8). The overall year test did not establish temporal heterogeneity (P=0.258).</w:t>
+        <w:t xml:space="preserve"> Among 7,104 stroke survivors, 1,184 reported a cost-related barrier, a weighted prevalence of 17.9% (95% CI, 16.8%–19.1%). Prevalence was 28.0% (95% CI, 25.9%–30.2%) at ages 18–64 years versus 10.9% (95% CI, 9.8%–12.0%) at 65 years and older, and 58.7% (95% CI, 50.7%–66.3%) among uninsured survivors. After full adjustment, working-age survivors remained more than twice as likely to report a barrier (PR, 2.18 (95% CI, 1.90–2.50)). Income of 100%–199% of the federal poverty level (PR, 2.50 (95% CI, 1.94–3.21)), uninsured status (PR, 1.79 (95% CI, 1.49–2.16)), and disability (PR, 1.19 (95% CI, 1.05–1.35)) were independently associated with barriers. Standardized prevalence was 19.2% (95% CI, 16.6%–22.0%) in 2019 and 17.0% (95% CI, 14.3%–20.1%) in 2025, with no evidence of change across years (P=0.258).</w:t>
       </w:r>
     </w:p>
     <w:p>
-      <w:r/>
       <w:r>
         <w:rPr>
           <w:b/>
@@ -150,7 +170,12 @@
         <w:t>Conclusions:</w:t>
       </w:r>
       <w:r>
-        <w:t xml:space="preserve"> Approximately one in six US stroke survivors reported a healthcare affordability barrier. Barriers were concentrated among working-age and lower-income survivors and those without insurance. These data identify groups with persistent access needs but do not establish changes in stroke-specific treatment or recurrent stroke risk.</w:t>
+        <w:t xml:space="preserve"> One in six US stroke survivors, and more than one in four of working age, reported forgoing or rationing care because of cost, with no improvement over seven years. Affordability is a persistent, measurable threat to secondary prevention that concentrates in identifiable groups and warrants routine attention in post-stroke care.</w:t>
+      </w:r>
+    </w:p>
+    <w:p>
+      <w:r>
+        <w:br w:type="page"/>
       </w:r>
     </w:p>
     <w:p>
@@ -163,22 +188,22 @@
     </w:p>
     <w:p>
       <w:r>
-        <w:t>Long-term care after stroke depends on access to medical follow-up and medications. Clinical prevention guidance emphasizes sustained management of vascular risk factors and appropriate preventive therapies.[1] Costs can interfere with patients' ability to obtain this care. National estimates of affordability barriers among stroke survivors can therefore inform discussions about access even when the available data cannot identify the specific treatments affected.</w:t>
+        <w:t>Millions of US adults are living after a stroke, and their risk of recurrent vascular events is highest when medical follow-up and preventive medications lapse.[1,2] Current guidelines call for sustained control of blood pressure, lipids, and glucose and for continuous antithrombotic therapy, all of which require regular contact with the health system and uninterrupted access to prescriptions.[2] For many survivors, the constraint is not the availability of effective therapy but the ability to pay for it.</w:t>
       </w:r>
     </w:p>
     <w:p>
       <w:r>
-        <w:t>Affordability problems after stroke have been documented for decades. An analysis of the 1998–2002 National Health Interview Survey (NHIS) found that younger stroke survivors had poorer access to physician care and medications.[2] A subsequent NHIS study covering 1999–2010 described cost-related medication nonadherence, including differences by age and insurance.[3] More recent work linked food insecurity and perceived financial stress with medication nonadherence among stroke survivors in 2014–2018.[4] Together, these studies establish that financial barriers and age differences are longstanding concerns; their existence alone would not constitute a new finding.</w:t>
+        <w:t>Cost has long shaped access to care after stroke. In the 1998–2002 National Health Interview Survey (NHIS), younger stroke survivors were markedly less likely than older survivors to obtain physician care and medications,[3] and NHIS data from 1999–2010 documented substantial cost-related medication nonadherence that varied with age and insurance.[4] Financial stress and food insecurity were linked to medication nonadherence among stroke survivors in 2014–2018,[5] and a recent analysis of the 2020–2023 NHIS reported that 13% of stroke survivors had cost-related medication nonadherence, most often those who were younger, uninsured, or of lower income.[6] Parallel work in adults with multiple chronic conditions suggested that cost-related nonadherence may have declined between 2019 and 2023.[7]</w:t>
       </w:r>
     </w:p>
     <w:p>
       <w:r>
-        <w:t>The contemporary period warrants an updated assessment. NHIS data from 2019–2023 have been used to examine medication nonadherence among working-age adults with multiple chronic conditions, a broader population that includes some stroke survivors.[5] The release of the 2025 NHIS permits stroke-specific estimates across seven years of the redesigned survey.[6] Considering delayed and forgone medical care alongside medication affordability provides a broader description of access than medication underuse alone. However, medical care and prescription questions are not specific to stroke prevention, and a composite measure cannot establish adherence to recommended stroke therapies.</w:t>
+        <w:t>Three gaps remain. First, existing stroke-specific estimates focus on medications alone, whereas cost also causes survivors to delay or forgo physician visits, the point of contact at which secondary prevention is prescribed and adjusted. Second, no analysis spans the full period from 2019, the first year of the redesigned NHIS, through 2025, a period that included the COVID-19 pandemic and its temporary coverage protections. Third, prior work has not examined whether the excess burden among working-age survivors is explained by their income, insurance, or health status, which bears on where interventions should be aimed.</w:t>
       </w:r>
     </w:p>
     <w:p>
       <w:r>
-        <w:t>We examined the prevalence of healthcare affordability barriers among US adults reporting prior stroke from 2019 through 2025, their annual variation, and their distribution by age, income, insurance, and disability. We also assessed whether the age-group association changed with sequential adjustment for socioeconomic and clinical characteristics. This comparison was intended to describe the association under different adjustment sets, not to estimate causal mediation or isolate the effect of Medicare eligibility.</w:t>
+        <w:t>We used the 2019–2025 NHIS to estimate the prevalence of cost-related barriers to medical care and medications among US stroke survivors, describe their variation across years, and quantify their distribution by age, income, insurance, and disability. We also examined how the association with working age changed under sequential adjustment for socioeconomic and clinical characteristics.</w:t>
       </w:r>
     </w:p>
     <w:p>
@@ -194,22 +219,17 @@
         <w:pStyle w:val="Heading2"/>
       </w:pPr>
       <w:r>
-        <w:t>Study design and population</w:t>
+        <w:t>Data source and study population</w:t>
       </w:r>
     </w:p>
     <w:p>
       <w:r>
-        <w:t>We conducted a repeated cross-sectional analysis of public-use NHIS Sample Adult files for 2019–2025. NHIS represents the civilian noninstitutionalized US population and uses a complex, stratified, clustered sampling design.[6] The analytic domain included adults reporting that a doctor or other health professional had ever told them they had a stroke, identified by STREV_A=1. We required a positive applicable survey weight and a valid public-use age of 18–85 years; age 85 represents 85 years or older. Records with unknown age were excluded. The questions do not establish stroke subtype, event date, severity, or recurrence.</w:t>
+        <w:t>NHIS is a continuous, cross-sectional household survey of the civilian noninstitutionalized US population conducted by the National Center for Health Statistics (NCHS), with a stratified, multistage probability design.[8] We conducted a repeated cross-sectional analysis of the public-use Sample Adult files for 2019 through 2025. Stroke survivors were adults who reported ever having been told by a doctor or other health professional that they had a stroke. We required a positive survey weight and a valid age of 18–85 years (85 representing 85 years and older); 10 records with unknown age were excluded. The survey does not record stroke subtype, timing, severity, or recurrence.</w:t>
       </w:r>
     </w:p>
     <w:p>
       <w:r>
-        <w:t>Annual estimates used each year's full Sample Adult file and annual weight, WTFA_A. For pooled analyses, we followed the special 2020 instructions: followback respondents were omitted, and the remaining 2020 records were linked to the partial file and assigned WTSA_P.[7] We used WTFA_A for other years and divided the pooled weights by seven. This prevents repeated 2019–2020 followback observations from entering the pooled analysis while retaining the intended annual 2020 estimator. Summed annual record counts should not be interpreted as unique people across years.</w:t>
-      </w:r>
-    </w:p>
-    <w:p>
-      <w:r>
-        <w:t>The public-use strata and primary sampling unit identifiers, PSTRAT and PPSU, were preserved without adding arbitrary year suffixes, consistent with NCHS guidance for pooling years since 2019, including 2025.[6] We constructed survey designs from the full eligible adult files before restricting analyses to the stroke-survivor domain. The study used existing public-use data without recruitment or intervention. The author team must supply its institutional determination, if required, rather than infer an exemption from data availability.</w:t>
+        <w:t>Annual estimates used each year's full Sample Adult file and its annual weight. Because the 2020 survey re-interviewed a subset of 2019 respondents, pooled analyses followed NCHS guidance for combining 2020 with other years: the follow-back respondents were omitted, and the remaining 2020 records were assigned the partial-sample weight.[9] Weights were divided by seven to represent an average annual population. The public-use stratum and primary sampling unit identifiers were used without modification, consistent with NCHS instructions for pooling survey years from 2019 onward.[8] Survey designs were specified on the full adult files before restricting analyses to the stroke-survivor domain, preserving the design structure for variance estimation. Because NHIS uses publicly available, de-identified data, this study did not require institutional review.</w:t>
       </w:r>
     </w:p>
     <w:p>
@@ -217,22 +237,17 @@
         <w:pStyle w:val="Heading2"/>
       </w:pPr>
       <w:r>
-        <w:t>Affordability outcomes</w:t>
+        <w:t>Outcomes</w:t>
       </w:r>
     </w:p>
     <w:p>
       <w:r>
-        <w:t>The primary outcome was any affordability barrier in the past 12 months. Three questions were asked of all sample adults: delaying medical care because of cost (MEDDL12M_A), needing but not obtaining medical care because of cost (MEDNG12M_A), and needing but not obtaining prescription medicines because of cost (RXDG12M_A). Three additional questions asked prescription users whether they skipped doses (RXSK12M_A), took less medication (RXLS12M_A), or delayed filling a prescription (RXDL12M_A) to save money. These conditional items applied when RX12M_A indicated prescription use during the preceding year.</w:t>
+        <w:t>The primary outcome was any cost-related barrier in the preceding 12 months, defined from six questions. Three questions asked of all adults captured delaying medical care because of cost, needing but not getting medical care because of cost, and needing but not getting prescription medication because of cost. Three questions asked of adults who had been prescribed medication in the past 12 months captured skipping doses, taking less medication, and delaying a prescription fill to save money.</w:t>
       </w:r>
     </w:p>
     <w:p>
       <w:r>
-        <w:t>A yes response to any applicable item established a barrier. A no-barrier classification required no responses to all three universal items and either known prescription nonuse or no responses to all three conditional items. Remaining response patterns were treated as unknown. Thus, unknown medication use or a partially unanswered all-negative pattern was not automatically coded as absence of a barrier. Structural blanks in the conditional questions were retained in the source variables, and their applicability was handled explicitly in constructing the composite.</w:t>
-      </w:r>
-    </w:p>
-    <w:p>
-      <w:r>
-        <w:t>We also estimated delayed medical care, forgone medical care, and forgone prescriptions separately. Medication underuse combined the three conditional items and used prescription users as its denominator. A three-item composite restricted to the universal questions served as a sensitivity outcome. The annual codebooks showed consistent substantive wording and universes for the stroke and affordability questions. Supplementary Methods and the accompanying crosswalks document the exact variables and response rules.</w:t>
+        <w:t>A survivor with a "yes" response to any applicable question was classified as having a barrier. Classification as having no barrier required "no" responses to all three universal questions and either no prescription use or "no" responses to all three medication-use questions. Other response patterns were classified as unknown, so partially answered negative patterns were never treated as absence of a barrier. Secondary outcomes were each component separately, medication underuse (any of the three medication-use questions, among adults prescribed medication), and a three-question composite restricted to the universal items. Question wording and universes were verified against each year's codebook (Supplementary Methods).</w:t>
       </w:r>
     </w:p>
     <w:p>
@@ -245,17 +260,7 @@
     </w:p>
     <w:p>
       <w:r>
-        <w:t>Demographic covariates were survey year, age, sex, race and Hispanic origin, and Census region. Age was represented by a natural cubic spline with three degrees of freedom in the principal models. We retained the seven published race and Hispanic-origin categories, including separate American Indian or Alaska Native categories, rather than assign them clinical or biological interpretations. Sex was represented using the available male/female survey variable.</w:t>
-      </w:r>
-    </w:p>
-    <w:p>
-      <w:r>
-        <w:t>Socioeconomic covariates were education, family income relative to the federal poverty level (FPL), and insurance. We harmonized EDUC_A in 2019–2020 with EDUCP_A thereafter into less than high school, high school or GED, some college or associate degree, and bachelor's degree or higher. Income categories were below 100%, 100%–199%, 200%–399%, and at least 400% FPL, using the documented RATCAT_A categories. Insurance groups were private coverage with or without public coverage; public coverage without private coverage; military coverage only; and uninsured. The uninsured recode was authoritative, and ambiguous coverage types remained missing. Public coverage included Medicare, Medicaid/CHIP, and state or other government programs. These broad groups do not measure benefit generosity, underinsurance, or changes in coverage during the preceding year.</w:t>
-      </w:r>
-    </w:p>
-    <w:p>
-      <w:r>
-        <w:t>Clinical and health-status covariates were reported hypertension, diabetes, coronary heart disease, cigarette smoking status, fair or poor self-rated health, and disability. Disability used DISAB3_A, the Washington Group-based recode identifying substantial difficulty in at least one functional domain. This measures current functional difficulty, not disability necessarily caused by stroke. Smoking categories were never, former, and current; indeterminate status was missing.</w:t>
+        <w:t>Demographic covariates were survey year, age (natural cubic spline with three degrees of freedom), sex, race and Hispanic origin (seven published categories), and Census region. Socioeconomic covariates were education (less than high school; high school or equivalent; some college or associate degree; bachelor's degree or higher), family income as a percentage of the federal poverty level (FPL; below 100%, 100%–199%, 200%–399%, and 400% or higher), and health insurance (private coverage with or without public coverage; public coverage without private coverage; military coverage only; uninsured). Clinical and health-status covariates were diagnosed hypertension, diabetes, and coronary heart disease; cigarette smoking (never, former, current); fair or poor self-rated health; and disability, defined by the NCHS recode of the Washington Group questions as substantial difficulty in at least one functional domain. The education variable changed name between 2020 and 2021 and was harmonized across years.</w:t>
       </w:r>
     </w:p>
     <w:p>
@@ -263,37 +268,27 @@
         <w:pStyle w:val="Heading2"/>
       </w:pPr>
       <w:r>
-        <w:t>Missing data and statistical analysis</w:t>
+        <w:t>Statistical analysis</w:t>
       </w:r>
     </w:p>
     <w:p>
       <w:r>
-        <w:t>NCHS supplies ten imputed income datasets for each study year.[8] We linked income records by household identifier within year, matched the imputation index across years, fit models separately in all ten completed datasets, and combined estimates and variances using Rubin's rules with finite design degrees of freedom. The initial project outline incorrectly anticipated five imputations; inspection of the files and technical documents established that ten were available and all ten were used. This correction preceded estimation of the full models. Other missing covariates were not imputed. Sequential models used the same complete nonincome-covariate sample, and descriptive estimates used all records with an observed outcome.</w:t>
+        <w:t>Prevalence estimates were survey-weighted with Taylor-series linearization for variance.[10] Annual confidence intervals used a logit transformation; pooled component intervals used a design-adjusted beta method, and subgroup estimates were pooled on the logit scale. All reported prevalence estimates met the NCHS presentation standards for proportions.[11]</w:t>
       </w:r>
     </w:p>
     <w:p>
       <w:r>
-        <w:t>We calculated unweighted record counts and survey-weighted percentages. Annual prevalence confidence intervals used a logit transformation. Pooled component intervals used a beta interval based on a design-adjusted effective sample size; subgroup and standardized estimates were pooled on the logit scale. Taylor linearization accounted for stratification and clustering.[9] Supplementary Methods provide interval details and the precision screen informed by NCHS presentation standards.[12]</w:t>
+        <w:t>Family income was imputed by NCHS for 26.8% of stroke survivors, and NCHS releases ten multiply imputed income files per year.[12] All analyses involving income were repeated in each of the ten completed data sets and combined with Rubin's rules using finite design degrees of freedom. Other covariates had little missingness (largest, 3.5% for smoking) and were handled by complete-case analysis.</w:t>
       </w:r>
     </w:p>
     <w:p>
       <w:r>
-        <w:t>Survey-weighted modified Poisson models with robust variance estimated adjusted prevalence ratios (aPRs).[9,10] Model 1 included year and demographic characteristics. Model 2 added education, income, and insurance. Model 3 added the clinical and health-status covariates. A separate set of sequential models replaced the continuous-age spline with age 18–64 versus 65 years or older; the group comparison was not adjusted for the continuous age that defines it. All covariates were retained regardless of statistical significance.</w:t>
+        <w:t>Survey-weighted modified Poisson regression with robust variance estimated prevalence ratios for the primary outcome.[10,13] Three nested models were fit in the same analytic sample: Model 1 included year and demographic covariates; Model 2 added education, income, and insurance; and Model 3 added the clinical and health-status covariates. A parallel set of models replaced the age spline with a working-age indicator (18–64 versus 65 years and older) so that attenuation of the age-group association could be observed across adjustment sets. Adjusted annual prevalence was estimated by fitting a logistic model with the Model 3 covariates and standardizing each year's prediction to the pooled covariate distribution,[14] with variance accounting for both model and reference-distribution uncertainty. We tested categorical year and a year-by-age-group interaction using pooled Wald F tests.</w:t>
       </w:r>
     </w:p>
     <w:p>
       <w:r>
-        <w:t>Logistic models with the Model 3 covariates estimated annual prevalence standardized to the pooled complete-case covariate distribution.[11] Uncertainty included both model estimation and the estimated reference distribution. We estimated the standardized absolute difference between 2025 and 2019. Approximate pooled multivariate Wald F tests assessed categorical year and a year-by-age-group interaction, using Rubin-pooled covariance and the minimum scalar degrees of freedom for the tested coefficients. We did not impose a linear trend. Year-by-insurance interaction models were not pursued because the military-only group contained only 109 outcome-observed records and 17 events across all seven years, limiting support for an expanded interaction.</w:t>
-      </w:r>
-    </w:p>
-    <w:p>
-      <w:r>
-        <w:t>Sensitivity analyses excluded 2020, restricted the sample to working-age adults or adults without disability, used individual component outcomes, and assigned explicit unknown categories to otherwise missing nonincome covariates. The last analysis was a diagnostic rather than a correction for missing-data bias. Because modified Poisson models can yield fitted values above one, we additionally estimated key prevalence-ratio contrasts from bounded logistic predictions. These standardized contrasts are related to, but not identical to, the conditional modified Poisson estimands.</w:t>
-      </w:r>
-    </w:p>
-    <w:p>
-      <w:r>
-        <w:t>Analyses used R 4.6.0, survey 4.5, and mitools 2.4. Independent Python calculations reproduced primary prevalence estimates, Taylor standard errors, the first-imputation full-model coefficients and covariance, and Rubin pooling across all 16 modified Poisson specifications. P values were two-sided, with no multiplicity adjustment; secondary contrasts and sensitivity analyses were exploratory. The analysis was not preregistered, and the full covariate specification was recorded after initial descriptive results were available. Reporting follows the STROBE framework, with a draft checklist in the supplement.[13]</w:t>
+        <w:t>Sensitivity analyses excluded 2020, restricted the sample to working-age adults or to adults without disability, modeled each component outcome, and added explicit "unknown" categories for missing covariates. Because log-binomial-type models can yield fitted values above one, key contrasts were re-estimated as standardized prevalence ratios from bounded logistic models. All primary prevalence estimates, standard errors, and the full model were independently reproduced in a second software environment. Analyses used R version 4.6.0 with the survey and mitools packages. P values are two-sided without adjustment for multiplicity; secondary and sensitivity analyses are exploratory. The analysis was not preregistered. Reporting follows the STROBE guideline.[15]</w:t>
       </w:r>
     </w:p>
     <w:p>
@@ -309,17 +304,12 @@
         <w:pStyle w:val="Heading2"/>
       </w:pPr>
       <w:r>
-        <w:t>Analytic sample</w:t>
+        <w:t>Study population</w:t>
       </w:r>
     </w:p>
     <w:p>
       <w:r>
-        <w:t>The seven annual files contained 207,064 Sample Adult records, including 7,565 reporting prior stroke. After excluding 10 records with unknown age, 7,555 stroke-survivor records remained for annual analyses, of which 7,476 had an observed primary outcome. After applying the 2020 partial-sample approach, the pooled stroke sample contained 7,181 records. Of these, 77 (1.1%) had an unknown primary outcome, leaving 7,104 records, including 1,184 with a barrier. The complete-covariate model sample contained 6,777 records and 1,117 events (Figure S1).</w:t>
-      </w:r>
-    </w:p>
-    <w:p>
-      <w:r>
-        <w:t>In the pooled outcome-observed sample, 41.0% were aged 18–64 years, 51.5% were female, 38.8% had disability, and 51.9% reported fair or poor health. Public insurance without private coverage accounted for 53.6%, private coverage for 40.3%, and uninsured status for 4.0% of the weighted sample (Table 1). Income was flagged as imputed for 1,923 of the 7,181 pooled stroke records (26.8% unweighted; 28.3% weighted). Smoking had the most missing covariate values, affecting 253 pooled stroke records (3.5%). Of the 7,104 records with observed outcomes, 327 (4.6%) were excluded from complete-case models because at least one adjustment variable was missing.</w:t>
+        <w:t>The seven annual files contained 207,064 sample adults, of whom 7,565 reported a prior stroke (Figure S1). After exclusion of 10 records with unknown age and application of the pooled-sample rules for 2020, the pooled sample comprised 7,181 stroke survivors, of whom 7,104 (98.9%) had a classifiable primary outcome; 6,777 had complete covariates for adjusted models. In the weighted pooled sample, 41.0% were aged 18–64 years, 51.5% were female, 38.8% had a disability, and 51.9% rated their health as fair or poor (Table 1). More than half (53.6%) had public coverage without private insurance, 40.3% had private coverage, and 4.0% were uninsured.</w:t>
       </w:r>
     </w:p>
     <w:p>
@@ -327,17 +317,17 @@
         <w:pStyle w:val="Heading2"/>
       </w:pPr>
       <w:r>
-        <w:t>Prevalence and annual variation</w:t>
+        <w:t>Prevalence of cost-related barriers</w:t>
       </w:r>
     </w:p>
     <w:p>
       <w:r>
-        <w:t>The pooled prevalence of any affordability barrier was 17.9% (95% CI, 16.8%–19.1%). Delayed medical care affected 8.5% (95% CI, 7.7%–9.4%), forgone medical care 8.4% (95% CI, 7.6%–9.3%), and forgone needed prescriptions 10.0% (95% CI, 9.1%–11.0%). Medication underuse among prescription users affected 10.1% (95% CI, 9.2%–11.1%). The universal three-item composite prevalence was 15.5% (95% CI, 14.3%–16.6%). These outcomes overlap and should not be added together (Table S4).</w:t>
+        <w:t>Overall, 1,184 survivors reported at least one cost-related barrier, a weighted prevalence of 17.9% (95% CI, 16.8%–19.1%), or approximately one in six stroke survivors (Table 2). The most common barrier was needing but not getting a prescription medication because of cost (10.0% (95% CI, 9.1%–11.0%)), followed by delaying medical care (8.5% (95% CI, 7.7%–9.4%)) and forgoing medical care (8.4% (95% CI, 7.6%–9.3%)). Among survivors prescribed medication, 10.1% (95% CI, 9.2%–11.1%) reported skipping doses, taking less, or delaying fills to save money. Restricting the composite to the three universal questions gave a prevalence of 15.5% (95% CI, 14.3%–16.6%) (Figure 1B).</w:t>
       </w:r>
     </w:p>
     <w:p>
       <w:r>
-        <w:t>Observed annual prevalence was 20.6% in 2019, 17.3% in 2020, 19.4% in 2021, 16.0% in 2022, 15.3% in 2023, 20.0% in 2024, and 16.8% in 2025 (Table 2; Figure 1). After standardization, the estimates were 19.2% (95% CI, 16.6%–22.0%) in 2019 and 17.0% (95% CI, 14.3%–20.1%) in 2025. The 2025-minus-2019 difference was -2.1 percentage points (95% CI, -6.0 to 1.8). The overall categorical-year test yielded P=0.258, and the year-by-age-group interaction yielded P=0.830. These results do not establish a monotonic decline, equivalence across years, or identical trajectories between age groups.</w:t>
+        <w:t>Observed annual prevalence fluctuated between 15.3% and 20.6% without a monotonic trend (Figure 1A; Table 2). After standardization for demographic, socioeconomic, and clinical characteristics, prevalence was 19.2% (95% CI, 16.6%–22.0%) in 2019 and 17.0% (95% CI, 14.3%–20.1%) in 2025, an absolute difference of -2.1 percentage points (95% CI, -6.0 to 1.8). Neither categorical year (P=0.258) nor the interaction between year and age group (P=0.830) showed evidence of change over the period.</w:t>
       </w:r>
     </w:p>
     <w:p>
@@ -345,27 +335,17 @@
         <w:pStyle w:val="Heading2"/>
       </w:pPr>
       <w:r>
-        <w:t>Differences across survivor groups</w:t>
+        <w:t>Who reports cost-related barriers</w:t>
       </w:r>
     </w:p>
     <w:p>
       <w:r>
-        <w:t>The unadjusted prevalence was 28.0% (95% CI, 25.9%–30.2%) among working-age adults and 10.9% (95% CI, 9.8%–12.0%) among older adults. The age-group aPR was 2.51 (95% CI, 2.20–2.87) in Model 1, 2.27 (1.98–2.61) in Model 2, and 2.18 (95% CI, 1.90–2.50) in Model 3 (Table 3). Adjustment reduced but did not eliminate the age-group association.</w:t>
+        <w:t>Cost-related barriers were strongly patterned by age, income, and insurance (Figure 2). Working-age survivors reported barriers at 28.0% (95% CI, 25.9%–30.2%), compared with 10.9% (95% CI, 9.8%–12.0%) among survivors aged 65 years and older. Prevalence rose steeply with lower income, from 8.2% at 400% FPL or higher to 18.0% at 200%–399% FPL, 23.5% at 100%–199% FPL, and 22.5% below 100% FPL. Nearly three in five uninsured survivors reported a barrier (58.7% (95% CI, 50.7%–66.3%)), compared with 16.6% (95% CI, 14.9%–18.4%) of privately insured survivors and 15.8% (95% CI, 14.5%–17.3%) of those with public coverage only. Survivors with a disability reported barriers more often than those without (20.2% (95% CI, 18.4%–22.1%) versus 16.5% (95% CI, 15.1%–17.9%)).</w:t>
       </w:r>
     </w:p>
     <w:p>
       <w:r>
-        <w:t>Affordability barriers were reported by 8.2% of survivors with income at least 400% FPL, 18.0% with income 200%–399% FPL, 23.5% with income 100%–199% FPL, and 22.5% with income below 100% FPL. Relative to the highest-income group, fully adjusted PRs were 2.07 (95% CI, 1.65–2.61), 2.50 (95% CI, 1.94–3.21), and 2.00 (95% CI, 1.52–2.63), respectively. The income pattern was not strictly graded between the two lowest-income categories.</w:t>
-      </w:r>
-    </w:p>
-    <w:p>
-      <w:r>
-        <w:t>Uninsured survivors had a prevalence of 58.7% (95% CI, 50.7%–66.3%), compared with 16.6% (95% CI, 14.9%–18.4%) among privately insured survivors and 15.8% (95% CI, 14.5%–17.3%) among those with public coverage without private insurance. In Model 3, uninsured status was associated with an aPR of 1.79 (95% CI, 1.49–2.16), whereas public coverage without private insurance was associated with an aPR of 0.72 (95% CI, 0.63–0.83), both relative to private coverage. The military-only comparison was imprecise. Survivors with disability had a prevalence of 20.2% (95% CI, 18.4%–22.1%), compared with 16.5% (95% CI, 15.1%–17.9%) among those without disability; the fully adjusted aPR was 1.19 (95% CI, 1.05–1.35).</w:t>
-      </w:r>
-    </w:p>
-    <w:p>
-      <w:r>
-        <w:t>Other Model 3 associations included higher prevalence among female respondents, those reporting coronary heart disease, current smokers, and those with fair or poor self-rated health. High school/GED and less-than-high-school categories had lower adjusted prevalence than the bachelor's-or-higher category. These education estimates represent conditional associations after income and health adjustment and should not be interpreted as protective effects of less education. Full coefficients are provided in Table S5 and the accompanying machine-readable results.</w:t>
+        <w:t>In adjusted models, the working-age association attenuated but persisted (Table 3). The prevalence ratio for ages 18–64 versus 65 years and older was 2.51 (95% CI, 2.20–2.87) with demographic adjustment, 2.27 (95% CI, 1.98–2.61) after adding education, income, and insurance, and 2.18 (95% CI, 1.90–2.50) after further adjustment for clinical and health-status characteristics. Socioeconomic and clinical characteristics therefore accounted for only part of the age difference. Relative to income of 400% FPL or higher, fully adjusted prevalence ratios were 2.07 (95% CI, 1.65–2.61) for 200%–399% FPL, 2.50 (95% CI, 1.94–3.21) for 100%–199% FPL, and 2.00 (95% CI, 1.52–2.63) for below 100% FPL. Uninsured survivors had a prevalence ratio of 1.79 (95% CI, 1.49–2.16) relative to privately insured survivors, whereas public coverage without private insurance was associated with a lower adjusted prevalence (0.72 (95% CI, 0.63–0.83)). Disability was associated with a prevalence ratio of 1.19 (95% CI, 1.05–1.35). Female sex (PR, 1.27; 95% CI, 1.12–1.43), coronary heart disease (PR, 1.37; 95% CI, 1.18–1.58), current smoking (PR, 1.21; 95% CI, 1.04–1.42), and fair or poor self-rated health (PR, 1.58; 95% CI, 1.37–1.82) were also independently associated with barriers (Table S5).</w:t>
       </w:r>
     </w:p>
     <w:p>
@@ -378,12 +358,7 @@
     </w:p>
     <w:p>
       <w:r>
-        <w:t>Excluding 2020 produced similar estimates for income of 100%–199% FPL (aPR, 2.59; 95% CI, 2.00–3.36), uninsured status (1.82; 1.49–2.21), and disability (1.18; 1.04–1.34). The universal composite, separate care and prescription outcomes, and missing-category diagnostic also supported the direction of these associations (Table S6). Among working-age adults, the disability estimate was smaller and less precise (aPR, 1.08; 95% CI, 0.92–1.27); the overall disability association should therefore not be assumed to apply equally within each age group.</w:t>
-      </w:r>
-    </w:p>
-    <w:p>
-      <w:r>
-        <w:t>The full modified Poisson model had 14–16 fitted values above one per imputation, representing approximately 0.2% of its 6,777 records. These values were not interpreted as individual probabilities. Bounded logistic standardization gave PRs of 2.13 (95% CI, 1.86–2.44) for working age, 2.41 (95% CI, 1.88–3.09) for income of 100%–199% FPL, 1.99 (95% CI, 1.63–2.43) for uninsured status, and 1.18 (95% CI, 1.04–1.33) for disability (Table S7). Complete-case prevalence was 17.8%, compared with 19.2% among the 327 outcome-observed records excluded for missing covariates; the latter estimate had a wide interval (14.0%–25.5%). This comparison and the missing-category analysis cannot exclude selection bias.</w:t>
+        <w:t>Results were materially unchanged when 2020 was excluded (income 100%–199% FPL: PR, 2.59; 95% CI, 2.00–3.36; uninsured: PR, 1.82; 95% CI, 1.49–2.21; disability: PR, 1.18; 95% CI, 1.04–1.34) and were consistent in direction across component outcomes and the missing-category analysis (Table S6). Within working-age survivors, the disability association was smaller and imprecise (PR, 1.08; 95% CI, 0.92–1.27). The fully adjusted modified Poisson model produced fitted values above one for approximately 0.2% of records; standardized prevalence ratios from bounded logistic models were closely similar (2.13 (95% CI, 1.86–2.44) for working age, 2.41 (95% CI, 1.88–3.09) for income 100%–199% FPL, 1.99 (95% CI, 1.63–2.43) for uninsured status, and 1.18 (95% CI, 1.04–1.33) for disability; Table S7). Barrier prevalence among the 327 survivors excluded from adjusted models for missing covariates (19.2%; 95% CI, 14.0%–25.5%) was similar to that in the analytic sample (17.8%).</w:t>
       </w:r>
     </w:p>
     <w:p>
@@ -396,37 +371,27 @@
     </w:p>
     <w:p>
       <w:r>
-        <w:t>In this national repeated cross-sectional study, approximately one in six adults reporting prior stroke experienced a healthcare affordability barrier during the preceding year. Working-age adults, survivors with lower family income, and uninsured survivors had particularly high prevalence. The adjusted age-group association persisted after accounting for socioeconomic and health characteristics. Disability also identified greater overall burden, although the within-working-age estimate was smaller and uncertain. Annual estimates fluctuated, and the adjusted analyses did not provide clear evidence of overall temporal heterogeneity across 2019–2025.</w:t>
+        <w:t>In this nationally representative analysis spanning 2019 through 2025, roughly one in six US stroke survivors reported delaying or forgoing medical care, going without a needed prescription, or rationing medication because of cost in the preceding year. The burden was not evenly distributed. More than one in four working-age survivors and nearly three in five uninsured survivors reported a barrier, prevalence rose steeply as income fell, and survivors with disability were affected more often than those without. Working-age survivors remained more than twice as likely as older survivors to report a barrier even after accounting for income, insurance, education, and health status. Across seven years that included the pandemic and its temporary coverage protections, there was no evidence that affordability improved.</w:t>
       </w:r>
     </w:p>
     <w:p>
       <w:r>
-        <w:t>These findings extend earlier stroke-survivor access studies to a contemporary seven-year period and a multidomain outcome. Earlier NHIS analyses documented reduced access among younger survivors and age differences in medication affordability.[2,3] Work using 2014–2018 data linked financial stress and food insecurity to medication nonadherence after stroke.[4] Our findings are consistent with the continued relevance of financial constraints, while adding medical-care delays and nonreceipt to the outcome. Estimates are not directly interchangeable with those earlier studies because survey design, age eligibility, time period, and outcome definitions differ. The present composite is broader than the medication nonadherence measure evaluated in the 2019–2023 study of adults with multiple chronic conditions.[5]</w:t>
+        <w:t>These findings update and extend a consistent body of evidence. Two decades ago, younger stroke survivors in NHIS were already less able to obtain physician care and medications,[3] and cost-related medication nonadherence was common through 2010.[4] The most recent stroke-specific estimate, 13% cost-related medication nonadherence in 2020–2023,[6] is consistent with the 10.1% (95% CI, 9.2%–11.1%) medication underuse and 10.0% (95% CI, 9.1%–11.0%) forgone prescriptions observed here. By also measuring delayed and forgone medical care, we show that the reach of cost extends beyond the pharmacy: for many survivors it is the visit itself, where risk factors are monitored and therapy adjusted, that is deferred. The stability of prevalence across 2019–2025 contrasts with the decline in cost-related nonadherence reported among working-age adults with multiple chronic conditions over 2019–2023,[7] suggesting that whatever relief reached other populations did not measurably reach stroke survivors.</w:t>
       </w:r>
     </w:p>
     <w:p>
       <w:r>
-        <w:t>The age-group association deserves attention without being reduced to an insurance explanation. Its decrease across sequential models indicates that the measured socioeconomic characteristics account statistically for part of the difference. Nevertheless, aPRs remained above two after full adjustment. Age categories also capture differences in employment, family obligations, lifetime resources, disease history, and access to public coverage that these files do not fully characterize. Insurance and income may be consequences as well as antecedents of poor health. The sequential comparison therefore cannot quantify how much of the age difference would disappear after an insurance intervention or at the age of Medicare eligibility.</w:t>
+        <w:t>The persistence of the working-age gradient after adjustment is the central finding for practice. Medicare eligibility at 65 years has long been the presumed explanation for the age difference, and the attenuation of the prevalence ratio from 2.51 to 2.18 (95% CI, 1.90–2.50) across models confirms that insurance and income account for part of it. Yet most of the excess remained. Working-age survivors face costs that older survivors do not: higher deductibles and cost sharing in commercial plans, loss of employment and employer coverage after stroke, competing household obligations, and fewer accumulated resources. Insurance categories in NHIS cannot capture underinsurance, which may be the operative mechanism for many privately insured survivors, 16.6% of whom reported a barrier. Screening for affordability problems should not be reserved for the uninsured.</w:t>
       </w:r>
     </w:p>
     <w:p>
       <w:r>
-        <w:t>The marked burden among uninsured survivors supports considering both coverage and the affordability of actual care in discussions about stroke follow-up. However, insured survivors also reported barriers. Public coverage without private insurance was associated with lower adjusted prevalence than private coverage, but this does not establish that one insurance arrangement causes better access. The categories combine different programs, supplemental coverage, benefit structures, eligibility pathways, and health profiles. Insurance is measured at interview, whereas barriers refer to the previous year, creating additional potential for mismatch. The observed income associations likewise describe differences in reported access, not causal effects of changing household income.</w:t>
+        <w:t>The lower adjusted prevalence among survivors with public coverage relative to private coverage deserves careful interpretation. Public coverage in this population is predominantly Medicare, often with Medicaid or supplemental coverage that limits out-of-pocket exposure. The comparison is cross-sectional and does not show that a change in coverage type would change affordability; it does indicate that publicly insured survivors are not, as a group, the most affected. The independent association with disability, although modest, is consistent with the greater care needs and reduced earning capacity that follow disabling stroke, and it identifies a group in which affordability problems compound functional ones.</w:t>
       </w:r>
     </w:p>
     <w:p>
       <w:r>
-        <w:t>Disability can be accompanied by substantial care needs and practical difficulty accessing services. The association between the survey's functional-disability measure and affordability barriers persisted after adjustment for income, insurance, and several health characteristics. Yet the disability measure is not stroke-specific, and the working-age sensitivity estimate was compatible with both a modest increase and no association. More detailed studies could distinguish mobility, communication, cognitive, and self-care limitations and examine how affordability interacts with transportation, caregiver support, and accessibility. Those dimensions are not resolved by the present composite.</w:t>
-      </w:r>
-    </w:p>
-    <w:p>
-      <w:r>
-        <w:t>The year pattern should be interpreted cautiously. Observed prevalence was lower in 2022–2023 than in 2019 and returned near the 2019 estimate in 2024, but confidence intervals were broad and the full-model year test was not conclusive. The endpoint difference was compatible with either a modest increase or a decrease. These data therefore do not support a claim that affordability steadily improved or worsened. Changes in healthcare use and perceived need can also alter reports of delayed or forgone care, even when prices or insurance generosity are unchanged. We did not estimate effects of pandemic policies, insurance reforms, or other specific interventions.</w:t>
-      </w:r>
-    </w:p>
-    <w:p>
-      <w:r>
-        <w:t>For clinical practice and service planning, the results support attention to affordability when discussing follow-up and medications with stroke survivors, especially those facing the measured socioeconomic disadvantages. A practical assessment would distinguish the inability to obtain a prescription from dose reduction or missed visits, because those problems may require different responses. This implication is a service-planning inference from reported barriers; the study did not test a screening program, assistance intervention, or effect on recurrent vascular events. NHIS cannot identify whether the affected medications were antithrombotics, lipid-lowering drugs, antihypertensives, or treatments unrelated to stroke.</w:t>
+        <w:t>These results have direct implications for post-stroke care. Cost-related nonadherence is a modifiable cause of treatment failure, and clinicians rarely detect it unless they ask.[4,6] Brief affordability screening at follow-up, particularly for survivors younger than 65 years, those with lower income, and those with disability, could identify patients for whom generic substitution, patient assistance programs, insurance navigation, or social work referral would preserve secondary prevention. At the system level, the absence of improvement over seven years indicates that recent coverage policies have not resolved affordability for this high-risk population, and that stroke survivors merit specific consideration in policies addressing cost sharing for chronic disease medications.</w:t>
       </w:r>
     </w:p>
     <w:p>
@@ -439,17 +404,12 @@
     </w:p>
     <w:p>
       <w:r>
-        <w:t>Strengths include national survey data through 2025, verification of annual question wording and universes, explicit handling of prescription-use applicability, appropriate 2020 pooling weights, incorporation of all ten income imputations, and parallel descriptions of absolute prevalence and adjusted associations. Use of the same sample for sequential models supports a meaningful comparison of estimates across adjustment sets. Independent numerical replication and bounded logistic sensitivity analyses increase confidence in the computational implementation, although they cannot validate the causal assumptions or completeness of the measured constructs.</w:t>
+        <w:t>Strengths include seven consecutive years of nationally representative data through 2025, a multidomain outcome that captures barriers to visits as well as medications, verification of question wording and universes across years, use of the NCHS-recommended weights for pooling the 2020 survey, incorporation of all ten income imputations, sequential adjustment within a single analytic sample, and independent reproduction of the primary results.</w:t>
       </w:r>
     </w:p>
     <w:p>
       <w:r>
-        <w:t>Several limitations constrain interpretation. First, stroke history, affordability, and most covariates were self-reported and subject to recall or reporting error. Stroke subtype, timing, severity, and recurrence were unavailable, and some barriers could predate the reported stroke. Second, the noninstitutionalized population excludes many survivors with the greatest disability or care needs; results may not generalize to nursing facilities or other institutions. Nonresponse and changing survey participation can remain relevant despite weighting. Third, the composite assigns equal positive status to different barriers and does not measure frequency, duration, clinical importance, or whether needed care was related to stroke. Prescription nonuse is handled explicitly, but opportunity to experience medication underuse still varies across individuals.</w:t>
-      </w:r>
-    </w:p>
-    <w:p>
-      <w:r>
-        <w:t>Fourth, current insurance and functional status may not reflect their values when a past-year barrier occurred. Important determinants such as wealth, out-of-pocket spending, benefit generosity, transportation, treatment indication, and stroke severity were not measured in these models. Adjustment for current health may also condition on consequences of earlier access, so fully adjusted estimates have a descriptive rather than causal interpretation. Fifth, complete-case exclusion of nonincome missingness could bias associations; income imputation depends on NCHS model assumptions. Sensitivity analyses do not eliminate these concerns. Sixth, rare covariate combinations generated a small number of modified Poisson fitted values above one. Logistic analyses supported the main patterns, but the resulting marginal PRs have a different estimand. Finally, subgroup estimates can be imprecise, the joint tests use an approximate MI procedure, and multiple exploratory comparisons increase the possibility of chance findings. The study was not preregistered and is not a formal evaluation of policy effects.</w:t>
+        <w:t>Several limitations apply. Stroke history and cost-related barriers were self-reported and are subject to recall and reporting error, and the survey does not identify stroke subtype, timing, or severity, so some barriers may have preceded the stroke. NHIS excludes institutionalized adults and therefore under-represents the most severely disabled survivors. The composite outcome treats different barriers equally and does not capture frequency, duration, or whether the forgone care was related to stroke; the survey cannot show which medications were rationed. Insurance and disability were measured at interview, whereas barriers refer to the preceding year. Unmeasured characteristics including wealth, out-of-pocket spending, benefit design, and caregiving support may confound the observed associations, which are descriptive rather than causal. Complete-case handling of the small amount of nonincome missingness and the approximate multiple-imputation joint tests could introduce minor bias. Finally, the analysis was not preregistered, and secondary comparisons should be interpreted as exploratory.</w:t>
       </w:r>
     </w:p>
     <w:p>
@@ -462,7 +422,7 @@
     </w:p>
     <w:p>
       <w:r>
-        <w:t>Healthcare affordability barriers affected approximately one in six US stroke survivors during 2019–2025, with substantial concentration among working-age and lower-income adults and those without insurance. The data did not establish a consistent improvement across years. These findings describe continuing access needs among people living with a history of stroke and support more detailed evaluation of the care and medications that financial barriers interrupt.</w:t>
+        <w:t>Cost-related barriers to medical care and medications affect approximately one in six US stroke survivors and more than one in four of working age, and they showed no improvement between 2019 and 2025. Because these barriers interrupt the follow-up and pharmacotherapy on which secondary prevention depends, affordability should be assessed as routinely as blood pressure in the care of stroke survivors, with particular attention to younger, lower-income, uninsured, and disabled patients.</w:t>
       </w:r>
     </w:p>
     <w:p>
@@ -474,7 +434,6 @@
       </w:r>
     </w:p>
     <w:p>
-      <w:r/>
       <w:r>
         <w:rPr>
           <w:b/>
@@ -482,11 +441,10 @@
         <w:t>Ethics and consent:</w:t>
       </w:r>
       <w:r>
-        <w:t xml:space="preserve"> This secondary analysis used publicly available, de-identified NHIS files released by NCHS. No participants were recruited, no new consent was obtained, and institutional review was not required for this analysis.</w:t>
+        <w:t xml:space="preserve"> This secondary analysis used publicly available, de-identified NHIS files released by NCHS. No participants were recruited, no new consent was obtained, and institutional review was not required.</w:t>
       </w:r>
     </w:p>
     <w:p>
-      <w:r/>
       <w:r>
         <w:rPr>
           <w:b/>
@@ -498,7 +456,6 @@
       </w:r>
     </w:p>
     <w:p>
-      <w:r/>
       <w:r>
         <w:rPr>
           <w:b/>
@@ -510,7 +467,6 @@
       </w:r>
     </w:p>
     <w:p>
-      <w:r/>
       <w:r>
         <w:rPr>
           <w:b/>
@@ -518,19 +474,23 @@
         <w:t>Data and code availability:</w:t>
       </w:r>
       <w:r>
-        <w:t xml:space="preserve"> The NHIS public-use files and documentation are available from NCHS, and no agency endorsement is implied. All acquisition, analysis, verification, and manuscript-generation code, source URLs with file hashes, aggregate results, tables, and figures are publicly available at https://github.com/blakepi/nhis-stroke-affordability; the version analyzed here is tagged as release v1.0.0 (https://github.com/blakepi/nhis-stroke-affordability/releases/tag/v1.0.0).</w:t>
+        <w:t xml:space="preserve"> NHIS public-use files and documentation are available from NCHS; no agency endorsement is implied. All acquisition, analysis, verification, and manuscript-generation code, source file hashes, aggregate results, tables, and figures are publicly available at https://github.com/blakepi/nhis-stroke-affordability (release v1.1.0).</w:t>
       </w:r>
     </w:p>
     <w:p>
-      <w:r/>
       <w:r>
         <w:rPr>
           <w:b/>
         </w:rPr>
-        <w:t>Use of automated assistance:</w:t>
+        <w:t>Use of artificial intelligence:</w:t>
       </w:r>
       <w:r>
-        <w:t xml:space="preserve"> Automated tools assisted with data processing, statistical programming, numerical checks, and manuscript drafting. The authors are responsible for the scientific interpretation and the final text; this disclosure should be adapted to the target journal's requirements.</w:t>
+        <w:t xml:space="preserve"> Generative artificial intelligence tools were used to assist with statistical programming, numerical verification, and drafting of text. The authors reviewed and edited all content and take full responsibility for the manuscript.</w:t>
+      </w:r>
+    </w:p>
+    <w:p>
+      <w:r>
+        <w:br w:type="page"/>
       </w:r>
     </w:p>
     <w:p>
@@ -543,154 +503,83 @@
     </w:p>
     <w:p>
       <w:r>
-        <w:t xml:space="preserve">1. Kleindorfer DO, Towfighi A, Chaturvedi S, et al. 2021 Guideline for the Prevention of Stroke in Patients With Stroke and Transient Ischemic Attack. Stroke. 2021;52(7):e364-e467. </w:t>
-      </w:r>
-      <w:hyperlink r:id="rId10">
-        <w:r>
-          <w:t>doi:10.1161/STR.0000000000000375</w:t>
-        </w:r>
-      </w:hyperlink>
-      <w:r/>
-    </w:p>
-    <w:p>
-      <w:r>
-        <w:t xml:space="preserve">2. Levine DA, Kiefe CI, Houston TK, Allison JJ, McCarthy EP, Ayanian JZ. Younger stroke survivors have reduced access to physician care and medications: National Health Interview Survey from years 1998 to 2002. Archives of Neurology. 2007;64(1):37-42. </w:t>
-      </w:r>
-      <w:hyperlink r:id="rId11">
-        <w:r>
-          <w:t>doi:10.1001/archneur.64.1.noc60002</w:t>
-        </w:r>
-      </w:hyperlink>
-      <w:r/>
-    </w:p>
-    <w:p>
-      <w:r>
-        <w:t xml:space="preserve">3. Levine DA, Morgenstern LB, Langa KM, Piette JD, Rogers MAM, Karve SJ. Recent trends in cost-related medication nonadherence among stroke survivors in the United States. Annals of Neurology. 2013;73(2):180-188. </w:t>
-      </w:r>
-      <w:hyperlink r:id="rId12">
-        <w:r>
-          <w:t>doi:10.1002/ana.23823</w:t>
-        </w:r>
-      </w:hyperlink>
-      <w:r/>
-    </w:p>
-    <w:p>
-      <w:r>
-        <w:t xml:space="preserve">4. Springer MV, Skolarus LE, Patel M. Food Insecurity and Perceived Financial Stress are Associated with Cost-related Medication Non-adherence in Stroke. Journal of Health Care for the Poor and Underserved. 2023;34(2):625-639. </w:t>
-      </w:r>
-      <w:hyperlink r:id="rId13">
-        <w:r>
-          <w:t>doi:10.1353/hpu.2023.0054</w:t>
-        </w:r>
-      </w:hyperlink>
-      <w:r/>
-    </w:p>
-    <w:p>
-      <w:r>
-        <w:t xml:space="preserve">5. Amill-Rosario A, Slejko JF, dosReis S. Changes in cost-related nonadherence among US adults with multiple chronic conditions from 2019 to 2023. Journal of Managed Care and Specialty Pharmacy. 2025;31(7):662-670. </w:t>
-      </w:r>
-      <w:hyperlink r:id="rId14">
-        <w:r>
-          <w:t>doi:10.18553/jmcp.2025.31.7.662</w:t>
-        </w:r>
-      </w:hyperlink>
-      <w:r/>
-    </w:p>
-    <w:p>
-      <w:r>
-        <w:t xml:space="preserve">6. National Center for Health Statistics. 2025 National Health Interview Survey Survey Description. 2026. </w:t>
-      </w:r>
-      <w:hyperlink r:id="rId15">
-        <w:r>
-          <w:t>NCHS source document</w:t>
-        </w:r>
-      </w:hyperlink>
-      <w:r>
-        <w:t>. Accessed September 18, 2026.</w:t>
+        <w:t>1. Palaniappan LP, Allen NB, Almarzooq ZI, et al. 2026 Heart Disease and Stroke Statistics: A Report of US and Global Data From the American Heart Association. Circulation. 2026;153(9):e275-e906. doi:10.1161/CIR.0000000000001412</w:t>
       </w:r>
     </w:p>
     <w:p>
       <w:r>
-        <w:t xml:space="preserve">7. National Center for Health Statistics. 2020 National Health Interview Survey Survey Description. 2021. </w:t>
-      </w:r>
-      <w:hyperlink r:id="rId16">
-        <w:r>
-          <w:t>NCHS source document</w:t>
-        </w:r>
-      </w:hyperlink>
-      <w:r>
-        <w:t>. Accessed September 18, 2026.</w:t>
+        <w:t>2. Kleindorfer DO, Towfighi A, Chaturvedi S, et al. 2021 Guideline for the Prevention of Stroke in Patients With Stroke and Transient Ischemic Attack. Stroke. 2021;52(7):e364-e467. doi:10.1161/STR.0000000000000375</w:t>
       </w:r>
     </w:p>
     <w:p>
       <w:r>
-        <w:t xml:space="preserve">8. National Center for Health Statistics. Multiple Imputation of Family Income in 2025 National Health Interview Survey Methods. 2026. </w:t>
-      </w:r>
-      <w:hyperlink r:id="rId17">
-        <w:r>
-          <w:t>NCHS source document</w:t>
-        </w:r>
-      </w:hyperlink>
-      <w:r>
-        <w:t>. Accessed September 18, 2026.</w:t>
+        <w:t>3. Levine DA, Kiefe CI, Houston TK, Allison JJ, McCarthy EP, Ayanian JZ. Younger stroke survivors have reduced access to physician care and medications: National Health Interview Survey from years 1998 to 2002. Arch Neurol. 2007;64(1):37-42. doi:10.1001/archneur.64.1.noc60002</w:t>
       </w:r>
     </w:p>
     <w:p>
       <w:r>
-        <w:t xml:space="preserve">9. Lumley T. Analysis of Complex Survey Samples. Journal of Statistical Software. 2004;9(8):1-19. </w:t>
-      </w:r>
-      <w:hyperlink r:id="rId18">
-        <w:r>
-          <w:t>doi:10.18637/jss.v009.i08</w:t>
-        </w:r>
-      </w:hyperlink>
-      <w:r/>
-    </w:p>
-    <w:p>
-      <w:r>
-        <w:t xml:space="preserve">10. Zou G. A modified Poisson regression approach to prospective studies with binary data. American Journal of Epidemiology. 2004;159(7):702-706. </w:t>
-      </w:r>
-      <w:hyperlink r:id="rId19">
-        <w:r>
-          <w:t>doi:10.1093/aje/kwh090</w:t>
-        </w:r>
-      </w:hyperlink>
-      <w:r/>
-    </w:p>
-    <w:p>
-      <w:r>
-        <w:t xml:space="preserve">11. Graubard BI, Korn EL. Predictive Margins with Survey Data. Biometrics. 1999;55(2):652-659. </w:t>
-      </w:r>
-      <w:hyperlink r:id="rId20">
-        <w:r>
-          <w:t>doi:10.1111/j.0006-341X.1999.00652.x</w:t>
-        </w:r>
-      </w:hyperlink>
-      <w:r/>
-    </w:p>
-    <w:p>
-      <w:r>
-        <w:t xml:space="preserve">12. Parker JD, Talih M, Malec DJ, et al. National Center for Health Statistics Data Presentation Standards for Proportions. Vital and Health Statistics Series 2. 2017;(175):1-22. </w:t>
-      </w:r>
-      <w:hyperlink r:id="rId21">
-        <w:r>
-          <w:t>NCHS source document</w:t>
-        </w:r>
-      </w:hyperlink>
-      <w:r>
-        <w:t>. Accessed September 18, 2026.</w:t>
+        <w:t>4. Levine DA, Morgenstern LB, Langa KM, Piette JD, Rogers MAM, Karve SJ. Recent trends in cost-related medication nonadherence among stroke survivors in the United States. Ann Neurol. 2013;73(2):180-188. doi:10.1002/ana.23823</w:t>
       </w:r>
     </w:p>
     <w:p>
       <w:r>
-        <w:t xml:space="preserve">13. von Elm E, Altman DG, Egger M, Pocock SJ, Gøtzsche PC, Vandenbroucke JP, STROBE Initiative. The Strengthening the Reporting of Observational Studies in Epidemiology Statement Guidelines for Reporting Observational Studies. PLoS Medicine. 2007;4(10):e296. </w:t>
+        <w:t>5. Springer MV, Skolarus LE, Patel M. Food Insecurity and Perceived Financial Stress are Associated with Cost-related Medication Non-adherence in Stroke. J Health Care Poor Underserved. 2023;34(2):625-639. doi:10.1353/hpu.2023.0054</w:t>
       </w:r>
-      <w:hyperlink r:id="rId22">
-        <w:r>
-          <w:t>doi:10.1371/journal.pmed.0040296</w:t>
-        </w:r>
-      </w:hyperlink>
-      <w:r/>
+    </w:p>
+    <w:p>
+      <w:r>
+        <w:t>6. Ansong R, Kyei G, Miezah D, Abubakari M, Kyei E. Cost-related medication nonadherence among adults with stroke in the United States: insight from the 2020-2023 National Health Interview Survey. J Racial Ethn Health Disparities. Published online January 27, 2026. doi:10.1007/s40615-026-02863-w</w:t>
+      </w:r>
+    </w:p>
+    <w:p>
+      <w:r>
+        <w:t>7. Amill-Rosario A, Slejko JF, dosReis S. Changes in cost-related nonadherence among US adults with multiple chronic conditions from 2019 to 2023. J Manag Care Spec Pharm. 2025;31(7):662-670. doi:10.18553/jmcp.2025.31.7.662</w:t>
+      </w:r>
+    </w:p>
+    <w:p>
+      <w:r>
+        <w:t>8. National Center for Health Statistics. 2025 National Health Interview Survey Survey Description. National Center for Health Statistics; 2026. Accessed September 18, 2026. https://ftp.cdc.gov/pub/Health_Statistics/NCHS/Dataset_Documentation/NHIS/2025/srvydesc-508.pdf</w:t>
+      </w:r>
+    </w:p>
+    <w:p>
+      <w:r>
+        <w:t>9. National Center for Health Statistics. 2020 National Health Interview Survey Survey Description. National Center for Health Statistics; 2021. Accessed September 18, 2026. https://ftp.cdc.gov/pub/Health_Statistics/NCHS/Dataset_Documentation/NHIS/2020/srvydesc-508.pdf</w:t>
+      </w:r>
+    </w:p>
+    <w:p>
+      <w:r>
+        <w:t>10. Lumley T. Analysis of Complex Survey Samples. J Stat Softw. 2004;9(8):1-19. doi:10.18637/jss.v009.i08</w:t>
+      </w:r>
+    </w:p>
+    <w:p>
+      <w:r>
+        <w:t>11. Parker JD, Talih M, Malec DJ, et al. National Center for Health Statistics Data Presentation Standards for Proportions. Vital Health Stat 2. 2017;(175):1-22.</w:t>
+      </w:r>
+    </w:p>
+    <w:p>
+      <w:r>
+        <w:t>12. National Center for Health Statistics. Multiple Imputation of Family Income in 2025 National Health Interview Survey Methods. National Center for Health Statistics; 2026. Accessed September 18, 2026. https://ftp.cdc.gov/pub/Health_Statistics/NCHS/Dataset_Documentation/NHIS/2025/NHIS2025-imputation-techdoc-508.pdf</w:t>
+      </w:r>
+    </w:p>
+    <w:p>
+      <w:r>
+        <w:t>13. Zou G. A modified Poisson regression approach to prospective studies with binary data. Am J Epidemiol. 2004;159(7):702-706. doi:10.1093/aje/kwh090</w:t>
+      </w:r>
+    </w:p>
+    <w:p>
+      <w:r>
+        <w:t>14. Graubard BI, Korn EL. Predictive Margins with Survey Data. Biometrics. 1999;55(2):652-659. doi:10.1111/j.0006-341X.1999.00652.x</w:t>
+      </w:r>
+    </w:p>
+    <w:p>
+      <w:r>
+        <w:t>15. von Elm E, Altman DG, Egger M, Pocock SJ, Gøtzsche PC, Vandenbroucke JP, STROBE Initiative. The Strengthening the Reporting of Observational Studies in Epidemiology Statement Guidelines for Reporting Observational Studies. PLoS Med. 2007;4(10):e296. doi:10.1371/journal.pmed.0040296</w:t>
+      </w:r>
+    </w:p>
+    <w:p>
+      <w:r>
+        <w:br w:type="page"/>
+      </w:r>
     </w:p>
     <w:p>
       <w:pPr>
@@ -702,10 +591,17 @@
     </w:p>
     <w:p>
       <w:pPr>
-        <w:pStyle w:val="Heading2"/>
+        <w:keepNext/>
+        <w:spacing w:line="276" w:lineRule="auto" w:before="240" w:after="80"/>
       </w:pPr>
       <w:r>
-        <w:t>Table 1 Selected characteristics of the pooled outcome observed sample</w:t>
+        <w:rPr>
+          <w:b/>
+        </w:rPr>
+        <w:t xml:space="preserve">Table 1. </w:t>
+      </w:r>
+      <w:r>
+        <w:t>Characteristics of US stroke survivors in the pooled 2019–2025 NHIS sample, overall and by cost-related barrier status</w:t>
       </w:r>
     </w:p>
     <w:tbl>
@@ -715,12 +611,12 @@
         <w:tblLayout w:type="fixed"/>
         <w:tblLook w:firstColumn="1" w:firstRow="1" w:lastColumn="0" w:lastRow="0" w:noHBand="0" w:noVBand="1" w:val="04A0"/>
         <w:tblBorders>
-          <w:top w:val="single" w:sz="4" w:color="D9D9D9"/>
-          <w:left w:val="single" w:sz="4" w:color="D9D9D9"/>
-          <w:bottom w:val="single" w:sz="4" w:color="D9D9D9"/>
-          <w:right w:val="single" w:sz="4" w:color="D9D9D9"/>
-          <w:insideH w:val="single" w:sz="4" w:color="D9D9D9"/>
-          <w:insideV w:val="single" w:sz="4" w:color="D9D9D9"/>
+          <w:top w:val="single" w:sz="8" w:color="000000"/>
+          <w:bottom w:val="single" w:sz="8" w:color="000000"/>
+          <w:insideH w:val="single" w:sz="4" w:color="BFBFBF"/>
+          <w:left w:val="nil"/>
+          <w:right w:val="nil"/>
+          <w:insideV w:val="nil"/>
         </w:tblBorders>
       </w:tblPr>
       <w:tblGrid>
@@ -737,11 +633,13 @@
           <w:tcPr>
             <w:tcW w:type="dxa" w:w="3888"/>
             <w:vAlign w:val="center"/>
-            <w:shd w:fill="E8EFF4"/>
+            <w:tcBorders>
+              <w:bottom w:val="single" w:sz="6" w:color="000000"/>
+            </w:tcBorders>
           </w:tcPr>
           <w:p>
             <w:pPr>
-              <w:spacing w:line="240" w:lineRule="auto" w:after="80" w:before="80"/>
+              <w:spacing w:line="240" w:lineRule="auto" w:after="40" w:before="40"/>
             </w:pPr>
             <w:r>
               <w:rPr>
@@ -756,11 +654,13 @@
           <w:tcPr>
             <w:tcW w:type="dxa" w:w="1824"/>
             <w:vAlign w:val="center"/>
-            <w:shd w:fill="E8EFF4"/>
+            <w:tcBorders>
+              <w:bottom w:val="single" w:sz="6" w:color="000000"/>
+            </w:tcBorders>
           </w:tcPr>
           <w:p>
             <w:pPr>
-              <w:spacing w:line="240" w:lineRule="auto" w:after="80" w:before="80"/>
+              <w:spacing w:line="240" w:lineRule="auto" w:after="40" w:before="40"/>
               <w:jc w:val="center"/>
             </w:pPr>
             <w:r>
@@ -768,7 +668,7 @@
                 <w:b/>
                 <w:sz w:val="18"/>
               </w:rPr>
-              <w:t>Overall N=7,104</w:t>
+              <w:t>Overall (N=7,104)</w:t>
             </w:r>
           </w:p>
         </w:tc>
@@ -776,11 +676,13 @@
           <w:tcPr>
             <w:tcW w:type="dxa" w:w="1824"/>
             <w:vAlign w:val="center"/>
-            <w:shd w:fill="E8EFF4"/>
+            <w:tcBorders>
+              <w:bottom w:val="single" w:sz="6" w:color="000000"/>
+            </w:tcBorders>
           </w:tcPr>
           <w:p>
             <w:pPr>
-              <w:spacing w:line="240" w:lineRule="auto" w:after="80" w:before="80"/>
+              <w:spacing w:line="240" w:lineRule="auto" w:after="40" w:before="40"/>
               <w:jc w:val="center"/>
             </w:pPr>
             <w:r>
@@ -788,7 +690,7 @@
                 <w:b/>
                 <w:sz w:val="18"/>
               </w:rPr>
-              <w:t>No barrier N=5,920</w:t>
+              <w:t>No barrier (n=5,920)</w:t>
             </w:r>
           </w:p>
         </w:tc>
@@ -796,11 +698,13 @@
           <w:tcPr>
             <w:tcW w:type="dxa" w:w="1824"/>
             <w:vAlign w:val="center"/>
-            <w:shd w:fill="E8EFF4"/>
+            <w:tcBorders>
+              <w:bottom w:val="single" w:sz="6" w:color="000000"/>
+            </w:tcBorders>
           </w:tcPr>
           <w:p>
             <w:pPr>
-              <w:spacing w:line="240" w:lineRule="auto" w:after="80" w:before="80"/>
+              <w:spacing w:line="240" w:lineRule="auto" w:after="40" w:before="40"/>
               <w:jc w:val="center"/>
             </w:pPr>
             <w:r>
@@ -808,7 +712,7 @@
                 <w:b/>
                 <w:sz w:val="18"/>
               </w:rPr>
-              <w:t>Any barrier N=1,184</w:t>
+              <w:t>Any barrier (n=1,184)</w:t>
             </w:r>
           </w:p>
         </w:tc>
@@ -821,7 +725,7 @@
           </w:tcPr>
           <w:p>
             <w:pPr>
-              <w:spacing w:line="240" w:lineRule="auto" w:after="80" w:before="80"/>
+              <w:spacing w:line="240" w:lineRule="auto" w:after="40" w:before="40"/>
             </w:pPr>
             <w:r>
               <w:rPr>
@@ -839,7 +743,7 @@
           </w:tcPr>
           <w:p>
             <w:pPr>
-              <w:spacing w:line="240" w:lineRule="auto" w:after="80" w:before="80"/>
+              <w:spacing w:line="240" w:lineRule="auto" w:after="40" w:before="40"/>
               <w:jc w:val="center"/>
             </w:pPr>
             <w:r>
@@ -858,7 +762,7 @@
           </w:tcPr>
           <w:p>
             <w:pPr>
-              <w:spacing w:line="240" w:lineRule="auto" w:after="80" w:before="80"/>
+              <w:spacing w:line="240" w:lineRule="auto" w:after="40" w:before="40"/>
               <w:jc w:val="center"/>
             </w:pPr>
             <w:r>
@@ -877,7 +781,7 @@
           </w:tcPr>
           <w:p>
             <w:pPr>
-              <w:spacing w:line="240" w:lineRule="auto" w:after="80" w:before="80"/>
+              <w:spacing w:line="240" w:lineRule="auto" w:after="40" w:before="40"/>
               <w:jc w:val="center"/>
             </w:pPr>
             <w:r>
@@ -898,7 +802,7 @@
           </w:tcPr>
           <w:p>
             <w:pPr>
-              <w:spacing w:line="240" w:lineRule="auto" w:after="80" w:before="80"/>
+              <w:spacing w:line="240" w:lineRule="auto" w:after="40" w:before="40"/>
             </w:pPr>
             <w:r>
               <w:rPr>
@@ -916,7 +820,7 @@
           </w:tcPr>
           <w:p>
             <w:pPr>
-              <w:spacing w:line="240" w:lineRule="auto" w:after="80" w:before="80"/>
+              <w:spacing w:line="240" w:lineRule="auto" w:after="40" w:before="40"/>
               <w:jc w:val="center"/>
             </w:pPr>
             <w:r>
@@ -935,7 +839,7 @@
           </w:tcPr>
           <w:p>
             <w:pPr>
-              <w:spacing w:line="240" w:lineRule="auto" w:after="80" w:before="80"/>
+              <w:spacing w:line="240" w:lineRule="auto" w:after="40" w:before="40"/>
               <w:jc w:val="center"/>
             </w:pPr>
             <w:r>
@@ -954,7 +858,7 @@
           </w:tcPr>
           <w:p>
             <w:pPr>
-              <w:spacing w:line="240" w:lineRule="auto" w:after="80" w:before="80"/>
+              <w:spacing w:line="240" w:lineRule="auto" w:after="40" w:before="40"/>
               <w:jc w:val="center"/>
             </w:pPr>
             <w:r>
@@ -975,7 +879,7 @@
           </w:tcPr>
           <w:p>
             <w:pPr>
-              <w:spacing w:line="240" w:lineRule="auto" w:after="80" w:before="80"/>
+              <w:spacing w:line="240" w:lineRule="auto" w:after="40" w:before="40"/>
             </w:pPr>
             <w:r>
               <w:rPr>
@@ -993,7 +897,7 @@
           </w:tcPr>
           <w:p>
             <w:pPr>
-              <w:spacing w:line="240" w:lineRule="auto" w:after="80" w:before="80"/>
+              <w:spacing w:line="240" w:lineRule="auto" w:after="40" w:before="40"/>
               <w:jc w:val="center"/>
             </w:pPr>
             <w:r>
@@ -1012,7 +916,7 @@
           </w:tcPr>
           <w:p>
             <w:pPr>
-              <w:spacing w:line="240" w:lineRule="auto" w:after="80" w:before="80"/>
+              <w:spacing w:line="240" w:lineRule="auto" w:after="40" w:before="40"/>
               <w:jc w:val="center"/>
             </w:pPr>
             <w:r>
@@ -1031,7 +935,7 @@
           </w:tcPr>
           <w:p>
             <w:pPr>
-              <w:spacing w:line="240" w:lineRule="auto" w:after="80" w:before="80"/>
+              <w:spacing w:line="240" w:lineRule="auto" w:after="40" w:before="40"/>
               <w:jc w:val="center"/>
             </w:pPr>
             <w:r>
@@ -1052,7 +956,7 @@
           </w:tcPr>
           <w:p>
             <w:pPr>
-              <w:spacing w:line="240" w:lineRule="auto" w:after="80" w:before="80"/>
+              <w:spacing w:line="240" w:lineRule="auto" w:after="40" w:before="40"/>
             </w:pPr>
             <w:r>
               <w:rPr>
@@ -1070,7 +974,7 @@
           </w:tcPr>
           <w:p>
             <w:pPr>
-              <w:spacing w:line="240" w:lineRule="auto" w:after="80" w:before="80"/>
+              <w:spacing w:line="240" w:lineRule="auto" w:after="40" w:before="40"/>
               <w:jc w:val="center"/>
             </w:pPr>
             <w:r>
@@ -1089,7 +993,7 @@
           </w:tcPr>
           <w:p>
             <w:pPr>
-              <w:spacing w:line="240" w:lineRule="auto" w:after="80" w:before="80"/>
+              <w:spacing w:line="240" w:lineRule="auto" w:after="40" w:before="40"/>
               <w:jc w:val="center"/>
             </w:pPr>
             <w:r>
@@ -1108,7 +1012,7 @@
           </w:tcPr>
           <w:p>
             <w:pPr>
-              <w:spacing w:line="240" w:lineRule="auto" w:after="80" w:before="80"/>
+              <w:spacing w:line="240" w:lineRule="auto" w:after="40" w:before="40"/>
               <w:jc w:val="center"/>
             </w:pPr>
             <w:r>
@@ -1129,7 +1033,7 @@
           </w:tcPr>
           <w:p>
             <w:pPr>
-              <w:spacing w:line="240" w:lineRule="auto" w:after="80" w:before="80"/>
+              <w:spacing w:line="240" w:lineRule="auto" w:after="40" w:before="40"/>
             </w:pPr>
             <w:r>
               <w:rPr>
@@ -1147,7 +1051,7 @@
           </w:tcPr>
           <w:p>
             <w:pPr>
-              <w:spacing w:line="240" w:lineRule="auto" w:after="80" w:before="80"/>
+              <w:spacing w:line="240" w:lineRule="auto" w:after="40" w:before="40"/>
               <w:jc w:val="center"/>
             </w:pPr>
             <w:r>
@@ -1166,7 +1070,7 @@
           </w:tcPr>
           <w:p>
             <w:pPr>
-              <w:spacing w:line="240" w:lineRule="auto" w:after="80" w:before="80"/>
+              <w:spacing w:line="240" w:lineRule="auto" w:after="40" w:before="40"/>
               <w:jc w:val="center"/>
             </w:pPr>
             <w:r>
@@ -1185,7 +1089,7 @@
           </w:tcPr>
           <w:p>
             <w:pPr>
-              <w:spacing w:line="240" w:lineRule="auto" w:after="80" w:before="80"/>
+              <w:spacing w:line="240" w:lineRule="auto" w:after="40" w:before="40"/>
               <w:jc w:val="center"/>
             </w:pPr>
             <w:r>
@@ -1206,7 +1110,7 @@
           </w:tcPr>
           <w:p>
             <w:pPr>
-              <w:spacing w:line="240" w:lineRule="auto" w:after="80" w:before="80"/>
+              <w:spacing w:line="240" w:lineRule="auto" w:after="40" w:before="40"/>
             </w:pPr>
             <w:r>
               <w:rPr>
@@ -1224,7 +1128,7 @@
           </w:tcPr>
           <w:p>
             <w:pPr>
-              <w:spacing w:line="240" w:lineRule="auto" w:after="80" w:before="80"/>
+              <w:spacing w:line="240" w:lineRule="auto" w:after="40" w:before="40"/>
               <w:jc w:val="center"/>
             </w:pPr>
             <w:r>
@@ -1243,7 +1147,7 @@
           </w:tcPr>
           <w:p>
             <w:pPr>
-              <w:spacing w:line="240" w:lineRule="auto" w:after="80" w:before="80"/>
+              <w:spacing w:line="240" w:lineRule="auto" w:after="40" w:before="40"/>
               <w:jc w:val="center"/>
             </w:pPr>
             <w:r>
@@ -1262,7 +1166,7 @@
           </w:tcPr>
           <w:p>
             <w:pPr>
-              <w:spacing w:line="240" w:lineRule="auto" w:after="80" w:before="80"/>
+              <w:spacing w:line="240" w:lineRule="auto" w:after="40" w:before="40"/>
               <w:jc w:val="center"/>
             </w:pPr>
             <w:r>
@@ -1283,7 +1187,7 @@
           </w:tcPr>
           <w:p>
             <w:pPr>
-              <w:spacing w:line="240" w:lineRule="auto" w:after="80" w:before="80"/>
+              <w:spacing w:line="240" w:lineRule="auto" w:after="40" w:before="40"/>
             </w:pPr>
             <w:r>
               <w:rPr>
@@ -1301,7 +1205,7 @@
           </w:tcPr>
           <w:p>
             <w:pPr>
-              <w:spacing w:line="240" w:lineRule="auto" w:after="80" w:before="80"/>
+              <w:spacing w:line="240" w:lineRule="auto" w:after="40" w:before="40"/>
               <w:jc w:val="center"/>
             </w:pPr>
             <w:r>
@@ -1320,7 +1224,7 @@
           </w:tcPr>
           <w:p>
             <w:pPr>
-              <w:spacing w:line="240" w:lineRule="auto" w:after="80" w:before="80"/>
+              <w:spacing w:line="240" w:lineRule="auto" w:after="40" w:before="40"/>
               <w:jc w:val="center"/>
             </w:pPr>
             <w:r>
@@ -1339,7 +1243,7 @@
           </w:tcPr>
           <w:p>
             <w:pPr>
-              <w:spacing w:line="240" w:lineRule="auto" w:after="80" w:before="80"/>
+              <w:spacing w:line="240" w:lineRule="auto" w:after="40" w:before="40"/>
               <w:jc w:val="center"/>
             </w:pPr>
             <w:r>
@@ -1360,7 +1264,7 @@
           </w:tcPr>
           <w:p>
             <w:pPr>
-              <w:spacing w:line="240" w:lineRule="auto" w:after="80" w:before="80"/>
+              <w:spacing w:line="240" w:lineRule="auto" w:after="40" w:before="40"/>
             </w:pPr>
             <w:r>
               <w:rPr>
@@ -1378,7 +1282,7 @@
           </w:tcPr>
           <w:p>
             <w:pPr>
-              <w:spacing w:line="240" w:lineRule="auto" w:after="80" w:before="80"/>
+              <w:spacing w:line="240" w:lineRule="auto" w:after="40" w:before="40"/>
               <w:jc w:val="center"/>
             </w:pPr>
             <w:r>
@@ -1397,7 +1301,7 @@
           </w:tcPr>
           <w:p>
             <w:pPr>
-              <w:spacing w:line="240" w:lineRule="auto" w:after="80" w:before="80"/>
+              <w:spacing w:line="240" w:lineRule="auto" w:after="40" w:before="40"/>
               <w:jc w:val="center"/>
             </w:pPr>
             <w:r>
@@ -1416,7 +1320,7 @@
           </w:tcPr>
           <w:p>
             <w:pPr>
-              <w:spacing w:line="240" w:lineRule="auto" w:after="80" w:before="80"/>
+              <w:spacing w:line="240" w:lineRule="auto" w:after="40" w:before="40"/>
               <w:jc w:val="center"/>
             </w:pPr>
             <w:r>
@@ -1437,7 +1341,7 @@
           </w:tcPr>
           <w:p>
             <w:pPr>
-              <w:spacing w:line="240" w:lineRule="auto" w:after="80" w:before="80"/>
+              <w:spacing w:line="240" w:lineRule="auto" w:after="40" w:before="40"/>
             </w:pPr>
             <w:r>
               <w:rPr>
@@ -1455,7 +1359,7 @@
           </w:tcPr>
           <w:p>
             <w:pPr>
-              <w:spacing w:line="240" w:lineRule="auto" w:after="80" w:before="80"/>
+              <w:spacing w:line="240" w:lineRule="auto" w:after="40" w:before="40"/>
               <w:jc w:val="center"/>
             </w:pPr>
             <w:r>
@@ -1474,7 +1378,7 @@
           </w:tcPr>
           <w:p>
             <w:pPr>
-              <w:spacing w:line="240" w:lineRule="auto" w:after="80" w:before="80"/>
+              <w:spacing w:line="240" w:lineRule="auto" w:after="40" w:before="40"/>
               <w:jc w:val="center"/>
             </w:pPr>
             <w:r>
@@ -1493,7 +1397,7 @@
           </w:tcPr>
           <w:p>
             <w:pPr>
-              <w:spacing w:line="240" w:lineRule="auto" w:after="80" w:before="80"/>
+              <w:spacing w:line="240" w:lineRule="auto" w:after="40" w:before="40"/>
               <w:jc w:val="center"/>
             </w:pPr>
             <w:r>
@@ -1514,7 +1418,7 @@
           </w:tcPr>
           <w:p>
             <w:pPr>
-              <w:spacing w:line="240" w:lineRule="auto" w:after="80" w:before="80"/>
+              <w:spacing w:line="240" w:lineRule="auto" w:after="40" w:before="40"/>
             </w:pPr>
             <w:r>
               <w:rPr>
@@ -1532,7 +1436,7 @@
           </w:tcPr>
           <w:p>
             <w:pPr>
-              <w:spacing w:line="240" w:lineRule="auto" w:after="80" w:before="80"/>
+              <w:spacing w:line="240" w:lineRule="auto" w:after="40" w:before="40"/>
               <w:jc w:val="center"/>
             </w:pPr>
             <w:r>
@@ -1551,7 +1455,7 @@
           </w:tcPr>
           <w:p>
             <w:pPr>
-              <w:spacing w:line="240" w:lineRule="auto" w:after="80" w:before="80"/>
+              <w:spacing w:line="240" w:lineRule="auto" w:after="40" w:before="40"/>
               <w:jc w:val="center"/>
             </w:pPr>
             <w:r>
@@ -1570,7 +1474,7 @@
           </w:tcPr>
           <w:p>
             <w:pPr>
-              <w:spacing w:line="240" w:lineRule="auto" w:after="80" w:before="80"/>
+              <w:spacing w:line="240" w:lineRule="auto" w:after="40" w:before="40"/>
               <w:jc w:val="center"/>
             </w:pPr>
             <w:r>
@@ -1591,7 +1495,7 @@
           </w:tcPr>
           <w:p>
             <w:pPr>
-              <w:spacing w:line="240" w:lineRule="auto" w:after="80" w:before="80"/>
+              <w:spacing w:line="240" w:lineRule="auto" w:after="40" w:before="40"/>
             </w:pPr>
             <w:r>
               <w:rPr>
@@ -1609,7 +1513,7 @@
           </w:tcPr>
           <w:p>
             <w:pPr>
-              <w:spacing w:line="240" w:lineRule="auto" w:after="80" w:before="80"/>
+              <w:spacing w:line="240" w:lineRule="auto" w:after="40" w:before="40"/>
               <w:jc w:val="center"/>
             </w:pPr>
             <w:r>
@@ -1628,7 +1532,7 @@
           </w:tcPr>
           <w:p>
             <w:pPr>
-              <w:spacing w:line="240" w:lineRule="auto" w:after="80" w:before="80"/>
+              <w:spacing w:line="240" w:lineRule="auto" w:after="40" w:before="40"/>
               <w:jc w:val="center"/>
             </w:pPr>
             <w:r>
@@ -1647,7 +1551,7 @@
           </w:tcPr>
           <w:p>
             <w:pPr>
-              <w:spacing w:line="240" w:lineRule="auto" w:after="80" w:before="80"/>
+              <w:spacing w:line="240" w:lineRule="auto" w:after="40" w:before="40"/>
               <w:jc w:val="center"/>
             </w:pPr>
             <w:r>
@@ -1668,7 +1572,7 @@
           </w:tcPr>
           <w:p>
             <w:pPr>
-              <w:spacing w:line="240" w:lineRule="auto" w:after="80" w:before="80"/>
+              <w:spacing w:line="240" w:lineRule="auto" w:after="40" w:before="40"/>
             </w:pPr>
             <w:r>
               <w:rPr>
@@ -1686,7 +1590,7 @@
           </w:tcPr>
           <w:p>
             <w:pPr>
-              <w:spacing w:line="240" w:lineRule="auto" w:after="80" w:before="80"/>
+              <w:spacing w:line="240" w:lineRule="auto" w:after="40" w:before="40"/>
               <w:jc w:val="center"/>
             </w:pPr>
             <w:r>
@@ -1705,7 +1609,7 @@
           </w:tcPr>
           <w:p>
             <w:pPr>
-              <w:spacing w:line="240" w:lineRule="auto" w:after="80" w:before="80"/>
+              <w:spacing w:line="240" w:lineRule="auto" w:after="40" w:before="40"/>
               <w:jc w:val="center"/>
             </w:pPr>
             <w:r>
@@ -1724,7 +1628,7 @@
           </w:tcPr>
           <w:p>
             <w:pPr>
-              <w:spacing w:line="240" w:lineRule="auto" w:after="80" w:before="80"/>
+              <w:spacing w:line="240" w:lineRule="auto" w:after="40" w:before="40"/>
               <w:jc w:val="center"/>
             </w:pPr>
             <w:r>
@@ -1745,7 +1649,7 @@
           </w:tcPr>
           <w:p>
             <w:pPr>
-              <w:spacing w:line="240" w:lineRule="auto" w:after="80" w:before="80"/>
+              <w:spacing w:line="240" w:lineRule="auto" w:after="40" w:before="40"/>
             </w:pPr>
             <w:r>
               <w:rPr>
@@ -1763,7 +1667,7 @@
           </w:tcPr>
           <w:p>
             <w:pPr>
-              <w:spacing w:line="240" w:lineRule="auto" w:after="80" w:before="80"/>
+              <w:spacing w:line="240" w:lineRule="auto" w:after="40" w:before="40"/>
               <w:jc w:val="center"/>
             </w:pPr>
             <w:r>
@@ -1782,7 +1686,7 @@
           </w:tcPr>
           <w:p>
             <w:pPr>
-              <w:spacing w:line="240" w:lineRule="auto" w:after="80" w:before="80"/>
+              <w:spacing w:line="240" w:lineRule="auto" w:after="40" w:before="40"/>
               <w:jc w:val="center"/>
             </w:pPr>
             <w:r>
@@ -1801,7 +1705,7 @@
           </w:tcPr>
           <w:p>
             <w:pPr>
-              <w:spacing w:line="240" w:lineRule="auto" w:after="80" w:before="80"/>
+              <w:spacing w:line="240" w:lineRule="auto" w:after="40" w:before="40"/>
               <w:jc w:val="center"/>
             </w:pPr>
             <w:r>
@@ -1822,7 +1726,7 @@
           </w:tcPr>
           <w:p>
             <w:pPr>
-              <w:spacing w:line="240" w:lineRule="auto" w:after="80" w:before="80"/>
+              <w:spacing w:line="240" w:lineRule="auto" w:after="40" w:before="40"/>
             </w:pPr>
             <w:r>
               <w:rPr>
@@ -1840,7 +1744,7 @@
           </w:tcPr>
           <w:p>
             <w:pPr>
-              <w:spacing w:line="240" w:lineRule="auto" w:after="80" w:before="80"/>
+              <w:spacing w:line="240" w:lineRule="auto" w:after="40" w:before="40"/>
               <w:jc w:val="center"/>
             </w:pPr>
             <w:r>
@@ -1859,7 +1763,7 @@
           </w:tcPr>
           <w:p>
             <w:pPr>
-              <w:spacing w:line="240" w:lineRule="auto" w:after="80" w:before="80"/>
+              <w:spacing w:line="240" w:lineRule="auto" w:after="40" w:before="40"/>
               <w:jc w:val="center"/>
             </w:pPr>
             <w:r>
@@ -1878,7 +1782,7 @@
           </w:tcPr>
           <w:p>
             <w:pPr>
-              <w:spacing w:line="240" w:lineRule="auto" w:after="80" w:before="80"/>
+              <w:spacing w:line="240" w:lineRule="auto" w:after="40" w:before="40"/>
               <w:jc w:val="center"/>
             </w:pPr>
             <w:r>
@@ -1899,7 +1803,7 @@
           </w:tcPr>
           <w:p>
             <w:pPr>
-              <w:spacing w:line="240" w:lineRule="auto" w:after="80" w:before="80"/>
+              <w:spacing w:line="240" w:lineRule="auto" w:after="40" w:before="40"/>
             </w:pPr>
             <w:r>
               <w:rPr>
@@ -1917,7 +1821,7 @@
           </w:tcPr>
           <w:p>
             <w:pPr>
-              <w:spacing w:line="240" w:lineRule="auto" w:after="80" w:before="80"/>
+              <w:spacing w:line="240" w:lineRule="auto" w:after="40" w:before="40"/>
               <w:jc w:val="center"/>
             </w:pPr>
             <w:r>
@@ -1936,7 +1840,7 @@
           </w:tcPr>
           <w:p>
             <w:pPr>
-              <w:spacing w:line="240" w:lineRule="auto" w:after="80" w:before="80"/>
+              <w:spacing w:line="240" w:lineRule="auto" w:after="40" w:before="40"/>
               <w:jc w:val="center"/>
             </w:pPr>
             <w:r>
@@ -1955,7 +1859,7 @@
           </w:tcPr>
           <w:p>
             <w:pPr>
-              <w:spacing w:line="240" w:lineRule="auto" w:after="80" w:before="80"/>
+              <w:spacing w:line="240" w:lineRule="auto" w:after="40" w:before="40"/>
               <w:jc w:val="center"/>
             </w:pPr>
             <w:r>
@@ -1976,7 +1880,7 @@
           </w:tcPr>
           <w:p>
             <w:pPr>
-              <w:spacing w:line="240" w:lineRule="auto" w:after="80" w:before="80"/>
+              <w:spacing w:line="240" w:lineRule="auto" w:after="40" w:before="40"/>
             </w:pPr>
             <w:r>
               <w:rPr>
@@ -1994,7 +1898,7 @@
           </w:tcPr>
           <w:p>
             <w:pPr>
-              <w:spacing w:line="240" w:lineRule="auto" w:after="80" w:before="80"/>
+              <w:spacing w:line="240" w:lineRule="auto" w:after="40" w:before="40"/>
               <w:jc w:val="center"/>
             </w:pPr>
             <w:r>
@@ -2013,7 +1917,7 @@
           </w:tcPr>
           <w:p>
             <w:pPr>
-              <w:spacing w:line="240" w:lineRule="auto" w:after="80" w:before="80"/>
+              <w:spacing w:line="240" w:lineRule="auto" w:after="40" w:before="40"/>
               <w:jc w:val="center"/>
             </w:pPr>
             <w:r>
@@ -2032,7 +1936,7 @@
           </w:tcPr>
           <w:p>
             <w:pPr>
-              <w:spacing w:line="240" w:lineRule="auto" w:after="80" w:before="80"/>
+              <w:spacing w:line="240" w:lineRule="auto" w:after="40" w:before="40"/>
               <w:jc w:val="center"/>
             </w:pPr>
             <w:r>
@@ -2053,7 +1957,7 @@
           </w:tcPr>
           <w:p>
             <w:pPr>
-              <w:spacing w:line="240" w:lineRule="auto" w:after="80" w:before="80"/>
+              <w:spacing w:line="240" w:lineRule="auto" w:after="40" w:before="40"/>
             </w:pPr>
             <w:r>
               <w:rPr>
@@ -2071,7 +1975,7 @@
           </w:tcPr>
           <w:p>
             <w:pPr>
-              <w:spacing w:line="240" w:lineRule="auto" w:after="80" w:before="80"/>
+              <w:spacing w:line="240" w:lineRule="auto" w:after="40" w:before="40"/>
               <w:jc w:val="center"/>
             </w:pPr>
             <w:r>
@@ -2090,7 +1994,7 @@
           </w:tcPr>
           <w:p>
             <w:pPr>
-              <w:spacing w:line="240" w:lineRule="auto" w:after="80" w:before="80"/>
+              <w:spacing w:line="240" w:lineRule="auto" w:after="40" w:before="40"/>
               <w:jc w:val="center"/>
             </w:pPr>
             <w:r>
@@ -2109,7 +2013,7 @@
           </w:tcPr>
           <w:p>
             <w:pPr>
-              <w:spacing w:line="240" w:lineRule="auto" w:after="80" w:before="80"/>
+              <w:spacing w:line="240" w:lineRule="auto" w:after="40" w:before="40"/>
               <w:jc w:val="center"/>
             </w:pPr>
             <w:r>
@@ -2130,7 +2034,7 @@
           </w:tcPr>
           <w:p>
             <w:pPr>
-              <w:spacing w:line="240" w:lineRule="auto" w:after="80" w:before="80"/>
+              <w:spacing w:line="240" w:lineRule="auto" w:after="40" w:before="40"/>
             </w:pPr>
             <w:r>
               <w:rPr>
@@ -2148,7 +2052,7 @@
           </w:tcPr>
           <w:p>
             <w:pPr>
-              <w:spacing w:line="240" w:lineRule="auto" w:after="80" w:before="80"/>
+              <w:spacing w:line="240" w:lineRule="auto" w:after="40" w:before="40"/>
               <w:jc w:val="center"/>
             </w:pPr>
             <w:r>
@@ -2167,7 +2071,7 @@
           </w:tcPr>
           <w:p>
             <w:pPr>
-              <w:spacing w:line="240" w:lineRule="auto" w:after="80" w:before="80"/>
+              <w:spacing w:line="240" w:lineRule="auto" w:after="40" w:before="40"/>
               <w:jc w:val="center"/>
             </w:pPr>
             <w:r>
@@ -2186,7 +2090,7 @@
           </w:tcPr>
           <w:p>
             <w:pPr>
-              <w:spacing w:line="240" w:lineRule="auto" w:after="80" w:before="80"/>
+              <w:spacing w:line="240" w:lineRule="auto" w:after="40" w:before="40"/>
               <w:jc w:val="center"/>
             </w:pPr>
             <w:r>
@@ -2207,7 +2111,7 @@
           </w:tcPr>
           <w:p>
             <w:pPr>
-              <w:spacing w:line="240" w:lineRule="auto" w:after="80" w:before="80"/>
+              <w:spacing w:line="240" w:lineRule="auto" w:after="40" w:before="40"/>
             </w:pPr>
             <w:r>
               <w:rPr>
@@ -2225,7 +2129,7 @@
           </w:tcPr>
           <w:p>
             <w:pPr>
-              <w:spacing w:line="240" w:lineRule="auto" w:after="80" w:before="80"/>
+              <w:spacing w:line="240" w:lineRule="auto" w:after="40" w:before="40"/>
               <w:jc w:val="center"/>
             </w:pPr>
             <w:r>
@@ -2244,7 +2148,7 @@
           </w:tcPr>
           <w:p>
             <w:pPr>
-              <w:spacing w:line="240" w:lineRule="auto" w:after="80" w:before="80"/>
+              <w:spacing w:line="240" w:lineRule="auto" w:after="40" w:before="40"/>
               <w:jc w:val="center"/>
             </w:pPr>
             <w:r>
@@ -2263,7 +2167,7 @@
           </w:tcPr>
           <w:p>
             <w:pPr>
-              <w:spacing w:line="240" w:lineRule="auto" w:after="80" w:before="80"/>
+              <w:spacing w:line="240" w:lineRule="auto" w:after="40" w:before="40"/>
               <w:jc w:val="center"/>
             </w:pPr>
             <w:r>
@@ -2284,7 +2188,7 @@
           </w:tcPr>
           <w:p>
             <w:pPr>
-              <w:spacing w:line="240" w:lineRule="auto" w:after="80" w:before="80"/>
+              <w:spacing w:line="240" w:lineRule="auto" w:after="40" w:before="40"/>
             </w:pPr>
             <w:r>
               <w:rPr>
@@ -2302,7 +2206,7 @@
           </w:tcPr>
           <w:p>
             <w:pPr>
-              <w:spacing w:line="240" w:lineRule="auto" w:after="80" w:before="80"/>
+              <w:spacing w:line="240" w:lineRule="auto" w:after="40" w:before="40"/>
               <w:jc w:val="center"/>
             </w:pPr>
             <w:r>
@@ -2321,7 +2225,7 @@
           </w:tcPr>
           <w:p>
             <w:pPr>
-              <w:spacing w:line="240" w:lineRule="auto" w:after="80" w:before="80"/>
+              <w:spacing w:line="240" w:lineRule="auto" w:after="40" w:before="40"/>
               <w:jc w:val="center"/>
             </w:pPr>
             <w:r>
@@ -2340,7 +2244,7 @@
           </w:tcPr>
           <w:p>
             <w:pPr>
-              <w:spacing w:line="240" w:lineRule="auto" w:after="80" w:before="80"/>
+              <w:spacing w:line="240" w:lineRule="auto" w:after="40" w:before="40"/>
               <w:jc w:val="center"/>
             </w:pPr>
             <w:r>
@@ -2361,7 +2265,7 @@
           </w:tcPr>
           <w:p>
             <w:pPr>
-              <w:spacing w:line="240" w:lineRule="auto" w:after="80" w:before="80"/>
+              <w:spacing w:line="240" w:lineRule="auto" w:after="40" w:before="40"/>
             </w:pPr>
             <w:r>
               <w:rPr>
@@ -2379,7 +2283,7 @@
           </w:tcPr>
           <w:p>
             <w:pPr>
-              <w:spacing w:line="240" w:lineRule="auto" w:after="80" w:before="80"/>
+              <w:spacing w:line="240" w:lineRule="auto" w:after="40" w:before="40"/>
               <w:jc w:val="center"/>
             </w:pPr>
             <w:r>
@@ -2398,7 +2302,7 @@
           </w:tcPr>
           <w:p>
             <w:pPr>
-              <w:spacing w:line="240" w:lineRule="auto" w:after="80" w:before="80"/>
+              <w:spacing w:line="240" w:lineRule="auto" w:after="40" w:before="40"/>
               <w:jc w:val="center"/>
             </w:pPr>
             <w:r>
@@ -2417,7 +2321,7 @@
           </w:tcPr>
           <w:p>
             <w:pPr>
-              <w:spacing w:line="240" w:lineRule="auto" w:after="80" w:before="80"/>
+              <w:spacing w:line="240" w:lineRule="auto" w:after="40" w:before="40"/>
               <w:jc w:val="center"/>
             </w:pPr>
             <w:r>
@@ -2438,7 +2342,7 @@
           </w:tcPr>
           <w:p>
             <w:pPr>
-              <w:spacing w:line="240" w:lineRule="auto" w:after="80" w:before="80"/>
+              <w:spacing w:line="240" w:lineRule="auto" w:after="40" w:before="40"/>
             </w:pPr>
             <w:r>
               <w:rPr>
@@ -2456,7 +2360,7 @@
           </w:tcPr>
           <w:p>
             <w:pPr>
-              <w:spacing w:line="240" w:lineRule="auto" w:after="80" w:before="80"/>
+              <w:spacing w:line="240" w:lineRule="auto" w:after="40" w:before="40"/>
               <w:jc w:val="center"/>
             </w:pPr>
             <w:r>
@@ -2475,7 +2379,7 @@
           </w:tcPr>
           <w:p>
             <w:pPr>
-              <w:spacing w:line="240" w:lineRule="auto" w:after="80" w:before="80"/>
+              <w:spacing w:line="240" w:lineRule="auto" w:after="40" w:before="40"/>
               <w:jc w:val="center"/>
             </w:pPr>
             <w:r>
@@ -2494,7 +2398,7 @@
           </w:tcPr>
           <w:p>
             <w:pPr>
-              <w:spacing w:line="240" w:lineRule="auto" w:after="80" w:before="80"/>
+              <w:spacing w:line="240" w:lineRule="auto" w:after="40" w:before="40"/>
               <w:jc w:val="center"/>
             </w:pPr>
             <w:r>
@@ -2508,18 +2412,35 @@
         </w:tc>
       </w:tr>
     </w:tbl>
-    <w:p/>
+    <w:p>
+      <w:pPr>
+        <w:spacing w:line="276" w:lineRule="auto" w:after="120"/>
+      </w:pPr>
+      <w:r>
+        <w:rPr>
+          <w:sz w:val="18"/>
+        </w:rPr>
+        <w:t>Values are unweighted number (survey-weighted column percentage). Income counts are averaged across the ten NCHS imputations and may be fractional. Unknown values are retained in denominators; percentages within a variable may not sum to 100 because of rounding. FPL indicates federal poverty level; NHIS, National Health Interview Survey. Additional characteristics are given in Table S3.</w:t>
+      </w:r>
+    </w:p>
     <w:p>
       <w:r>
-        <w:t>Cells are unweighted n (survey-weighted column percentage). Income counts are averages across ten imputations and may be fractional. Unknown values remain in column denominators. Categories within each variable sum to approximately 100% because of rounding. FPL, federal poverty level. The full characteristic table appears in Table S3.</w:t>
+        <w:br w:type="page"/>
       </w:r>
     </w:p>
     <w:p>
       <w:pPr>
-        <w:pStyle w:val="Heading2"/>
+        <w:keepNext/>
+        <w:spacing w:line="276" w:lineRule="auto" w:before="240" w:after="80"/>
       </w:pPr>
       <w:r>
-        <w:t>Table 2 Annual observed and standardized prevalence</w:t>
+        <w:rPr>
+          <w:b/>
+        </w:rPr>
+        <w:t xml:space="preserve">Table 2. </w:t>
+      </w:r>
+      <w:r>
+        <w:t>Observed and standardized annual prevalence of any cost-related barrier among US stroke survivors, 2019–2025</w:t>
       </w:r>
     </w:p>
     <w:tbl>
@@ -2529,12 +2450,12 @@
         <w:tblLayout w:type="fixed"/>
         <w:tblLook w:firstColumn="1" w:firstRow="1" w:lastColumn="0" w:lastRow="0" w:noHBand="0" w:noVBand="1" w:val="04A0"/>
         <w:tblBorders>
-          <w:top w:val="single" w:sz="4" w:color="D9D9D9"/>
-          <w:left w:val="single" w:sz="4" w:color="D9D9D9"/>
-          <w:bottom w:val="single" w:sz="4" w:color="D9D9D9"/>
-          <w:right w:val="single" w:sz="4" w:color="D9D9D9"/>
-          <w:insideH w:val="single" w:sz="4" w:color="D9D9D9"/>
-          <w:insideV w:val="single" w:sz="4" w:color="D9D9D9"/>
+          <w:top w:val="single" w:sz="8" w:color="000000"/>
+          <w:bottom w:val="single" w:sz="8" w:color="000000"/>
+          <w:insideH w:val="single" w:sz="4" w:color="BFBFBF"/>
+          <w:left w:val="nil"/>
+          <w:right w:val="nil"/>
+          <w:insideV w:val="nil"/>
         </w:tblBorders>
       </w:tblPr>
       <w:tblGrid>
@@ -2552,11 +2473,13 @@
           <w:tcPr>
             <w:tcW w:type="dxa" w:w="2592"/>
             <w:vAlign w:val="center"/>
-            <w:shd w:fill="E8EFF4"/>
+            <w:tcBorders>
+              <w:bottom w:val="single" w:sz="6" w:color="000000"/>
+            </w:tcBorders>
           </w:tcPr>
           <w:p>
             <w:pPr>
-              <w:spacing w:line="240" w:lineRule="auto" w:after="80" w:before="80"/>
+              <w:spacing w:line="240" w:lineRule="auto" w:after="40" w:before="40"/>
             </w:pPr>
             <w:r>
               <w:rPr>
@@ -2571,11 +2494,13 @@
           <w:tcPr>
             <w:tcW w:type="dxa" w:w="1692"/>
             <w:vAlign w:val="center"/>
-            <w:shd w:fill="E8EFF4"/>
+            <w:tcBorders>
+              <w:bottom w:val="single" w:sz="6" w:color="000000"/>
+            </w:tcBorders>
           </w:tcPr>
           <w:p>
             <w:pPr>
-              <w:spacing w:line="240" w:lineRule="auto" w:after="80" w:before="80"/>
+              <w:spacing w:line="240" w:lineRule="auto" w:after="40" w:before="40"/>
               <w:jc w:val="center"/>
             </w:pPr>
             <w:r>
@@ -2583,7 +2508,7 @@
                 <w:b/>
                 <w:sz w:val="18"/>
               </w:rPr>
-              <w:t>Observed outcome n</w:t>
+              <w:t>No. with observed outcome</w:t>
             </w:r>
           </w:p>
         </w:tc>
@@ -2591,11 +2516,13 @@
           <w:tcPr>
             <w:tcW w:type="dxa" w:w="1692"/>
             <w:vAlign w:val="center"/>
-            <w:shd w:fill="E8EFF4"/>
+            <w:tcBorders>
+              <w:bottom w:val="single" w:sz="6" w:color="000000"/>
+            </w:tcBorders>
           </w:tcPr>
           <w:p>
             <w:pPr>
-              <w:spacing w:line="240" w:lineRule="auto" w:after="80" w:before="80"/>
+              <w:spacing w:line="240" w:lineRule="auto" w:after="40" w:before="40"/>
               <w:jc w:val="center"/>
             </w:pPr>
             <w:r>
@@ -2603,7 +2530,7 @@
                 <w:b/>
                 <w:sz w:val="18"/>
               </w:rPr>
-              <w:t>Events</w:t>
+              <w:t>No. with barrier</w:t>
             </w:r>
           </w:p>
         </w:tc>
@@ -2611,11 +2538,13 @@
           <w:tcPr>
             <w:tcW w:type="dxa" w:w="1692"/>
             <w:vAlign w:val="center"/>
-            <w:shd w:fill="E8EFF4"/>
+            <w:tcBorders>
+              <w:bottom w:val="single" w:sz="6" w:color="000000"/>
+            </w:tcBorders>
           </w:tcPr>
           <w:p>
             <w:pPr>
-              <w:spacing w:line="240" w:lineRule="auto" w:after="80" w:before="80"/>
+              <w:spacing w:line="240" w:lineRule="auto" w:after="40" w:before="40"/>
               <w:jc w:val="center"/>
             </w:pPr>
             <w:r>
@@ -2623,7 +2552,7 @@
                 <w:b/>
                 <w:sz w:val="18"/>
               </w:rPr>
-              <w:t>Observed % (95% CI)</w:t>
+              <w:t>Observed prevalence, % (95% CI)</w:t>
             </w:r>
           </w:p>
         </w:tc>
@@ -2631,11 +2560,13 @@
           <w:tcPr>
             <w:tcW w:type="dxa" w:w="1692"/>
             <w:vAlign w:val="center"/>
-            <w:shd w:fill="E8EFF4"/>
+            <w:tcBorders>
+              <w:bottom w:val="single" w:sz="6" w:color="000000"/>
+            </w:tcBorders>
           </w:tcPr>
           <w:p>
             <w:pPr>
-              <w:spacing w:line="240" w:lineRule="auto" w:after="80" w:before="80"/>
+              <w:spacing w:line="240" w:lineRule="auto" w:after="40" w:before="40"/>
               <w:jc w:val="center"/>
             </w:pPr>
             <w:r>
@@ -2643,7 +2574,7 @@
                 <w:b/>
                 <w:sz w:val="18"/>
               </w:rPr>
-              <w:t>Standardized % (95% CI)</w:t>
+              <w:t>Standardized prevalence, % (95% CI)</w:t>
             </w:r>
           </w:p>
         </w:tc>
@@ -2656,7 +2587,7 @@
           </w:tcPr>
           <w:p>
             <w:pPr>
-              <w:spacing w:line="240" w:lineRule="auto" w:after="80" w:before="80"/>
+              <w:spacing w:line="240" w:lineRule="auto" w:after="40" w:before="40"/>
             </w:pPr>
             <w:r>
               <w:rPr>
@@ -2674,7 +2605,7 @@
           </w:tcPr>
           <w:p>
             <w:pPr>
-              <w:spacing w:line="240" w:lineRule="auto" w:after="80" w:before="80"/>
+              <w:spacing w:line="240" w:lineRule="auto" w:after="40" w:before="40"/>
               <w:jc w:val="center"/>
             </w:pPr>
             <w:r>
@@ -2693,7 +2624,7 @@
           </w:tcPr>
           <w:p>
             <w:pPr>
-              <w:spacing w:line="240" w:lineRule="auto" w:after="80" w:before="80"/>
+              <w:spacing w:line="240" w:lineRule="auto" w:after="40" w:before="40"/>
               <w:jc w:val="center"/>
             </w:pPr>
             <w:r>
@@ -2712,7 +2643,7 @@
           </w:tcPr>
           <w:p>
             <w:pPr>
-              <w:spacing w:line="240" w:lineRule="auto" w:after="80" w:before="80"/>
+              <w:spacing w:line="240" w:lineRule="auto" w:after="40" w:before="40"/>
               <w:jc w:val="center"/>
             </w:pPr>
             <w:r>
@@ -2731,7 +2662,7 @@
           </w:tcPr>
           <w:p>
             <w:pPr>
-              <w:spacing w:line="240" w:lineRule="auto" w:after="80" w:before="80"/>
+              <w:spacing w:line="240" w:lineRule="auto" w:after="40" w:before="40"/>
               <w:jc w:val="center"/>
             </w:pPr>
             <w:r>
@@ -2752,7 +2683,7 @@
           </w:tcPr>
           <w:p>
             <w:pPr>
-              <w:spacing w:line="240" w:lineRule="auto" w:after="80" w:before="80"/>
+              <w:spacing w:line="240" w:lineRule="auto" w:after="40" w:before="40"/>
             </w:pPr>
             <w:r>
               <w:rPr>
@@ -2770,7 +2701,7 @@
           </w:tcPr>
           <w:p>
             <w:pPr>
-              <w:spacing w:line="240" w:lineRule="auto" w:after="80" w:before="80"/>
+              <w:spacing w:line="240" w:lineRule="auto" w:after="40" w:before="40"/>
               <w:jc w:val="center"/>
             </w:pPr>
             <w:r>
@@ -2789,7 +2720,7 @@
           </w:tcPr>
           <w:p>
             <w:pPr>
-              <w:spacing w:line="240" w:lineRule="auto" w:after="80" w:before="80"/>
+              <w:spacing w:line="240" w:lineRule="auto" w:after="40" w:before="40"/>
               <w:jc w:val="center"/>
             </w:pPr>
             <w:r>
@@ -2808,7 +2739,7 @@
           </w:tcPr>
           <w:p>
             <w:pPr>
-              <w:spacing w:line="240" w:lineRule="auto" w:after="80" w:before="80"/>
+              <w:spacing w:line="240" w:lineRule="auto" w:after="40" w:before="40"/>
               <w:jc w:val="center"/>
             </w:pPr>
             <w:r>
@@ -2827,7 +2758,7 @@
           </w:tcPr>
           <w:p>
             <w:pPr>
-              <w:spacing w:line="240" w:lineRule="auto" w:after="80" w:before="80"/>
+              <w:spacing w:line="240" w:lineRule="auto" w:after="40" w:before="40"/>
               <w:jc w:val="center"/>
             </w:pPr>
             <w:r>
@@ -2848,7 +2779,7 @@
           </w:tcPr>
           <w:p>
             <w:pPr>
-              <w:spacing w:line="240" w:lineRule="auto" w:after="80" w:before="80"/>
+              <w:spacing w:line="240" w:lineRule="auto" w:after="40" w:before="40"/>
             </w:pPr>
             <w:r>
               <w:rPr>
@@ -2866,7 +2797,7 @@
           </w:tcPr>
           <w:p>
             <w:pPr>
-              <w:spacing w:line="240" w:lineRule="auto" w:after="80" w:before="80"/>
+              <w:spacing w:line="240" w:lineRule="auto" w:after="40" w:before="40"/>
               <w:jc w:val="center"/>
             </w:pPr>
             <w:r>
@@ -2885,7 +2816,7 @@
           </w:tcPr>
           <w:p>
             <w:pPr>
-              <w:spacing w:line="240" w:lineRule="auto" w:after="80" w:before="80"/>
+              <w:spacing w:line="240" w:lineRule="auto" w:after="40" w:before="40"/>
               <w:jc w:val="center"/>
             </w:pPr>
             <w:r>
@@ -2904,7 +2835,7 @@
           </w:tcPr>
           <w:p>
             <w:pPr>
-              <w:spacing w:line="240" w:lineRule="auto" w:after="80" w:before="80"/>
+              <w:spacing w:line="240" w:lineRule="auto" w:after="40" w:before="40"/>
               <w:jc w:val="center"/>
             </w:pPr>
             <w:r>
@@ -2923,7 +2854,7 @@
           </w:tcPr>
           <w:p>
             <w:pPr>
-              <w:spacing w:line="240" w:lineRule="auto" w:after="80" w:before="80"/>
+              <w:spacing w:line="240" w:lineRule="auto" w:after="40" w:before="40"/>
               <w:jc w:val="center"/>
             </w:pPr>
             <w:r>
@@ -2944,7 +2875,7 @@
           </w:tcPr>
           <w:p>
             <w:pPr>
-              <w:spacing w:line="240" w:lineRule="auto" w:after="80" w:before="80"/>
+              <w:spacing w:line="240" w:lineRule="auto" w:after="40" w:before="40"/>
             </w:pPr>
             <w:r>
               <w:rPr>
@@ -2962,7 +2893,7 @@
           </w:tcPr>
           <w:p>
             <w:pPr>
-              <w:spacing w:line="240" w:lineRule="auto" w:after="80" w:before="80"/>
+              <w:spacing w:line="240" w:lineRule="auto" w:after="40" w:before="40"/>
               <w:jc w:val="center"/>
             </w:pPr>
             <w:r>
@@ -2981,7 +2912,7 @@
           </w:tcPr>
           <w:p>
             <w:pPr>
-              <w:spacing w:line="240" w:lineRule="auto" w:after="80" w:before="80"/>
+              <w:spacing w:line="240" w:lineRule="auto" w:after="40" w:before="40"/>
               <w:jc w:val="center"/>
             </w:pPr>
             <w:r>
@@ -3000,7 +2931,7 @@
           </w:tcPr>
           <w:p>
             <w:pPr>
-              <w:spacing w:line="240" w:lineRule="auto" w:after="80" w:before="80"/>
+              <w:spacing w:line="240" w:lineRule="auto" w:after="40" w:before="40"/>
               <w:jc w:val="center"/>
             </w:pPr>
             <w:r>
@@ -3019,7 +2950,7 @@
           </w:tcPr>
           <w:p>
             <w:pPr>
-              <w:spacing w:line="240" w:lineRule="auto" w:after="80" w:before="80"/>
+              <w:spacing w:line="240" w:lineRule="auto" w:after="40" w:before="40"/>
               <w:jc w:val="center"/>
             </w:pPr>
             <w:r>
@@ -3040,7 +2971,7 @@
           </w:tcPr>
           <w:p>
             <w:pPr>
-              <w:spacing w:line="240" w:lineRule="auto" w:after="80" w:before="80"/>
+              <w:spacing w:line="240" w:lineRule="auto" w:after="40" w:before="40"/>
             </w:pPr>
             <w:r>
               <w:rPr>
@@ -3058,7 +2989,7 @@
           </w:tcPr>
           <w:p>
             <w:pPr>
-              <w:spacing w:line="240" w:lineRule="auto" w:after="80" w:before="80"/>
+              <w:spacing w:line="240" w:lineRule="auto" w:after="40" w:before="40"/>
               <w:jc w:val="center"/>
             </w:pPr>
             <w:r>
@@ -3077,7 +3008,7 @@
           </w:tcPr>
           <w:p>
             <w:pPr>
-              <w:spacing w:line="240" w:lineRule="auto" w:after="80" w:before="80"/>
+              <w:spacing w:line="240" w:lineRule="auto" w:after="40" w:before="40"/>
               <w:jc w:val="center"/>
             </w:pPr>
             <w:r>
@@ -3096,7 +3027,7 @@
           </w:tcPr>
           <w:p>
             <w:pPr>
-              <w:spacing w:line="240" w:lineRule="auto" w:after="80" w:before="80"/>
+              <w:spacing w:line="240" w:lineRule="auto" w:after="40" w:before="40"/>
               <w:jc w:val="center"/>
             </w:pPr>
             <w:r>
@@ -3115,7 +3046,7 @@
           </w:tcPr>
           <w:p>
             <w:pPr>
-              <w:spacing w:line="240" w:lineRule="auto" w:after="80" w:before="80"/>
+              <w:spacing w:line="240" w:lineRule="auto" w:after="40" w:before="40"/>
               <w:jc w:val="center"/>
             </w:pPr>
             <w:r>
@@ -3136,7 +3067,7 @@
           </w:tcPr>
           <w:p>
             <w:pPr>
-              <w:spacing w:line="240" w:lineRule="auto" w:after="80" w:before="80"/>
+              <w:spacing w:line="240" w:lineRule="auto" w:after="40" w:before="40"/>
             </w:pPr>
             <w:r>
               <w:rPr>
@@ -3154,7 +3085,7 @@
           </w:tcPr>
           <w:p>
             <w:pPr>
-              <w:spacing w:line="240" w:lineRule="auto" w:after="80" w:before="80"/>
+              <w:spacing w:line="240" w:lineRule="auto" w:after="40" w:before="40"/>
               <w:jc w:val="center"/>
             </w:pPr>
             <w:r>
@@ -3173,7 +3104,7 @@
           </w:tcPr>
           <w:p>
             <w:pPr>
-              <w:spacing w:line="240" w:lineRule="auto" w:after="80" w:before="80"/>
+              <w:spacing w:line="240" w:lineRule="auto" w:after="40" w:before="40"/>
               <w:jc w:val="center"/>
             </w:pPr>
             <w:r>
@@ -3192,7 +3123,7 @@
           </w:tcPr>
           <w:p>
             <w:pPr>
-              <w:spacing w:line="240" w:lineRule="auto" w:after="80" w:before="80"/>
+              <w:spacing w:line="240" w:lineRule="auto" w:after="40" w:before="40"/>
               <w:jc w:val="center"/>
             </w:pPr>
             <w:r>
@@ -3211,7 +3142,7 @@
           </w:tcPr>
           <w:p>
             <w:pPr>
-              <w:spacing w:line="240" w:lineRule="auto" w:after="80" w:before="80"/>
+              <w:spacing w:line="240" w:lineRule="auto" w:after="40" w:before="40"/>
               <w:jc w:val="center"/>
             </w:pPr>
             <w:r>
@@ -3232,7 +3163,7 @@
           </w:tcPr>
           <w:p>
             <w:pPr>
-              <w:spacing w:line="240" w:lineRule="auto" w:after="80" w:before="80"/>
+              <w:spacing w:line="240" w:lineRule="auto" w:after="40" w:before="40"/>
             </w:pPr>
             <w:r>
               <w:rPr>
@@ -3250,7 +3181,7 @@
           </w:tcPr>
           <w:p>
             <w:pPr>
-              <w:spacing w:line="240" w:lineRule="auto" w:after="80" w:before="80"/>
+              <w:spacing w:line="240" w:lineRule="auto" w:after="40" w:before="40"/>
               <w:jc w:val="center"/>
             </w:pPr>
             <w:r>
@@ -3269,7 +3200,7 @@
           </w:tcPr>
           <w:p>
             <w:pPr>
-              <w:spacing w:line="240" w:lineRule="auto" w:after="80" w:before="80"/>
+              <w:spacing w:line="240" w:lineRule="auto" w:after="40" w:before="40"/>
               <w:jc w:val="center"/>
             </w:pPr>
             <w:r>
@@ -3288,7 +3219,7 @@
           </w:tcPr>
           <w:p>
             <w:pPr>
-              <w:spacing w:line="240" w:lineRule="auto" w:after="80" w:before="80"/>
+              <w:spacing w:line="240" w:lineRule="auto" w:after="40" w:before="40"/>
               <w:jc w:val="center"/>
             </w:pPr>
             <w:r>
@@ -3307,7 +3238,7 @@
           </w:tcPr>
           <w:p>
             <w:pPr>
-              <w:spacing w:line="240" w:lineRule="auto" w:after="80" w:before="80"/>
+              <w:spacing w:line="240" w:lineRule="auto" w:after="40" w:before="40"/>
               <w:jc w:val="center"/>
             </w:pPr>
             <w:r>
@@ -3321,18 +3252,35 @@
         </w:tc>
       </w:tr>
     </w:tbl>
-    <w:p/>
+    <w:p>
+      <w:pPr>
+        <w:spacing w:line="276" w:lineRule="auto" w:after="120"/>
+      </w:pPr>
+      <w:r>
+        <w:rPr>
+          <w:sz w:val="18"/>
+        </w:rPr>
+        <w:t>Observed estimates use each year's full sample and annual weights. Standardized estimates come from the fully adjusted logistic model fitted in the pooled complete-case sample with 2020 partial-sample weights and ten income imputations, standardized to the pooled covariate distribution. Confidence intervals account for the complex survey design.</w:t>
+      </w:r>
+    </w:p>
     <w:p>
       <w:r>
-        <w:t>Observed estimates use annual full-sample weights. Standardized estimates use the pooled complete-case logistic model and ten income imputations, with 2020 partial-sample weights. Both uncertainty intervals account for the survey design. Different analytic populations contribute to the two series.</w:t>
+        <w:br w:type="page"/>
       </w:r>
     </w:p>
     <w:p>
       <w:pPr>
-        <w:pStyle w:val="Heading2"/>
+        <w:keepNext/>
+        <w:spacing w:line="276" w:lineRule="auto" w:before="240" w:after="80"/>
       </w:pPr>
       <w:r>
-        <w:t>Table 3 Sequential adjusted associations</w:t>
+        <w:rPr>
+          <w:b/>
+        </w:rPr>
+        <w:t xml:space="preserve">Table 3. </w:t>
+      </w:r>
+      <w:r>
+        <w:t>Prevalence ratios for any cost-related barrier among US stroke survivors under sequential adjustment</w:t>
       </w:r>
     </w:p>
     <w:tbl>
@@ -3342,12 +3290,12 @@
         <w:tblLayout w:type="fixed"/>
         <w:tblLook w:firstColumn="1" w:firstRow="1" w:lastColumn="0" w:lastRow="0" w:noHBand="0" w:noVBand="1" w:val="04A0"/>
         <w:tblBorders>
-          <w:top w:val="single" w:sz="4" w:color="D9D9D9"/>
-          <w:left w:val="single" w:sz="4" w:color="D9D9D9"/>
-          <w:bottom w:val="single" w:sz="4" w:color="D9D9D9"/>
-          <w:right w:val="single" w:sz="4" w:color="D9D9D9"/>
-          <w:insideH w:val="single" w:sz="4" w:color="D9D9D9"/>
-          <w:insideV w:val="single" w:sz="4" w:color="D9D9D9"/>
+          <w:top w:val="single" w:sz="8" w:color="000000"/>
+          <w:bottom w:val="single" w:sz="8" w:color="000000"/>
+          <w:insideH w:val="single" w:sz="4" w:color="BFBFBF"/>
+          <w:left w:val="nil"/>
+          <w:right w:val="nil"/>
+          <w:insideV w:val="nil"/>
         </w:tblBorders>
       </w:tblPr>
       <w:tblGrid>
@@ -3364,18 +3312,20 @@
           <w:tcPr>
             <w:tcW w:type="dxa" w:w="3888"/>
             <w:vAlign w:val="center"/>
-            <w:shd w:fill="E8EFF4"/>
+            <w:tcBorders>
+              <w:bottom w:val="single" w:sz="6" w:color="000000"/>
+            </w:tcBorders>
           </w:tcPr>
           <w:p>
             <w:pPr>
-              <w:spacing w:line="240" w:lineRule="auto" w:after="80" w:before="80"/>
+              <w:spacing w:line="240" w:lineRule="auto" w:after="40" w:before="40"/>
             </w:pPr>
             <w:r>
               <w:rPr>
                 <w:b/>
                 <w:sz w:val="18"/>
               </w:rPr>
-              <w:t>Contrast</w:t>
+              <w:t>Characteristic</w:t>
             </w:r>
           </w:p>
         </w:tc>
@@ -3383,11 +3333,13 @@
           <w:tcPr>
             <w:tcW w:type="dxa" w:w="1824"/>
             <w:vAlign w:val="center"/>
-            <w:shd w:fill="E8EFF4"/>
+            <w:tcBorders>
+              <w:bottom w:val="single" w:sz="6" w:color="000000"/>
+            </w:tcBorders>
           </w:tcPr>
           <w:p>
             <w:pPr>
-              <w:spacing w:line="240" w:lineRule="auto" w:after="80" w:before="80"/>
+              <w:spacing w:line="240" w:lineRule="auto" w:after="40" w:before="40"/>
               <w:jc w:val="center"/>
             </w:pPr>
             <w:r>
@@ -3395,7 +3347,7 @@
                 <w:b/>
                 <w:sz w:val="18"/>
               </w:rPr>
-              <w:t>Model 1 aPR (95% CI)</w:t>
+              <w:t>Model 1, PR (95% CI)</w:t>
             </w:r>
           </w:p>
         </w:tc>
@@ -3403,11 +3355,13 @@
           <w:tcPr>
             <w:tcW w:type="dxa" w:w="1824"/>
             <w:vAlign w:val="center"/>
-            <w:shd w:fill="E8EFF4"/>
+            <w:tcBorders>
+              <w:bottom w:val="single" w:sz="6" w:color="000000"/>
+            </w:tcBorders>
           </w:tcPr>
           <w:p>
             <w:pPr>
-              <w:spacing w:line="240" w:lineRule="auto" w:after="80" w:before="80"/>
+              <w:spacing w:line="240" w:lineRule="auto" w:after="40" w:before="40"/>
               <w:jc w:val="center"/>
             </w:pPr>
             <w:r>
@@ -3415,7 +3369,7 @@
                 <w:b/>
                 <w:sz w:val="18"/>
               </w:rPr>
-              <w:t>Model 2 aPR (95% CI)</w:t>
+              <w:t>Model 2, PR (95% CI)</w:t>
             </w:r>
           </w:p>
         </w:tc>
@@ -3423,11 +3377,13 @@
           <w:tcPr>
             <w:tcW w:type="dxa" w:w="1824"/>
             <w:vAlign w:val="center"/>
-            <w:shd w:fill="E8EFF4"/>
+            <w:tcBorders>
+              <w:bottom w:val="single" w:sz="6" w:color="000000"/>
+            </w:tcBorders>
           </w:tcPr>
           <w:p>
             <w:pPr>
-              <w:spacing w:line="240" w:lineRule="auto" w:after="80" w:before="80"/>
+              <w:spacing w:line="240" w:lineRule="auto" w:after="40" w:before="40"/>
               <w:jc w:val="center"/>
             </w:pPr>
             <w:r>
@@ -3435,7 +3391,7 @@
                 <w:b/>
                 <w:sz w:val="18"/>
               </w:rPr>
-              <w:t>Model 3 aPR (95% CI)</w:t>
+              <w:t>Model 3, PR (95% CI)</w:t>
             </w:r>
           </w:p>
         </w:tc>
@@ -3448,7 +3404,7 @@
           </w:tcPr>
           <w:p>
             <w:pPr>
-              <w:spacing w:line="240" w:lineRule="auto" w:after="80" w:before="80"/>
+              <w:spacing w:line="240" w:lineRule="auto" w:after="40" w:before="40"/>
             </w:pPr>
             <w:r>
               <w:rPr>
@@ -3466,7 +3422,7 @@
           </w:tcPr>
           <w:p>
             <w:pPr>
-              <w:spacing w:line="240" w:lineRule="auto" w:after="80" w:before="80"/>
+              <w:spacing w:line="240" w:lineRule="auto" w:after="40" w:before="40"/>
               <w:jc w:val="center"/>
             </w:pPr>
             <w:r>
@@ -3485,7 +3441,7 @@
           </w:tcPr>
           <w:p>
             <w:pPr>
-              <w:spacing w:line="240" w:lineRule="auto" w:after="80" w:before="80"/>
+              <w:spacing w:line="240" w:lineRule="auto" w:after="40" w:before="40"/>
               <w:jc w:val="center"/>
             </w:pPr>
             <w:r>
@@ -3504,7 +3460,7 @@
           </w:tcPr>
           <w:p>
             <w:pPr>
-              <w:spacing w:line="240" w:lineRule="auto" w:after="80" w:before="80"/>
+              <w:spacing w:line="240" w:lineRule="auto" w:after="40" w:before="40"/>
               <w:jc w:val="center"/>
             </w:pPr>
             <w:r>
@@ -3525,7 +3481,7 @@
           </w:tcPr>
           <w:p>
             <w:pPr>
-              <w:spacing w:line="240" w:lineRule="auto" w:after="80" w:before="80"/>
+              <w:spacing w:line="240" w:lineRule="auto" w:after="40" w:before="40"/>
             </w:pPr>
             <w:r>
               <w:rPr>
@@ -3543,7 +3499,7 @@
           </w:tcPr>
           <w:p>
             <w:pPr>
-              <w:spacing w:line="240" w:lineRule="auto" w:after="80" w:before="80"/>
+              <w:spacing w:line="240" w:lineRule="auto" w:after="40" w:before="40"/>
               <w:jc w:val="center"/>
             </w:pPr>
             <w:r>
@@ -3562,7 +3518,7 @@
           </w:tcPr>
           <w:p>
             <w:pPr>
-              <w:spacing w:line="240" w:lineRule="auto" w:after="80" w:before="80"/>
+              <w:spacing w:line="240" w:lineRule="auto" w:after="40" w:before="40"/>
               <w:jc w:val="center"/>
             </w:pPr>
             <w:r>
@@ -3581,7 +3537,7 @@
           </w:tcPr>
           <w:p>
             <w:pPr>
-              <w:spacing w:line="240" w:lineRule="auto" w:after="80" w:before="80"/>
+              <w:spacing w:line="240" w:lineRule="auto" w:after="40" w:before="40"/>
               <w:jc w:val="center"/>
             </w:pPr>
             <w:r>
@@ -3602,7 +3558,7 @@
           </w:tcPr>
           <w:p>
             <w:pPr>
-              <w:spacing w:line="240" w:lineRule="auto" w:after="80" w:before="80"/>
+              <w:spacing w:line="240" w:lineRule="auto" w:after="40" w:before="40"/>
             </w:pPr>
             <w:r>
               <w:rPr>
@@ -3620,7 +3576,7 @@
           </w:tcPr>
           <w:p>
             <w:pPr>
-              <w:spacing w:line="240" w:lineRule="auto" w:after="80" w:before="80"/>
+              <w:spacing w:line="240" w:lineRule="auto" w:after="40" w:before="40"/>
               <w:jc w:val="center"/>
             </w:pPr>
             <w:r>
@@ -3639,7 +3595,7 @@
           </w:tcPr>
           <w:p>
             <w:pPr>
-              <w:spacing w:line="240" w:lineRule="auto" w:after="80" w:before="80"/>
+              <w:spacing w:line="240" w:lineRule="auto" w:after="40" w:before="40"/>
               <w:jc w:val="center"/>
             </w:pPr>
             <w:r>
@@ -3658,7 +3614,7 @@
           </w:tcPr>
           <w:p>
             <w:pPr>
-              <w:spacing w:line="240" w:lineRule="auto" w:after="80" w:before="80"/>
+              <w:spacing w:line="240" w:lineRule="auto" w:after="40" w:before="40"/>
               <w:jc w:val="center"/>
             </w:pPr>
             <w:r>
@@ -3679,7 +3635,7 @@
           </w:tcPr>
           <w:p>
             <w:pPr>
-              <w:spacing w:line="240" w:lineRule="auto" w:after="80" w:before="80"/>
+              <w:spacing w:line="240" w:lineRule="auto" w:after="40" w:before="40"/>
             </w:pPr>
             <w:r>
               <w:rPr>
@@ -3697,7 +3653,7 @@
           </w:tcPr>
           <w:p>
             <w:pPr>
-              <w:spacing w:line="240" w:lineRule="auto" w:after="80" w:before="80"/>
+              <w:spacing w:line="240" w:lineRule="auto" w:after="40" w:before="40"/>
               <w:jc w:val="center"/>
             </w:pPr>
             <w:r>
@@ -3716,7 +3672,7 @@
           </w:tcPr>
           <w:p>
             <w:pPr>
-              <w:spacing w:line="240" w:lineRule="auto" w:after="80" w:before="80"/>
+              <w:spacing w:line="240" w:lineRule="auto" w:after="40" w:before="40"/>
               <w:jc w:val="center"/>
             </w:pPr>
             <w:r>
@@ -3735,7 +3691,7 @@
           </w:tcPr>
           <w:p>
             <w:pPr>
-              <w:spacing w:line="240" w:lineRule="auto" w:after="80" w:before="80"/>
+              <w:spacing w:line="240" w:lineRule="auto" w:after="40" w:before="40"/>
               <w:jc w:val="center"/>
             </w:pPr>
             <w:r>
@@ -3756,7 +3712,7 @@
           </w:tcPr>
           <w:p>
             <w:pPr>
-              <w:spacing w:line="240" w:lineRule="auto" w:after="80" w:before="80"/>
+              <w:spacing w:line="240" w:lineRule="auto" w:after="40" w:before="40"/>
             </w:pPr>
             <w:r>
               <w:rPr>
@@ -3774,7 +3730,7 @@
           </w:tcPr>
           <w:p>
             <w:pPr>
-              <w:spacing w:line="240" w:lineRule="auto" w:after="80" w:before="80"/>
+              <w:spacing w:line="240" w:lineRule="auto" w:after="40" w:before="40"/>
               <w:jc w:val="center"/>
             </w:pPr>
             <w:r>
@@ -3793,7 +3749,7 @@
           </w:tcPr>
           <w:p>
             <w:pPr>
-              <w:spacing w:line="240" w:lineRule="auto" w:after="80" w:before="80"/>
+              <w:spacing w:line="240" w:lineRule="auto" w:after="40" w:before="40"/>
               <w:jc w:val="center"/>
             </w:pPr>
             <w:r>
@@ -3812,7 +3768,7 @@
           </w:tcPr>
           <w:p>
             <w:pPr>
-              <w:spacing w:line="240" w:lineRule="auto" w:after="80" w:before="80"/>
+              <w:spacing w:line="240" w:lineRule="auto" w:after="40" w:before="40"/>
               <w:jc w:val="center"/>
             </w:pPr>
             <w:r>
@@ -3833,7 +3789,7 @@
           </w:tcPr>
           <w:p>
             <w:pPr>
-              <w:spacing w:line="240" w:lineRule="auto" w:after="80" w:before="80"/>
+              <w:spacing w:line="240" w:lineRule="auto" w:after="40" w:before="40"/>
             </w:pPr>
             <w:r>
               <w:rPr>
@@ -3851,7 +3807,7 @@
           </w:tcPr>
           <w:p>
             <w:pPr>
-              <w:spacing w:line="240" w:lineRule="auto" w:after="80" w:before="80"/>
+              <w:spacing w:line="240" w:lineRule="auto" w:after="40" w:before="40"/>
               <w:jc w:val="center"/>
             </w:pPr>
             <w:r>
@@ -3870,7 +3826,7 @@
           </w:tcPr>
           <w:p>
             <w:pPr>
-              <w:spacing w:line="240" w:lineRule="auto" w:after="80" w:before="80"/>
+              <w:spacing w:line="240" w:lineRule="auto" w:after="40" w:before="40"/>
               <w:jc w:val="center"/>
             </w:pPr>
             <w:r>
@@ -3889,7 +3845,7 @@
           </w:tcPr>
           <w:p>
             <w:pPr>
-              <w:spacing w:line="240" w:lineRule="auto" w:after="80" w:before="80"/>
+              <w:spacing w:line="240" w:lineRule="auto" w:after="40" w:before="40"/>
               <w:jc w:val="center"/>
             </w:pPr>
             <w:r>
@@ -3910,7 +3866,7 @@
           </w:tcPr>
           <w:p>
             <w:pPr>
-              <w:spacing w:line="240" w:lineRule="auto" w:after="80" w:before="80"/>
+              <w:spacing w:line="240" w:lineRule="auto" w:after="40" w:before="40"/>
             </w:pPr>
             <w:r>
               <w:rPr>
@@ -3928,7 +3884,7 @@
           </w:tcPr>
           <w:p>
             <w:pPr>
-              <w:spacing w:line="240" w:lineRule="auto" w:after="80" w:before="80"/>
+              <w:spacing w:line="240" w:lineRule="auto" w:after="40" w:before="40"/>
               <w:jc w:val="center"/>
             </w:pPr>
             <w:r>
@@ -3947,7 +3903,7 @@
           </w:tcPr>
           <w:p>
             <w:pPr>
-              <w:spacing w:line="240" w:lineRule="auto" w:after="80" w:before="80"/>
+              <w:spacing w:line="240" w:lineRule="auto" w:after="40" w:before="40"/>
               <w:jc w:val="center"/>
             </w:pPr>
             <w:r>
@@ -3966,7 +3922,7 @@
           </w:tcPr>
           <w:p>
             <w:pPr>
-              <w:spacing w:line="240" w:lineRule="auto" w:after="80" w:before="80"/>
+              <w:spacing w:line="240" w:lineRule="auto" w:after="40" w:before="40"/>
               <w:jc w:val="center"/>
             </w:pPr>
             <w:r>
@@ -3987,7 +3943,7 @@
           </w:tcPr>
           <w:p>
             <w:pPr>
-              <w:spacing w:line="240" w:lineRule="auto" w:after="80" w:before="80"/>
+              <w:spacing w:line="240" w:lineRule="auto" w:after="40" w:before="40"/>
             </w:pPr>
             <w:r>
               <w:rPr>
@@ -4005,7 +3961,7 @@
           </w:tcPr>
           <w:p>
             <w:pPr>
-              <w:spacing w:line="240" w:lineRule="auto" w:after="80" w:before="80"/>
+              <w:spacing w:line="240" w:lineRule="auto" w:after="40" w:before="40"/>
               <w:jc w:val="center"/>
             </w:pPr>
             <w:r>
@@ -4024,7 +3980,7 @@
           </w:tcPr>
           <w:p>
             <w:pPr>
-              <w:spacing w:line="240" w:lineRule="auto" w:after="80" w:before="80"/>
+              <w:spacing w:line="240" w:lineRule="auto" w:after="40" w:before="40"/>
               <w:jc w:val="center"/>
             </w:pPr>
             <w:r>
@@ -4043,7 +3999,7 @@
           </w:tcPr>
           <w:p>
             <w:pPr>
-              <w:spacing w:line="240" w:lineRule="auto" w:after="80" w:before="80"/>
+              <w:spacing w:line="240" w:lineRule="auto" w:after="40" w:before="40"/>
               <w:jc w:val="center"/>
             </w:pPr>
             <w:r>
@@ -4064,7 +4020,7 @@
           </w:tcPr>
           <w:p>
             <w:pPr>
-              <w:spacing w:line="240" w:lineRule="auto" w:after="80" w:before="80"/>
+              <w:spacing w:line="240" w:lineRule="auto" w:after="40" w:before="40"/>
             </w:pPr>
             <w:r>
               <w:rPr>
@@ -4082,7 +4038,7 @@
           </w:tcPr>
           <w:p>
             <w:pPr>
-              <w:spacing w:line="240" w:lineRule="auto" w:after="80" w:before="80"/>
+              <w:spacing w:line="240" w:lineRule="auto" w:after="40" w:before="40"/>
               <w:jc w:val="center"/>
             </w:pPr>
             <w:r>
@@ -4101,7 +4057,7 @@
           </w:tcPr>
           <w:p>
             <w:pPr>
-              <w:spacing w:line="240" w:lineRule="auto" w:after="80" w:before="80"/>
+              <w:spacing w:line="240" w:lineRule="auto" w:after="40" w:before="40"/>
               <w:jc w:val="center"/>
             </w:pPr>
             <w:r>
@@ -4120,7 +4076,7 @@
           </w:tcPr>
           <w:p>
             <w:pPr>
-              <w:spacing w:line="240" w:lineRule="auto" w:after="80" w:before="80"/>
+              <w:spacing w:line="240" w:lineRule="auto" w:after="40" w:before="40"/>
               <w:jc w:val="center"/>
             </w:pPr>
             <w:r>
@@ -4141,7 +4097,7 @@
           </w:tcPr>
           <w:p>
             <w:pPr>
-              <w:spacing w:line="240" w:lineRule="auto" w:after="80" w:before="80"/>
+              <w:spacing w:line="240" w:lineRule="auto" w:after="40" w:before="40"/>
             </w:pPr>
             <w:r>
               <w:rPr>
@@ -4159,7 +4115,7 @@
           </w:tcPr>
           <w:p>
             <w:pPr>
-              <w:spacing w:line="240" w:lineRule="auto" w:after="80" w:before="80"/>
+              <w:spacing w:line="240" w:lineRule="auto" w:after="40" w:before="40"/>
               <w:jc w:val="center"/>
             </w:pPr>
             <w:r>
@@ -4178,7 +4134,7 @@
           </w:tcPr>
           <w:p>
             <w:pPr>
-              <w:spacing w:line="240" w:lineRule="auto" w:after="80" w:before="80"/>
+              <w:spacing w:line="240" w:lineRule="auto" w:after="40" w:before="40"/>
               <w:jc w:val="center"/>
             </w:pPr>
             <w:r>
@@ -4197,7 +4153,7 @@
           </w:tcPr>
           <w:p>
             <w:pPr>
-              <w:spacing w:line="240" w:lineRule="auto" w:after="80" w:before="80"/>
+              <w:spacing w:line="240" w:lineRule="auto" w:after="40" w:before="40"/>
               <w:jc w:val="center"/>
             </w:pPr>
             <w:r>
@@ -4218,7 +4174,7 @@
           </w:tcPr>
           <w:p>
             <w:pPr>
-              <w:spacing w:line="240" w:lineRule="auto" w:after="80" w:before="80"/>
+              <w:spacing w:line="240" w:lineRule="auto" w:after="40" w:before="40"/>
             </w:pPr>
             <w:r>
               <w:rPr>
@@ -4236,7 +4192,7 @@
           </w:tcPr>
           <w:p>
             <w:pPr>
-              <w:spacing w:line="240" w:lineRule="auto" w:after="80" w:before="80"/>
+              <w:spacing w:line="240" w:lineRule="auto" w:after="40" w:before="40"/>
               <w:jc w:val="center"/>
             </w:pPr>
             <w:r>
@@ -4255,7 +4211,7 @@
           </w:tcPr>
           <w:p>
             <w:pPr>
-              <w:spacing w:line="240" w:lineRule="auto" w:after="80" w:before="80"/>
+              <w:spacing w:line="240" w:lineRule="auto" w:after="40" w:before="40"/>
               <w:jc w:val="center"/>
             </w:pPr>
             <w:r>
@@ -4274,7 +4230,7 @@
           </w:tcPr>
           <w:p>
             <w:pPr>
-              <w:spacing w:line="240" w:lineRule="auto" w:after="80" w:before="80"/>
+              <w:spacing w:line="240" w:lineRule="auto" w:after="40" w:before="40"/>
               <w:jc w:val="center"/>
             </w:pPr>
             <w:r>
@@ -4295,7 +4251,7 @@
           </w:tcPr>
           <w:p>
             <w:pPr>
-              <w:spacing w:line="240" w:lineRule="auto" w:after="80" w:before="80"/>
+              <w:spacing w:line="240" w:lineRule="auto" w:after="40" w:before="40"/>
             </w:pPr>
             <w:r>
               <w:rPr>
@@ -4313,7 +4269,7 @@
           </w:tcPr>
           <w:p>
             <w:pPr>
-              <w:spacing w:line="240" w:lineRule="auto" w:after="80" w:before="80"/>
+              <w:spacing w:line="240" w:lineRule="auto" w:after="40" w:before="40"/>
               <w:jc w:val="center"/>
             </w:pPr>
             <w:r>
@@ -4332,7 +4288,7 @@
           </w:tcPr>
           <w:p>
             <w:pPr>
-              <w:spacing w:line="240" w:lineRule="auto" w:after="80" w:before="80"/>
+              <w:spacing w:line="240" w:lineRule="auto" w:after="40" w:before="40"/>
               <w:jc w:val="center"/>
             </w:pPr>
             <w:r>
@@ -4351,7 +4307,7 @@
           </w:tcPr>
           <w:p>
             <w:pPr>
-              <w:spacing w:line="240" w:lineRule="auto" w:after="80" w:before="80"/>
+              <w:spacing w:line="240" w:lineRule="auto" w:after="40" w:before="40"/>
               <w:jc w:val="center"/>
             </w:pPr>
             <w:r>
@@ -4372,7 +4328,7 @@
           </w:tcPr>
           <w:p>
             <w:pPr>
-              <w:spacing w:line="240" w:lineRule="auto" w:after="80" w:before="80"/>
+              <w:spacing w:line="240" w:lineRule="auto" w:after="40" w:before="40"/>
             </w:pPr>
             <w:r>
               <w:rPr>
@@ -4390,7 +4346,7 @@
           </w:tcPr>
           <w:p>
             <w:pPr>
-              <w:spacing w:line="240" w:lineRule="auto" w:after="80" w:before="80"/>
+              <w:spacing w:line="240" w:lineRule="auto" w:after="40" w:before="40"/>
               <w:jc w:val="center"/>
             </w:pPr>
             <w:r>
@@ -4409,7 +4365,7 @@
           </w:tcPr>
           <w:p>
             <w:pPr>
-              <w:spacing w:line="240" w:lineRule="auto" w:after="80" w:before="80"/>
+              <w:spacing w:line="240" w:lineRule="auto" w:after="40" w:before="40"/>
               <w:jc w:val="center"/>
             </w:pPr>
             <w:r>
@@ -4428,7 +4384,7 @@
           </w:tcPr>
           <w:p>
             <w:pPr>
-              <w:spacing w:line="240" w:lineRule="auto" w:after="80" w:before="80"/>
+              <w:spacing w:line="240" w:lineRule="auto" w:after="40" w:before="40"/>
               <w:jc w:val="center"/>
             </w:pPr>
             <w:r>
@@ -4449,7 +4405,7 @@
           </w:tcPr>
           <w:p>
             <w:pPr>
-              <w:spacing w:line="240" w:lineRule="auto" w:after="80" w:before="80"/>
+              <w:spacing w:line="240" w:lineRule="auto" w:after="40" w:before="40"/>
             </w:pPr>
             <w:r>
               <w:rPr>
@@ -4467,7 +4423,7 @@
           </w:tcPr>
           <w:p>
             <w:pPr>
-              <w:spacing w:line="240" w:lineRule="auto" w:after="80" w:before="80"/>
+              <w:spacing w:line="240" w:lineRule="auto" w:after="40" w:before="40"/>
               <w:jc w:val="center"/>
             </w:pPr>
             <w:r>
@@ -4486,7 +4442,7 @@
           </w:tcPr>
           <w:p>
             <w:pPr>
-              <w:spacing w:line="240" w:lineRule="auto" w:after="80" w:before="80"/>
+              <w:spacing w:line="240" w:lineRule="auto" w:after="40" w:before="40"/>
               <w:jc w:val="center"/>
             </w:pPr>
             <w:r>
@@ -4505,7 +4461,7 @@
           </w:tcPr>
           <w:p>
             <w:pPr>
-              <w:spacing w:line="240" w:lineRule="auto" w:after="80" w:before="80"/>
+              <w:spacing w:line="240" w:lineRule="auto" w:after="40" w:before="40"/>
               <w:jc w:val="center"/>
             </w:pPr>
             <w:r>
@@ -4526,7 +4482,7 @@
           </w:tcPr>
           <w:p>
             <w:pPr>
-              <w:spacing w:line="240" w:lineRule="auto" w:after="80" w:before="80"/>
+              <w:spacing w:line="240" w:lineRule="auto" w:after="40" w:before="40"/>
             </w:pPr>
             <w:r>
               <w:rPr>
@@ -4544,7 +4500,7 @@
           </w:tcPr>
           <w:p>
             <w:pPr>
-              <w:spacing w:line="240" w:lineRule="auto" w:after="80" w:before="80"/>
+              <w:spacing w:line="240" w:lineRule="auto" w:after="40" w:before="40"/>
               <w:jc w:val="center"/>
             </w:pPr>
             <w:r>
@@ -4563,7 +4519,7 @@
           </w:tcPr>
           <w:p>
             <w:pPr>
-              <w:spacing w:line="240" w:lineRule="auto" w:after="80" w:before="80"/>
+              <w:spacing w:line="240" w:lineRule="auto" w:after="40" w:before="40"/>
               <w:jc w:val="center"/>
             </w:pPr>
             <w:r>
@@ -4582,7 +4538,7 @@
           </w:tcPr>
           <w:p>
             <w:pPr>
-              <w:spacing w:line="240" w:lineRule="auto" w:after="80" w:before="80"/>
+              <w:spacing w:line="240" w:lineRule="auto" w:after="40" w:before="40"/>
               <w:jc w:val="center"/>
             </w:pPr>
             <w:r>
@@ -4603,7 +4559,7 @@
           </w:tcPr>
           <w:p>
             <w:pPr>
-              <w:spacing w:line="240" w:lineRule="auto" w:after="80" w:before="80"/>
+              <w:spacing w:line="240" w:lineRule="auto" w:after="40" w:before="40"/>
             </w:pPr>
             <w:r>
               <w:rPr>
@@ -4621,7 +4577,7 @@
           </w:tcPr>
           <w:p>
             <w:pPr>
-              <w:spacing w:line="240" w:lineRule="auto" w:after="80" w:before="80"/>
+              <w:spacing w:line="240" w:lineRule="auto" w:after="40" w:before="40"/>
               <w:jc w:val="center"/>
             </w:pPr>
             <w:r>
@@ -4640,7 +4596,7 @@
           </w:tcPr>
           <w:p>
             <w:pPr>
-              <w:spacing w:line="240" w:lineRule="auto" w:after="80" w:before="80"/>
+              <w:spacing w:line="240" w:lineRule="auto" w:after="40" w:before="40"/>
               <w:jc w:val="center"/>
             </w:pPr>
             <w:r>
@@ -4659,7 +4615,7 @@
           </w:tcPr>
           <w:p>
             <w:pPr>
-              <w:spacing w:line="240" w:lineRule="auto" w:after="80" w:before="80"/>
+              <w:spacing w:line="240" w:lineRule="auto" w:after="40" w:before="40"/>
               <w:jc w:val="center"/>
             </w:pPr>
             <w:r>
@@ -4680,7 +4636,7 @@
           </w:tcPr>
           <w:p>
             <w:pPr>
-              <w:spacing w:line="240" w:lineRule="auto" w:after="80" w:before="80"/>
+              <w:spacing w:line="240" w:lineRule="auto" w:after="40" w:before="40"/>
             </w:pPr>
             <w:r>
               <w:rPr>
@@ -4698,7 +4654,7 @@
           </w:tcPr>
           <w:p>
             <w:pPr>
-              <w:spacing w:line="240" w:lineRule="auto" w:after="80" w:before="80"/>
+              <w:spacing w:line="240" w:lineRule="auto" w:after="40" w:before="40"/>
               <w:jc w:val="center"/>
             </w:pPr>
             <w:r>
@@ -4717,7 +4673,7 @@
           </w:tcPr>
           <w:p>
             <w:pPr>
-              <w:spacing w:line="240" w:lineRule="auto" w:after="80" w:before="80"/>
+              <w:spacing w:line="240" w:lineRule="auto" w:after="40" w:before="40"/>
               <w:jc w:val="center"/>
             </w:pPr>
             <w:r>
@@ -4736,7 +4692,7 @@
           </w:tcPr>
           <w:p>
             <w:pPr>
-              <w:spacing w:line="240" w:lineRule="auto" w:after="80" w:before="80"/>
+              <w:spacing w:line="240" w:lineRule="auto" w:after="40" w:before="40"/>
               <w:jc w:val="center"/>
             </w:pPr>
             <w:r>
@@ -4757,7 +4713,7 @@
           </w:tcPr>
           <w:p>
             <w:pPr>
-              <w:spacing w:line="240" w:lineRule="auto" w:after="80" w:before="80"/>
+              <w:spacing w:line="240" w:lineRule="auto" w:after="40" w:before="40"/>
             </w:pPr>
             <w:r>
               <w:rPr>
@@ -4775,7 +4731,7 @@
           </w:tcPr>
           <w:p>
             <w:pPr>
-              <w:spacing w:line="240" w:lineRule="auto" w:after="80" w:before="80"/>
+              <w:spacing w:line="240" w:lineRule="auto" w:after="40" w:before="40"/>
               <w:jc w:val="center"/>
             </w:pPr>
             <w:r>
@@ -4794,7 +4750,7 @@
           </w:tcPr>
           <w:p>
             <w:pPr>
-              <w:spacing w:line="240" w:lineRule="auto" w:after="80" w:before="80"/>
+              <w:spacing w:line="240" w:lineRule="auto" w:after="40" w:before="40"/>
               <w:jc w:val="center"/>
             </w:pPr>
             <w:r>
@@ -4813,7 +4769,7 @@
           </w:tcPr>
           <w:p>
             <w:pPr>
-              <w:spacing w:line="240" w:lineRule="auto" w:after="80" w:before="80"/>
+              <w:spacing w:line="240" w:lineRule="auto" w:after="40" w:before="40"/>
               <w:jc w:val="center"/>
             </w:pPr>
             <w:r>
@@ -4827,10 +4783,20 @@
         </w:tc>
       </w:tr>
     </w:tbl>
-    <w:p/>
+    <w:p>
+      <w:pPr>
+        <w:spacing w:line="276" w:lineRule="auto" w:after="120"/>
+      </w:pPr>
+      <w:r>
+        <w:rPr>
+          <w:sz w:val="18"/>
+        </w:rPr>
+        <w:t>Survey-weighted modified Poisson regression with ten income imputations; all models include the same 6,777 survivors (1,117 with a barrier). Model 1 adjusts for survey year, age (spline), sex, race and Hispanic origin, and region. Model 2 adds education, family income, and insurance. Model 3 adds hypertension, diabetes, coronary heart disease, smoking, self-rated health, and disability. The age-group estimate is from a parallel model that replaces the age spline with an age-group indicator. Private coverage (with or without public coverage) is the reference for insurance. A dash indicates that the variable was not in the model. FPL indicates federal poverty level; GED, General Educational Development; PR, prevalence ratio. Complete Model 3 estimates are given in Table S5.</w:t>
+      </w:r>
+    </w:p>
     <w:p>
       <w:r>
-        <w:t>All models include 6,777 records and 1,117 events. Model 1: categorical year, age spline, sex, race/Hispanic origin, region. Model 2 adds education, income, insurance. Model 3 adds hypertension, diabetes, coronary disease, smoking, self-rated health, disability. Age-group estimates substitute age group for the spline in separate models. Private coverage is the reference for insurance. A dash indicates the variable was not included; it does not indicate a null association. Full Model 3 coefficients are in Table S5.</w:t>
+        <w:br w:type="page"/>
       </w:r>
     </w:p>
     <w:p>
@@ -4838,15 +4804,45 @@
         <w:pStyle w:val="Heading1"/>
       </w:pPr>
       <w:r>
-        <w:t>Figures and legends</w:t>
+        <w:t>Figure Legends</w:t>
+      </w:r>
+    </w:p>
+    <w:p>
+      <w:r>
+        <w:rPr>
+          <w:b/>
+        </w:rPr>
+        <w:t>Figure 1. Cost-related barriers among US stroke survivors, 2019–2025.</w:t>
+      </w:r>
+      <w:r>
+        <w:t xml:space="preserve"> (A) Annual prevalence of any cost-related barrier, observed with annual survey weights (blue circles) and standardized to the pooled covariate distribution from the fully adjusted logistic model (orange triangles). (B) Pooled prevalence of the composite outcome and each component barrier. Medication underuse is estimated among survivors prescribed medication in the past 12 months. Error bars are 95% confidence intervals.</w:t>
+      </w:r>
+    </w:p>
+    <w:p>
+      <w:r>
+        <w:rPr>
+          <w:b/>
+        </w:rPr>
+        <w:t>Figure 2. Distribution of cost-related barriers by survivor characteristics.</w:t>
+      </w:r>
+      <w:r>
+        <w:t xml:space="preserve"> (A) Unadjusted pooled prevalence of any cost-related barrier within groups defined by age, family income, insurance coverage, and disability. (B) Fully adjusted prevalence ratios (Model 3) from survey-weighted modified Poisson regression incorporating ten income imputations; the age contrast is from the parallel model that replaces the age spline with an age-group indicator. Reference groups are age 65 years and older, income 400% or more of the federal poverty level (FPL), private insurance, and no disability. Error bars are 95% confidence intervals; the dashed line marks a prevalence ratio of 1.</w:t>
+      </w:r>
+    </w:p>
+    <w:p>
+      <w:r>
+        <w:br w:type="page"/>
       </w:r>
     </w:p>
     <w:p>
       <w:pPr>
-        <w:pStyle w:val="Heading2"/>
+        <w:spacing w:line="276" w:lineRule="auto"/>
       </w:pPr>
       <w:r>
-        <w:t>Figure 1 Annual observed and standardized prevalence</w:t>
+        <w:rPr>
+          <w:b/>
+        </w:rPr>
+        <w:t>Figure 1</w:t>
       </w:r>
     </w:p>
     <w:p>
@@ -4856,7 +4852,7 @@
       <w:r>
         <w:drawing>
           <wp:inline xmlns:a="http://schemas.openxmlformats.org/drawingml/2006/main" xmlns:pic="http://schemas.openxmlformats.org/drawingml/2006/picture">
-            <wp:extent cx="5943600" cy="3714750"/>
+            <wp:extent cx="5943600" cy="2849671"/>
             <wp:docPr id="1" name="Picture 1"/>
             <wp:cNvGraphicFramePr>
               <a:graphicFrameLocks noChangeAspect="1"/>
@@ -4869,7 +4865,7 @@
                     <pic:cNvPicPr/>
                   </pic:nvPicPr>
                   <pic:blipFill>
-                    <a:blip r:embed="rId23"/>
+                    <a:blip r:embed="rId10"/>
                     <a:stretch>
                       <a:fillRect/>
                     </a:stretch>
@@ -4877,7 +4873,7 @@
                   <pic:spPr>
                     <a:xfrm>
                       <a:off x="0" y="0"/>
-                      <a:ext cx="5943600" cy="3714750"/>
+                      <a:ext cx="5943600" cy="2849671"/>
                     </a:xfrm>
                     <a:prstGeom prst="rect"/>
                   </pic:spPr>
@@ -4890,15 +4886,18 @@
     </w:p>
     <w:p>
       <w:r>
-        <w:t>Points and bars show estimates and 95% confidence intervals. Observed annual estimates use full annual samples and weights. Standardized estimates use logistic models in the pooled complete-case sample, the 2020 partial-sample weights, ten income imputations, and the pooled covariate distribution. The two series therefore differ in population composition and estimation method as well as adjustment. The outcome combines cost-related care delay, forgone care, forgone prescriptions, and medication underuse among prescription users.</w:t>
+        <w:br w:type="page"/>
       </w:r>
     </w:p>
     <w:p>
       <w:pPr>
-        <w:pStyle w:val="Heading2"/>
+        <w:spacing w:line="276" w:lineRule="auto"/>
       </w:pPr>
       <w:r>
-        <w:t>Figure 2 Adjusted prevalence ratios for selected survivor characteristics</w:t>
+        <w:rPr>
+          <w:b/>
+        </w:rPr>
+        <w:t>Figure 2</w:t>
       </w:r>
     </w:p>
     <w:p>
@@ -4908,7 +4907,7 @@
       <w:r>
         <w:drawing>
           <wp:inline xmlns:a="http://schemas.openxmlformats.org/drawingml/2006/main" xmlns:pic="http://schemas.openxmlformats.org/drawingml/2006/picture">
-            <wp:extent cx="5943600" cy="3566160"/>
+            <wp:extent cx="5943600" cy="3745282"/>
             <wp:docPr id="2" name="Picture 2"/>
             <wp:cNvGraphicFramePr>
               <a:graphicFrameLocks noChangeAspect="1"/>
@@ -4921,7 +4920,7 @@
                     <pic:cNvPicPr/>
                   </pic:nvPicPr>
                   <pic:blipFill>
-                    <a:blip r:embed="rId24"/>
+                    <a:blip r:embed="rId11"/>
                     <a:stretch>
                       <a:fillRect/>
                     </a:stretch>
@@ -4929,7 +4928,7 @@
                   <pic:spPr>
                     <a:xfrm>
                       <a:off x="0" y="0"/>
-                      <a:ext cx="5943600" cy="3566160"/>
+                      <a:ext cx="5943600" cy="3745282"/>
                     </a:xfrm>
                     <a:prstGeom prst="rect"/>
                   </pic:spPr>
@@ -4940,17 +4939,13 @@
         </w:drawing>
       </w:r>
     </w:p>
-    <w:p>
-      <w:r>
-        <w:t>Estimates are from the fully adjusted survey-weighted modified Poisson model and ten income imputations. The age contrast comes from a separate model replacing the age spline with age group. Other contrasts use the spline-age model. Bars are 95% confidence intervals; the dashed line indicates a PR of one. Private coverage includes concurrent public coverage. FPL indicates federal poverty level. These are descriptive associations, not estimated effects of interventions.</w:t>
-      </w:r>
-    </w:p>
     <w:sectPr>
       <w:footerReference w:type="default" r:id="rId9"/>
       <w:pgSz w:w="12240" w:h="15840"/>
       <w:pgMar w:top="1440" w:right="1440" w:bottom="1440" w:left="1440" w:header="720" w:footer="720" w:gutter="0"/>
       <w:cols w:space="720"/>
       <w:docGrid w:linePitch="360"/>
+      <w:lnNumType w:countBy="1" w:restart="continuous" w:distance="360"/>
     </w:sectPr>
   </w:body>
 </w:document>
@@ -4963,9 +4958,6 @@
       <w:pStyle w:val="Footer"/>
       <w:jc w:val="center"/>
     </w:pPr>
-    <w:r>
-      <w:t xml:space="preserve">Working draft  |  </w:t>
-    </w:r>
     <w:fldSimple w:instr="PAGE"/>
   </w:p>
 </w:ftr>
@@ -5335,12 +5327,12 @@
     <w:qFormat/>
     <w:rsid w:val="00FC693F"/>
     <w:pPr>
-      <w:spacing w:line="276" w:lineRule="auto" w:after="120"/>
+      <w:spacing w:line="480" w:lineRule="auto" w:after="0"/>
     </w:pPr>
     <w:rPr>
-      <w:rFonts w:ascii="Times New Roman" w:hAnsi="Times New Roman"/>
+      <w:rFonts w:ascii="Times New Roman" w:hAnsi="Times New Roman" w:eastAsia="Times New Roman" w:cs="Times New Roman"/>
       <w:color w:val="000000"/>
-      <w:sz w:val="22"/>
+      <w:sz w:val="24"/>
     </w:rPr>
   </w:style>
   <w:style w:type="paragraph" w:styleId="Header">
@@ -5398,15 +5390,16 @@
     <w:pPr>
       <w:keepNext/>
       <w:keepLines/>
-      <w:spacing w:before="480" w:after="0"/>
+      <w:spacing w:before="240" w:after="0" w:line="480" w:lineRule="auto"/>
       <w:outlineLvl w:val="0"/>
     </w:pPr>
     <w:rPr>
-      <w:rFonts w:asciiTheme="majorHAnsi" w:eastAsiaTheme="majorEastAsia" w:hAnsiTheme="majorHAnsi" w:cstheme="majorBidi" w:ascii="Times New Roman" w:hAnsi="Times New Roman"/>
+      <w:rFonts w:asciiTheme="majorHAnsi" w:eastAsiaTheme="majorEastAsia" w:hAnsiTheme="majorHAnsi" w:cstheme="majorBidi" w:ascii="Times New Roman" w:hAnsi="Times New Roman" w:eastAsia="Times New Roman" w:cs="Times New Roman"/>
       <w:b/>
       <w:bCs/>
+      <w:i w:val="0"/>
       <w:color w:val="000000"/>
-      <w:sz w:val="28"/>
+      <w:sz w:val="24"/>
       <w:szCs w:val="28"/>
     </w:rPr>
   </w:style>
@@ -5422,13 +5415,14 @@
     <w:pPr>
       <w:keepNext/>
       <w:keepLines/>
-      <w:spacing w:before="200" w:after="0"/>
+      <w:spacing w:before="240" w:after="0" w:line="480" w:lineRule="auto"/>
       <w:outlineLvl w:val="1"/>
     </w:pPr>
     <w:rPr>
-      <w:rFonts w:asciiTheme="majorHAnsi" w:eastAsiaTheme="majorEastAsia" w:hAnsiTheme="majorHAnsi" w:cstheme="majorBidi" w:ascii="Times New Roman" w:hAnsi="Times New Roman"/>
+      <w:rFonts w:asciiTheme="majorHAnsi" w:eastAsiaTheme="majorEastAsia" w:hAnsiTheme="majorHAnsi" w:cstheme="majorBidi" w:ascii="Times New Roman" w:hAnsi="Times New Roman" w:eastAsia="Times New Roman" w:cs="Times New Roman"/>
       <w:b/>
       <w:bCs/>
+      <w:i/>
       <w:color w:val="000000"/>
       <w:sz w:val="24"/>
       <w:szCs w:val="26"/>
@@ -5446,15 +5440,16 @@
     <w:pPr>
       <w:keepNext/>
       <w:keepLines/>
-      <w:spacing w:before="200" w:after="0"/>
+      <w:spacing w:before="240" w:after="0" w:line="480" w:lineRule="auto"/>
       <w:outlineLvl w:val="2"/>
     </w:pPr>
     <w:rPr>
-      <w:rFonts w:asciiTheme="majorHAnsi" w:eastAsiaTheme="majorEastAsia" w:hAnsiTheme="majorHAnsi" w:cstheme="majorBidi" w:ascii="Times New Roman" w:hAnsi="Times New Roman"/>
+      <w:rFonts w:asciiTheme="majorHAnsi" w:eastAsiaTheme="majorEastAsia" w:hAnsiTheme="majorHAnsi" w:cstheme="majorBidi" w:ascii="Times New Roman" w:hAnsi="Times New Roman" w:eastAsia="Times New Roman" w:cs="Times New Roman"/>
       <w:b/>
       <w:bCs/>
+      <w:i/>
       <w:color w:val="000000"/>
-      <w:sz w:val="22"/>
+      <w:sz w:val="24"/>
     </w:rPr>
   </w:style>
   <w:style w:type="paragraph" w:styleId="Heading4">
@@ -5685,18 +5680,17 @@
     <w:qFormat/>
     <w:rsid w:val="00FC693F"/>
     <w:pPr>
-      <w:pBdr>
-        <w:bottom w:val="single" w:sz="8" w:space="4" w:color="4F81BD" w:themeColor="accent1"/>
-      </w:pBdr>
-      <w:spacing w:after="300" w:line="240" w:lineRule="auto"/>
+      <w:spacing w:after="240" w:line="276" w:lineRule="auto"/>
       <w:contextualSpacing/>
+      <w:jc w:val="center"/>
     </w:pPr>
     <w:rPr>
-      <w:rFonts w:asciiTheme="majorHAnsi" w:eastAsiaTheme="majorEastAsia" w:hAnsiTheme="majorHAnsi" w:cstheme="majorBidi" w:ascii="Times New Roman" w:hAnsi="Times New Roman"/>
+      <w:rFonts w:asciiTheme="majorHAnsi" w:eastAsiaTheme="majorEastAsia" w:hAnsiTheme="majorHAnsi" w:cstheme="majorBidi" w:ascii="Times New Roman" w:hAnsi="Times New Roman" w:eastAsia="Times New Roman" w:cs="Times New Roman"/>
+      <w:b/>
       <w:color w:val="000000"/>
       <w:spacing w:val="5"/>
       <w:kern w:val="28"/>
-      <w:sz w:val="36"/>
+      <w:sz w:val="28"/>
       <w:szCs w:val="52"/>
     </w:rPr>
   </w:style>
@@ -5729,10 +5723,10 @@
       </w:numPr>
     </w:pPr>
     <w:rPr>
-      <w:rFonts w:asciiTheme="majorHAnsi" w:eastAsiaTheme="majorEastAsia" w:hAnsiTheme="majorHAnsi" w:cstheme="majorBidi" w:ascii="Times New Roman" w:hAnsi="Times New Roman"/>
+      <w:rFonts w:asciiTheme="majorHAnsi" w:eastAsiaTheme="majorEastAsia" w:hAnsiTheme="majorHAnsi" w:cstheme="majorBidi"/>
       <w:i/>
       <w:iCs/>
-      <w:color w:val="000000"/>
+      <w:color w:val="4F81BD" w:themeColor="accent1"/>
       <w:spacing w:val="15"/>
       <w:sz w:val="24"/>
       <w:szCs w:val="24"/>

</xml_diff>

<commit_message>
Format manuscript to Stroke (AHA) author instructions
Section order and end matter per AHA, Non-standard Abbreviations list,
data availability and full-access statement in Methods, AHA reference
style, journal table rules, figures with legends on their own pages,
no line numbers, and a 7 x 7 in graphic abstract.

Co-Authored-By: Claude Fable 5.1 <noreply@anthropic.com>
</commit_message>
<xml_diff>
--- a/manuscript/manuscript.docx
+++ b/manuscript/manuscript.docx
@@ -113,17 +113,13 @@
         <w:spacing w:line="276" w:lineRule="auto" w:after="160"/>
       </w:pPr>
       <w:r>
-        <w:t>Word count: abstract, 284; main text, 2,840. References: 15. Tables: 3. Figures: 2. Supplementary material: Supplementary Methods, Tables S1–S12, Figure S1.</w:t>
-      </w:r>
-    </w:p>
-    <w:p>
-      <w:r>
-        <w:br w:type="page"/>
+        <w:t>Total word count: 5,028 (title page, abstract, text, references, tables, and figure legends). Main text: 2,908 words. Abstract: 284 words. Tables: 3. Figures: 2.</w:t>
       </w:r>
     </w:p>
     <w:p>
       <w:pPr>
         <w:pStyle w:val="Heading1"/>
+        <w:pageBreakBefore/>
       </w:pPr>
       <w:r>
         <w:t>Abstract</w:t>
@@ -174,13 +170,22 @@
       </w:r>
     </w:p>
     <w:p>
+      <w:pPr>
+        <w:pStyle w:val="Heading1"/>
+      </w:pPr>
       <w:r>
-        <w:br w:type="page"/>
+        <w:t>Non-standard Abbreviations and Acronyms</w:t>
+      </w:r>
+    </w:p>
+    <w:p>
+      <w:r>
+        <w:t>FPL, federal poverty level; NCHS, National Center for Health Statistics; NHIS, National Health Interview Survey; PR, prevalence ratio; STROBE, Strengthening the Reporting of Observational Studies in Epidemiology</w:t>
       </w:r>
     </w:p>
     <w:p>
       <w:pPr>
         <w:pStyle w:val="Heading1"/>
+        <w:pageBreakBefore/>
       </w:pPr>
       <w:r>
         <w:t>Introduction</w:t>
@@ -219,6 +224,19 @@
         <w:pStyle w:val="Heading2"/>
       </w:pPr>
       <w:r>
+        <w:t>Data Availability</w:t>
+      </w:r>
+    </w:p>
+    <w:p>
+      <w:r>
+        <w:t>NHIS public-use files and documentation are available from NCHS; no agency endorsement is implied. All acquisition, analysis, verification, and manuscript-generation code, source file hashes, aggregate results, tables, and figures are publicly available at https://github.com/blakepi/nhis-stroke-affordability (release v1.1.0). One author (G.B.P.) had full access to all the data in the study and takes responsibility for its integrity and the data analysis.</w:t>
+      </w:r>
+    </w:p>
+    <w:p>
+      <w:pPr>
+        <w:pStyle w:val="Heading2"/>
+      </w:pPr>
+      <w:r>
         <w:t>Data source and study population</w:t>
       </w:r>
     </w:p>
@@ -229,7 +247,7 @@
     </w:p>
     <w:p>
       <w:r>
-        <w:t>Annual estimates used each year's full Sample Adult file and its annual weight. Because the 2020 survey re-interviewed a subset of 2019 respondents, pooled analyses followed NCHS guidance for combining 2020 with other years: the follow-back respondents were omitted, and the remaining 2020 records were assigned the partial-sample weight.[9] Weights were divided by seven to represent an average annual population. The public-use stratum and primary sampling unit identifiers were used without modification, consistent with NCHS instructions for pooling survey years from 2019 onward.[8] Survey designs were specified on the full adult files before restricting analyses to the stroke-survivor domain, preserving the design structure for variance estimation. Because NHIS uses publicly available, de-identified data, this study did not require institutional review.</w:t>
+        <w:t>Annual estimates used each year's full Sample Adult file and its annual weight. Because the 2020 survey re-interviewed a subset of 2019 respondents, pooled analyses followed NCHS guidance for combining 2020 with other years: the follow-back respondents were omitted, and the remaining 2020 records were assigned the partial-sample weight.[9] Weights were divided by seven to represent an average annual population. The public-use stratum and primary sampling unit identifiers were used without modification, consistent with NCHS instructions for pooling survey years from 2019 onward.[8] Survey designs were specified on the full adult files before restricting analyses to the stroke-survivor domain, preserving the design structure for variance estimation. Because NHIS data are publicly available and de-identified, this study did not require institutional review board approval or informed consent.</w:t>
       </w:r>
     </w:p>
     <w:p>
@@ -430,67 +448,12 @@
         <w:pStyle w:val="Heading1"/>
       </w:pPr>
       <w:r>
-        <w:t>Declarations</w:t>
+        <w:t>Acknowledgments</w:t>
       </w:r>
     </w:p>
     <w:p>
       <w:r>
-        <w:rPr>
-          <w:b/>
-        </w:rPr>
-        <w:t>Ethics and consent:</w:t>
-      </w:r>
-      <w:r>
-        <w:t xml:space="preserve"> This secondary analysis used publicly available, de-identified NHIS files released by NCHS. No participants were recruited, no new consent was obtained, and institutional review was not required.</w:t>
-      </w:r>
-    </w:p>
-    <w:p>
-      <w:r>
-        <w:rPr>
-          <w:b/>
-        </w:rPr>
-        <w:t>Competing interests:</w:t>
-      </w:r>
-      <w:r>
-        <w:t xml:space="preserve"> The authors declare no competing interests.</w:t>
-      </w:r>
-    </w:p>
-    <w:p>
-      <w:r>
-        <w:rPr>
-          <w:b/>
-        </w:rPr>
-        <w:t>Author contributions:</w:t>
-      </w:r>
-      <w:r>
-        <w:t xml:space="preserve"> G. Blake Pierpoint: Resources; Software; Supervision; Validation; Visualization; Writing – original draft; Writing – review &amp; editing; Investigation; Methodology; Data curation; Formal analysis. Alberto E. Musto: Conceptualization; Supervision; Validation; Investigation; Methodology; Project administration; Writing – review &amp; editing; Data curation; Formal analysis.</w:t>
-      </w:r>
-    </w:p>
-    <w:p>
-      <w:r>
-        <w:rPr>
-          <w:b/>
-        </w:rPr>
-        <w:t>Data and code availability:</w:t>
-      </w:r>
-      <w:r>
-        <w:t xml:space="preserve"> NHIS public-use files and documentation are available from NCHS; no agency endorsement is implied. All acquisition, analysis, verification, and manuscript-generation code, source file hashes, aggregate results, tables, and figures are publicly available at https://github.com/blakepi/nhis-stroke-affordability (release v1.1.0).</w:t>
-      </w:r>
-    </w:p>
-    <w:p>
-      <w:r>
-        <w:rPr>
-          <w:b/>
-        </w:rPr>
-        <w:t>Use of artificial intelligence:</w:t>
-      </w:r>
-      <w:r>
-        <w:t xml:space="preserve"> Generative artificial intelligence tools were used to assist with statistical programming, numerical verification, and drafting of text. The authors reviewed and edited all content and take full responsibility for the manuscript.</w:t>
-      </w:r>
-    </w:p>
-    <w:p>
-      <w:r>
-        <w:br w:type="page"/>
+        <w:t>Generative artificial intelligence tools were used to assist with statistical programming, numerical verification, and drafting of text. The authors reviewed and edited all content and take full responsibility for the manuscript.</w:t>
       </w:r>
     </w:p>
     <w:p>
@@ -498,32 +461,82 @@
         <w:pStyle w:val="Heading1"/>
       </w:pPr>
       <w:r>
+        <w:t>Sources of Funding</w:t>
+      </w:r>
+    </w:p>
+    <w:p>
+      <w:r>
+        <w:t>None.</w:t>
+      </w:r>
+    </w:p>
+    <w:p>
+      <w:pPr>
+        <w:pStyle w:val="Heading1"/>
+      </w:pPr>
+      <w:r>
+        <w:t>Disclosures</w:t>
+      </w:r>
+    </w:p>
+    <w:p>
+      <w:r>
+        <w:t>None.</w:t>
+      </w:r>
+    </w:p>
+    <w:p>
+      <w:pPr>
+        <w:pStyle w:val="Heading1"/>
+      </w:pPr>
+      <w:r>
+        <w:t>Supplemental Material</w:t>
+      </w:r>
+    </w:p>
+    <w:p>
+      <w:r>
+        <w:t>Supplemental Methods</w:t>
+      </w:r>
+    </w:p>
+    <w:p>
+      <w:r>
+        <w:t>Figure S1</w:t>
+      </w:r>
+    </w:p>
+    <w:p>
+      <w:r>
+        <w:t>Tables S1–S12</w:t>
+      </w:r>
+    </w:p>
+    <w:p>
+      <w:pPr>
+        <w:pStyle w:val="Heading1"/>
+        <w:pageBreakBefore/>
+      </w:pPr>
+      <w:r>
         <w:t>References</w:t>
       </w:r>
     </w:p>
     <w:p>
       <w:r>
-        <w:t>1. Palaniappan LP, Allen NB, Almarzooq ZI, et al. 2026 Heart Disease and Stroke Statistics: A Report of US and Global Data From the American Heart Association. Circulation. 2026;153(9):e275-e906. doi:10.1161/CIR.0000000000001412</w:t>
+        <w:t>1. Palaniappan LP, Allen NB, Almarzooq ZI, et al. 2026 Heart Disease and Stroke Statistics: A Report of US and Global Data From the American Heart Association. Circulation. 2026;153:e275–e906. doi:10.1161/CIR.0000000000001412</w:t>
       </w:r>
     </w:p>
     <w:p>
       <w:r>
-        <w:t>2. Kleindorfer DO, Towfighi A, Chaturvedi S, et al. 2021 Guideline for the Prevention of Stroke in Patients With Stroke and Transient Ischemic Attack. Stroke. 2021;52(7):e364-e467. doi:10.1161/STR.0000000000000375</w:t>
+        <w:t>2. Kleindorfer DO, Towfighi A, Chaturvedi S, Cockroft KM, Gutierrez J, Lombardi-Hill D, Kamel H, Kernan WN, Kittner SJ, Leira EC, et al. 2021 Guideline for the Prevention of Stroke in Patients With Stroke and Transient Ischemic Attack: A Guideline From the American Heart Association/American Stroke Association. Stroke. 2021;52:e364–e467. doi:10.1161/STR.0000000000000375</w:t>
       </w:r>
     </w:p>
     <w:p>
       <w:r>
-        <w:t>3. Levine DA, Kiefe CI, Houston TK, Allison JJ, McCarthy EP, Ayanian JZ. Younger stroke survivors have reduced access to physician care and medications: National Health Interview Survey from years 1998 to 2002. Arch Neurol. 2007;64(1):37-42. doi:10.1001/archneur.64.1.noc60002</w:t>
+        <w:t>3. Levine DA, Kiefe CI, Houston TK, Allison JJ, McCarthy EP, Ayanian JZ. Younger stroke survivors have reduced access to physician care and medications: National Health Interview Survey from years 1998 to 2002. Arch Neurol. 2007;64:37–42. doi:10.1001/archneur.64.1.noc60002</w:t>
       </w:r>
     </w:p>
     <w:p>
       <w:r>
-        <w:t>4. Levine DA, Morgenstern LB, Langa KM, Piette JD, Rogers MAM, Karve SJ. Recent trends in cost-related medication nonadherence among stroke survivors in the United States. Ann Neurol. 2013;73(2):180-188. doi:10.1002/ana.23823</w:t>
+        <w:t>4. Levine DA, Morgenstern LB, Langa KM, Piette JD, Rogers MAM, Karve SJ. Recent trends in cost-related medication nonadherence among stroke survivors in the United States. Ann Neurol. 2013;73:180–188. doi:10.1002/ana.23823</w:t>
       </w:r>
     </w:p>
     <w:p>
       <w:r>
-        <w:t>5. Springer MV, Skolarus LE, Patel M. Food Insecurity and Perceived Financial Stress are Associated with Cost-related Medication Non-adherence in Stroke. J Health Care Poor Underserved. 2023;34(2):625-639. doi:10.1353/hpu.2023.0054</w:t>
+        <w:t>5. Springer MV, Skolarus LE, Patel M. Food Insecurity and Perceived Financial Stress are Associated with Cost-related Medication Non-adherence in Stroke. J Health Care Poor Underserved. 2023;34:625–639. doi:10.1353/hpu.2023.0054</w:t>
       </w:r>
     </w:p>
     <w:p>
@@ -533,7 +546,7 @@
     </w:p>
     <w:p>
       <w:r>
-        <w:t>7. Amill-Rosario A, Slejko JF, dosReis S. Changes in cost-related nonadherence among US adults with multiple chronic conditions from 2019 to 2023. J Manag Care Spec Pharm. 2025;31(7):662-670. doi:10.18553/jmcp.2025.31.7.662</w:t>
+        <w:t>7. Amill-Rosario A, Slejko JF, dosReis S. Changes in cost-related nonadherence among US adults with multiple chronic conditions from 2019 to 2023. J Manag Care Spec Pharm. 2025;31:662–670. doi:10.18553/jmcp.2025.31.7.662</w:t>
       </w:r>
     </w:p>
     <w:p>
@@ -548,12 +561,12 @@
     </w:p>
     <w:p>
       <w:r>
-        <w:t>10. Lumley T. Analysis of Complex Survey Samples. J Stat Softw. 2004;9(8):1-19. doi:10.18637/jss.v009.i08</w:t>
+        <w:t>10. Lumley T. Analysis of Complex Survey Samples. J Stat Softw. 2004;9:1–19. doi:10.18637/jss.v009.i08</w:t>
       </w:r>
     </w:p>
     <w:p>
       <w:r>
-        <w:t>11. Parker JD, Talih M, Malec DJ, et al. National Center for Health Statistics Data Presentation Standards for Proportions. Vital Health Stat 2. 2017;(175):1-22.</w:t>
+        <w:t>11. Parker JD, Talih M, Malec DJ, et al. National Center for Health Statistics Data Presentation Standards for Proportions. Vital Health Stat 2. 2017;:1–22.</w:t>
       </w:r>
     </w:p>
     <w:p>
@@ -563,27 +576,23 @@
     </w:p>
     <w:p>
       <w:r>
-        <w:t>13. Zou G. A modified Poisson regression approach to prospective studies with binary data. Am J Epidemiol. 2004;159(7):702-706. doi:10.1093/aje/kwh090</w:t>
+        <w:t>13. Zou G. A modified Poisson regression approach to prospective studies with binary data. Am J Epidemiol. 2004;159:702–706. doi:10.1093/aje/kwh090</w:t>
       </w:r>
     </w:p>
     <w:p>
       <w:r>
-        <w:t>14. Graubard BI, Korn EL. Predictive Margins with Survey Data. Biometrics. 1999;55(2):652-659. doi:10.1111/j.0006-341X.1999.00652.x</w:t>
+        <w:t>14. Graubard BI, Korn EL. Predictive Margins with Survey Data. Biometrics. 1999;55:652–659. doi:10.1111/j.0006-341X.1999.00652.x</w:t>
       </w:r>
     </w:p>
     <w:p>
       <w:r>
-        <w:t>15. von Elm E, Altman DG, Egger M, Pocock SJ, Gøtzsche PC, Vandenbroucke JP, STROBE Initiative. The Strengthening the Reporting of Observational Studies in Epidemiology Statement Guidelines for Reporting Observational Studies. PLoS Med. 2007;4(10):e296. doi:10.1371/journal.pmed.0040296</w:t>
-      </w:r>
-    </w:p>
-    <w:p>
-      <w:r>
-        <w:br w:type="page"/>
+        <w:t>15. von Elm E, Altman DG, Egger M, Pocock SJ, Gøtzsche PC, Vandenbroucke JP, STROBE Initiative. The Strengthening the Reporting of Observational Studies in Epidemiology Statement Guidelines for Reporting Observational Studies. PLoS Med. 2007;4:e296. doi:10.1371/journal.pmed.0040296</w:t>
       </w:r>
     </w:p>
     <w:p>
       <w:pPr>
         <w:pStyle w:val="Heading1"/>
+        <w:pageBreakBefore/>
       </w:pPr>
       <w:r>
         <w:t>Tables</w:t>
@@ -613,10 +622,10 @@
         <w:tblBorders>
           <w:top w:val="single" w:sz="8" w:color="000000"/>
           <w:bottom w:val="single" w:sz="8" w:color="000000"/>
-          <w:insideH w:val="single" w:sz="4" w:color="BFBFBF"/>
-          <w:left w:val="nil"/>
-          <w:right w:val="nil"/>
-          <w:insideV w:val="nil"/>
+          <w:left w:val="nil"/>
+          <w:right w:val="nil"/>
+          <w:insideV w:val="nil"/>
+          <w:insideH w:val="nil"/>
         </w:tblBorders>
       </w:tblPr>
       <w:tblGrid>
@@ -2424,13 +2433,9 @@
       </w:r>
     </w:p>
     <w:p>
-      <w:r>
-        <w:br w:type="page"/>
-      </w:r>
-    </w:p>
-    <w:p>
       <w:pPr>
         <w:keepNext/>
+        <w:pageBreakBefore/>
         <w:spacing w:line="276" w:lineRule="auto" w:before="240" w:after="80"/>
       </w:pPr>
       <w:r>
@@ -2452,10 +2457,10 @@
         <w:tblBorders>
           <w:top w:val="single" w:sz="8" w:color="000000"/>
           <w:bottom w:val="single" w:sz="8" w:color="000000"/>
-          <w:insideH w:val="single" w:sz="4" w:color="BFBFBF"/>
-          <w:left w:val="nil"/>
-          <w:right w:val="nil"/>
-          <w:insideV w:val="nil"/>
+          <w:left w:val="nil"/>
+          <w:right w:val="nil"/>
+          <w:insideV w:val="nil"/>
+          <w:insideH w:val="nil"/>
         </w:tblBorders>
       </w:tblPr>
       <w:tblGrid>
@@ -3264,13 +3269,9 @@
       </w:r>
     </w:p>
     <w:p>
-      <w:r>
-        <w:br w:type="page"/>
-      </w:r>
-    </w:p>
-    <w:p>
       <w:pPr>
         <w:keepNext/>
+        <w:pageBreakBefore/>
         <w:spacing w:line="276" w:lineRule="auto" w:before="240" w:after="80"/>
       </w:pPr>
       <w:r>
@@ -3292,10 +3293,10 @@
         <w:tblBorders>
           <w:top w:val="single" w:sz="8" w:color="000000"/>
           <w:bottom w:val="single" w:sz="8" w:color="000000"/>
-          <w:insideH w:val="single" w:sz="4" w:color="BFBFBF"/>
-          <w:left w:val="nil"/>
-          <w:right w:val="nil"/>
-          <w:insideV w:val="nil"/>
+          <w:left w:val="nil"/>
+          <w:right w:val="nil"/>
+          <w:insideV w:val="nil"/>
+          <w:insideH w:val="nil"/>
         </w:tblBorders>
       </w:tblPr>
       <w:tblGrid>
@@ -4795,58 +4796,17 @@
       </w:r>
     </w:p>
     <w:p>
+      <w:pPr>
+        <w:pStyle w:val="Heading1"/>
+        <w:pageBreakBefore/>
+      </w:pPr>
       <w:r>
-        <w:br w:type="page"/>
+        <w:t>Figures</w:t>
       </w:r>
     </w:p>
     <w:p>
       <w:pPr>
-        <w:pStyle w:val="Heading1"/>
-      </w:pPr>
-      <w:r>
-        <w:t>Figure Legends</w:t>
-      </w:r>
-    </w:p>
-    <w:p>
-      <w:r>
-        <w:rPr>
-          <w:b/>
-        </w:rPr>
-        <w:t>Figure 1. Cost-related barriers among US stroke survivors, 2019–2025.</w:t>
-      </w:r>
-      <w:r>
-        <w:t xml:space="preserve"> (A) Annual prevalence of any cost-related barrier, observed with annual survey weights (blue circles) and standardized to the pooled covariate distribution from the fully adjusted logistic model (orange triangles). (B) Pooled prevalence of the composite outcome and each component barrier. Medication underuse is estimated among survivors prescribed medication in the past 12 months. Error bars are 95% confidence intervals.</w:t>
-      </w:r>
-    </w:p>
-    <w:p>
-      <w:r>
-        <w:rPr>
-          <w:b/>
-        </w:rPr>
-        <w:t>Figure 2. Distribution of cost-related barriers by survivor characteristics.</w:t>
-      </w:r>
-      <w:r>
-        <w:t xml:space="preserve"> (A) Unadjusted pooled prevalence of any cost-related barrier within groups defined by age, family income, insurance coverage, and disability. (B) Fully adjusted prevalence ratios (Model 3) from survey-weighted modified Poisson regression incorporating ten income imputations; the age contrast is from the parallel model that replaces the age spline with an age-group indicator. Reference groups are age 65 years and older, income 400% or more of the federal poverty level (FPL), private insurance, and no disability. Error bars are 95% confidence intervals; the dashed line marks a prevalence ratio of 1.</w:t>
-      </w:r>
-    </w:p>
-    <w:p>
-      <w:r>
-        <w:br w:type="page"/>
-      </w:r>
-    </w:p>
-    <w:p>
-      <w:pPr>
-        <w:spacing w:line="276" w:lineRule="auto"/>
-      </w:pPr>
-      <w:r>
-        <w:rPr>
-          <w:b/>
-        </w:rPr>
-        <w:t>Figure 1</w:t>
-      </w:r>
-    </w:p>
-    <w:p>
-      <w:pPr>
+        <w:keepNext/>
         <w:jc w:val="center"/>
       </w:pPr>
       <w:r>
@@ -4885,23 +4845,27 @@
       </w:r>
     </w:p>
     <w:p>
+      <w:pPr>
+        <w:spacing w:line="276" w:lineRule="auto" w:after="120"/>
+      </w:pPr>
       <w:r>
-        <w:br w:type="page"/>
+        <w:rPr>
+          <w:b/>
+          <w:sz w:val="18"/>
+        </w:rPr>
+        <w:t>Figure 1. Cost-related barriers among US stroke survivors, 2019–2025.</w:t>
+      </w:r>
+      <w:r>
+        <w:rPr>
+          <w:sz w:val="18"/>
+        </w:rPr>
+        <w:t xml:space="preserve"> (A) Annual prevalence of any cost-related barrier, observed with annual survey weights (blue circles) and standardized to the pooled covariate distribution from the fully adjusted logistic model (orange triangles). (B) Pooled prevalence of the composite outcome and each component barrier. Medication underuse is estimated among survivors prescribed medication in the past 12 months. Error bars are 95% CIs.</w:t>
       </w:r>
     </w:p>
     <w:p>
       <w:pPr>
-        <w:spacing w:line="276" w:lineRule="auto"/>
-      </w:pPr>
-      <w:r>
-        <w:rPr>
-          <w:b/>
-        </w:rPr>
-        <w:t>Figure 2</w:t>
-      </w:r>
-    </w:p>
-    <w:p>
-      <w:pPr>
+        <w:keepNext/>
+        <w:pageBreakBefore/>
         <w:jc w:val="center"/>
       </w:pPr>
       <w:r>
@@ -4939,11 +4903,30 @@
         </w:drawing>
       </w:r>
     </w:p>
+    <w:p>
+      <w:pPr>
+        <w:spacing w:line="276" w:lineRule="auto" w:after="120"/>
+      </w:pPr>
+      <w:r>
+        <w:rPr>
+          <w:b/>
+          <w:sz w:val="18"/>
+        </w:rPr>
+        <w:t>Figure 2. Distribution of cost-related barriers by survivor characteristics.</w:t>
+      </w:r>
+      <w:r>
+        <w:rPr>
+          <w:sz w:val="18"/>
+        </w:rPr>
+        <w:t xml:space="preserve"> (A) Unadjusted pooled prevalence of any cost-related barrier within groups defined by age, family income, insurance coverage, and disability. (B) Fully adjusted prevalence ratios (Model 3) from survey-weighted modified Poisson regression incorporating ten income imputations; the age contrast is from the parallel model that replaces the age spline with an age-group indicator. Reference groups are age 65 years and older, income 400% or more of the federal poverty level (FPL), private insurance, and no disability. Error bars are 95% CIs; the dashed line marks a prevalence ratio of 1. PR indicates prevalence ratio.</w:t>
+      </w:r>
+    </w:p>
     <w:sectPr>
       <w:footerReference w:type="default" r:id="rId9"/>
       <w:pgSz w:w="12240" w:h="15840"/>
       <w:pgMar w:top="1440" w:right="1440" w:bottom="1440" w:left="1440" w:header="720" w:footer="720" w:gutter="0"/>
       <w:cols w:space="720"/>
+      <w:titlePg/>
       <w:docGrid w:linePitch="360"/>
     </w:sectPr>
   </w:body>

</xml_diff>

<commit_message>
Readiness pass: verify numbers, renumber supplement, cite v1.2.0
Re-verify all reported estimates against result files, renumber
supplemental tables in order of first citation, fix nested parentheses
around confidence intervals, use typographic minus signs, relabel
supplemental tables in plain language, correct two reference entries,
and cite release v1.2.0.

Co-Authored-By: Claude Opus 5.5 <noreply@anthropic.com>
</commit_message>
<xml_diff>
--- a/manuscript/manuscript.docx
+++ b/manuscript/manuscript.docx
@@ -113,7 +113,7 @@
         <w:spacing w:line="276" w:lineRule="auto" w:after="160"/>
       </w:pPr>
       <w:r>
-        <w:t>Total word count: 5,028 (title page, abstract, text, references, tables, and figure legends). Main text: 2,908 words. Abstract: 284 words. Tables: 3. Figures: 2.</w:t>
+        <w:t>Total word count: 5,071 (title page, abstract, text, references, tables, and figure legends). Main text: 2,945 words. Abstract: 289 words. Tables: 3. Figures: 2.</w:t>
       </w:r>
     </w:p>
     <w:p>
@@ -144,7 +144,7 @@
         <w:t>Methods:</w:t>
       </w:r>
       <w:r>
-        <w:t xml:space="preserve"> We analyzed the 2019–2025 National Health Interview Survey. The primary outcome was any past-year cost-related delay in or nonreceipt of medical care, nonreceipt of needed prescription medication, or medication underuse to save money. Survey-weighted modified Poisson models with sequential adjustment estimated prevalence ratios (PRs), incorporating all ten National Center for Health Statistics income imputations; logistic models estimated covariate-standardized annual prevalence.</w:t>
+        <w:t xml:space="preserve"> We conducted a repeated cross-sectional analysis of the 2019–2025 National Health Interview Survey. The primary outcome was any past-year cost-related delay in or nonreceipt of medical care, nonreceipt of needed prescription medication, or medication underuse to save money. Survey-weighted modified Poisson models with sequential adjustment estimated prevalence ratios (PRs), incorporating all ten National Center for Health Statistics income imputations; logistic models estimated covariate-standardized annual prevalence.</w:t>
       </w:r>
     </w:p>
     <w:p>
@@ -155,7 +155,7 @@
         <w:t>Results:</w:t>
       </w:r>
       <w:r>
-        <w:t xml:space="preserve"> Among 7,104 stroke survivors, 1,184 reported a cost-related barrier, a weighted prevalence of 17.9% (95% CI, 16.8%–19.1%). Prevalence was 28.0% (95% CI, 25.9%–30.2%) at ages 18–64 years versus 10.9% (95% CI, 9.8%–12.0%) at 65 years and older, and 58.7% (95% CI, 50.7%–66.3%) among uninsured survivors. After full adjustment, working-age survivors remained more than twice as likely to report a barrier (PR, 2.18 (95% CI, 1.90–2.50)). Income of 100%–199% of the federal poverty level (PR, 2.50 (95% CI, 1.94–3.21)), uninsured status (PR, 1.79 (95% CI, 1.49–2.16)), and disability (PR, 1.19 (95% CI, 1.05–1.35)) were independently associated with barriers. Standardized prevalence was 19.2% (95% CI, 16.6%–22.0%) in 2019 and 17.0% (95% CI, 14.3%–20.1%) in 2025, with no evidence of change across years (P=0.258).</w:t>
+        <w:t xml:space="preserve"> Among 7,104 stroke survivors, 1,184 reported a cost-related barrier, a weighted prevalence of 17.9% (95% CI, 16.8%–19.1%). Prevalence was 28.0% (95% CI, 25.9%–30.2%) at ages 18–64 years versus 10.9% (95% CI, 9.8%–12.0%) at 65 years and older, and 58.7% (95% CI, 50.7%–66.3%) among uninsured survivors. After full adjustment, working-age survivors remained more than twice as likely to report a barrier (PR, 2.18; 95% CI, 1.90–2.50). Income of 100%–199% of the federal poverty level (PR, 2.50; 95% CI, 1.94–3.21), uninsured status (PR, 1.79; 95% CI, 1.49–2.16), and disability (PR, 1.19; 95% CI, 1.05–1.35) were independently associated with barriers. Standardized prevalence was 19.2% (95% CI, 16.6%–22.0%) in 2019 and 17.0% (95% CI, 14.3%–20.1%) in 2025, with no evidence of change across years (P=0.258).</w:t>
       </w:r>
     </w:p>
     <w:p>
@@ -224,12 +224,12 @@
         <w:pStyle w:val="Heading2"/>
       </w:pPr>
       <w:r>
-        <w:t>Data Availability</w:t>
+        <w:t>Data availability</w:t>
       </w:r>
     </w:p>
     <w:p>
       <w:r>
-        <w:t>NHIS public-use files and documentation are available from NCHS; no agency endorsement is implied. All acquisition, analysis, verification, and manuscript-generation code, source file hashes, aggregate results, tables, and figures are publicly available at https://github.com/blakepi/nhis-stroke-affordability (release v1.1.0). One author (G.B.P.) had full access to all the data in the study and takes responsibility for its integrity and the data analysis.</w:t>
+        <w:t>NHIS public-use files and documentation are available from NCHS; no agency endorsement is implied. All acquisition, analysis, verification, and manuscript-generation code, source file hashes, aggregate results, tables, and figures are publicly available at https://github.com/blakepi/nhis-stroke-affordability (release v1.2.0). One author (G.B.P.) had full access to all the data in the study and takes responsibility for its integrity and the data analysis.</w:t>
       </w:r>
     </w:p>
     <w:p>
@@ -265,7 +265,7 @@
     </w:p>
     <w:p>
       <w:r>
-        <w:t>A survivor with a "yes" response to any applicable question was classified as having a barrier. Classification as having no barrier required "no" responses to all three universal questions and either no prescription use or "no" responses to all three medication-use questions. Other response patterns were classified as unknown, so partially answered negative patterns were never treated as absence of a barrier. Secondary outcomes were each component separately, medication underuse (any of the three medication-use questions, among adults prescribed medication), and a three-question composite restricted to the universal items. Question wording and universes were verified against each year's codebook (Supplementary Methods).</w:t>
+        <w:t>A survivor with a "yes" response to any applicable question was classified as having a barrier. Classification as having no barrier required "no" responses to all three universal questions and either no prescription use or "no" responses to all three medication-use questions. Other response patterns were classified as unknown, so partially answered negative patterns were never treated as absence of a barrier. Secondary outcomes were each component separately, medication underuse (any of the three medication-use questions, among adults prescribed medication), and a three-question composite restricted to the universal items. Question wording and universes were verified against each year's codebook (Supplemental Methods; Tables S1 and S2).</w:t>
       </w:r>
     </w:p>
     <w:p>
@@ -306,7 +306,7 @@
     </w:p>
     <w:p>
       <w:r>
-        <w:t>Sensitivity analyses excluded 2020, restricted the sample to working-age adults or to adults without disability, modeled each component outcome, and added explicit "unknown" categories for missing covariates. Because log-binomial-type models can yield fitted values above one, key contrasts were re-estimated as standardized prevalence ratios from bounded logistic models. All primary prevalence estimates, standard errors, and the full model were independently reproduced in a second software environment. Analyses used R version 4.6.0 with the survey and mitools packages. P values are two-sided without adjustment for multiplicity; secondary and sensitivity analyses are exploratory. The analysis was not preregistered. Reporting follows the STROBE guideline.[15]</w:t>
+        <w:t>Sensitivity analyses excluded 2020, restricted the sample to working-age adults or to adults without disability, modeled each component outcome, and added explicit "unknown" categories for missing covariates. Because log-binomial-type models can yield fitted values above one, key contrasts were re-estimated as standardized prevalence ratios from bounded logistic models. All primary prevalence estimates, standard errors, and the full model were independently reproduced in a second software environment. Analyses used R version 4.6.0 with the survey and mitools packages. P values are two-sided without adjustment for multiplicity; secondary and sensitivity analyses are exploratory. The analysis was not preregistered. Reporting follows the STROBE guideline;[15] the completed checklist is provided in the Supplemental Material.</w:t>
       </w:r>
     </w:p>
     <w:p>
@@ -327,7 +327,7 @@
     </w:p>
     <w:p>
       <w:r>
-        <w:t>The seven annual files contained 207,064 sample adults, of whom 7,565 reported a prior stroke (Figure S1). After exclusion of 10 records with unknown age and application of the pooled-sample rules for 2020, the pooled sample comprised 7,181 stroke survivors, of whom 7,104 (98.9%) had a classifiable primary outcome; 6,777 had complete covariates for adjusted models. In the weighted pooled sample, 41.0% were aged 18–64 years, 51.5% were female, 38.8% had a disability, and 51.9% rated their health as fair or poor (Table 1). More than half (53.6%) had public coverage without private insurance, 40.3% had private coverage, and 4.0% were uninsured.</w:t>
+        <w:t>The seven annual files contained 207,064 sample adults, of whom 7,565 reported a prior stroke (Figure S1; Table S3). After exclusion of 10 records with unknown age and application of the pooled-sample rules for 2020, the pooled sample comprised 7,181 stroke survivors, of whom 7,104 (98.9%) had a classifiable primary outcome; 6,777 had complete covariates for adjusted models (Table S4). In the weighted pooled sample, 41.0% were aged 18–64 years, 51.5% were female, 38.8% had a disability, and 51.9% rated their health as fair or poor (Table 1; Table S5). More than half (53.6%) had public coverage without private insurance, 40.3% had private coverage, and 4.0% were uninsured.</w:t>
       </w:r>
     </w:p>
     <w:p>
@@ -340,12 +340,12 @@
     </w:p>
     <w:p>
       <w:r>
-        <w:t>Overall, 1,184 survivors reported at least one cost-related barrier, a weighted prevalence of 17.9% (95% CI, 16.8%–19.1%), or approximately one in six stroke survivors (Table 2). The most common barrier was needing but not getting a prescription medication because of cost (10.0% (95% CI, 9.1%–11.0%)), followed by delaying medical care (8.5% (95% CI, 7.7%–9.4%)) and forgoing medical care (8.4% (95% CI, 7.6%–9.3%)). Among survivors prescribed medication, 10.1% (95% CI, 9.2%–11.1%) reported skipping doses, taking less, or delaying fills to save money. Restricting the composite to the three universal questions gave a prevalence of 15.5% (95% CI, 14.3%–16.6%) (Figure 1B).</w:t>
+        <w:t>Overall, 1,184 survivors reported at least one cost-related barrier, a weighted prevalence of 17.9% (95% CI, 16.8%–19.1%), or approximately one in six stroke survivors (Table 2). The most common barrier was needing but not getting a prescription medication because of cost (10.0%; 95% CI, 9.1%–11.0%), followed by delaying medical care (8.5%; 95% CI, 7.7%–9.4%) and forgoing medical care (8.4%; 95% CI, 7.6%–9.3%). Among survivors prescribed medication, 10.1% (95% CI, 9.2%–11.1%) reported skipping doses, taking less, or delaying fills to save money. Restricting the composite to the three universal questions gave a prevalence of 15.5% (95% CI, 14.3%–16.6%) (Figure 1B; Table S6).</w:t>
       </w:r>
     </w:p>
     <w:p>
       <w:r>
-        <w:t>Observed annual prevalence fluctuated between 15.3% and 20.6% without a monotonic trend (Figure 1A; Table 2). After standardization for demographic, socioeconomic, and clinical characteristics, prevalence was 19.2% (95% CI, 16.6%–22.0%) in 2019 and 17.0% (95% CI, 14.3%–20.1%) in 2025, an absolute difference of -2.1 percentage points (95% CI, -6.0 to 1.8). Neither categorical year (P=0.258) nor the interaction between year and age group (P=0.830) showed evidence of change over the period.</w:t>
+        <w:t>Observed annual prevalence fluctuated between 15.3% and 20.6% without a monotonic trend (Figure 1A; Table 2). After standardization for demographic, socioeconomic, and clinical characteristics, prevalence was 19.2% (95% CI, 16.6%–22.0%) in 2019 and 17.0% (95% CI, 14.3%–20.1%) in 2025, an absolute difference of −2.1 percentage points (95% CI, −6.0 to 1.8). Neither categorical year (P=0.258) nor the interaction between year and age group (P=0.830) showed evidence of change over the period.</w:t>
       </w:r>
     </w:p>
     <w:p>
@@ -358,12 +358,12 @@
     </w:p>
     <w:p>
       <w:r>
-        <w:t>Cost-related barriers were strongly patterned by age, income, and insurance (Figure 2). Working-age survivors reported barriers at 28.0% (95% CI, 25.9%–30.2%), compared with 10.9% (95% CI, 9.8%–12.0%) among survivors aged 65 years and older. Prevalence rose steeply with lower income, from 8.2% at 400% FPL or higher to 18.0% at 200%–399% FPL, 23.5% at 100%–199% FPL, and 22.5% below 100% FPL. Nearly three in five uninsured survivors reported a barrier (58.7% (95% CI, 50.7%–66.3%)), compared with 16.6% (95% CI, 14.9%–18.4%) of privately insured survivors and 15.8% (95% CI, 14.5%–17.3%) of those with public coverage only. Survivors with a disability reported barriers more often than those without (20.2% (95% CI, 18.4%–22.1%) versus 16.5% (95% CI, 15.1%–17.9%)).</w:t>
+        <w:t>Cost-related barriers were strongly patterned by age, income, and insurance (Figure 2; Table S7). Working-age survivors reported barriers at 28.0% (95% CI, 25.9%–30.2%), compared with 10.9% (95% CI, 9.8%–12.0%) among survivors aged 65 years and older. Prevalence rose steeply with lower income, from 8.2% at 400% FPL or higher to 18.0% at 200%–399% FPL, 23.5% at 100%–199% FPL, and 22.5% below 100% FPL. Nearly three in five uninsured survivors reported a barrier (58.7%; 95% CI, 50.7%–66.3%), compared with 16.6% (95% CI, 14.9%–18.4%) of privately insured survivors and 15.8% (95% CI, 14.5%–17.3%) of those with public coverage only. Survivors with a disability reported barriers more often than those without: 20.2% (95% CI, 18.4%–22.1%) versus 16.5% (95% CI, 15.1%–17.9%).</w:t>
       </w:r>
     </w:p>
     <w:p>
       <w:r>
-        <w:t>In adjusted models, the working-age association attenuated but persisted (Table 3). The prevalence ratio for ages 18–64 versus 65 years and older was 2.51 (95% CI, 2.20–2.87) with demographic adjustment, 2.27 (95% CI, 1.98–2.61) after adding education, income, and insurance, and 2.18 (95% CI, 1.90–2.50) after further adjustment for clinical and health-status characteristics. Socioeconomic and clinical characteristics therefore accounted for only part of the age difference. Relative to income of 400% FPL or higher, fully adjusted prevalence ratios were 2.07 (95% CI, 1.65–2.61) for 200%–399% FPL, 2.50 (95% CI, 1.94–3.21) for 100%–199% FPL, and 2.00 (95% CI, 1.52–2.63) for below 100% FPL. Uninsured survivors had a prevalence ratio of 1.79 (95% CI, 1.49–2.16) relative to privately insured survivors, whereas public coverage without private insurance was associated with a lower adjusted prevalence (0.72 (95% CI, 0.63–0.83)). Disability was associated with a prevalence ratio of 1.19 (95% CI, 1.05–1.35). Female sex (PR, 1.27; 95% CI, 1.12–1.43), coronary heart disease (PR, 1.37; 95% CI, 1.18–1.58), current smoking (PR, 1.21; 95% CI, 1.04–1.42), and fair or poor self-rated health (PR, 1.58; 95% CI, 1.37–1.82) were also independently associated with barriers (Table S5).</w:t>
+        <w:t>In adjusted models, the working-age association attenuated but persisted (Table 3). The prevalence ratio for ages 18–64 versus 65 years and older was 2.51 (95% CI, 2.20–2.87) with demographic adjustment, 2.27 (95% CI, 1.98–2.61) after adding education, income, and insurance, and 2.18 (95% CI, 1.90–2.50) after further adjustment for clinical and health-status characteristics. Socioeconomic and clinical characteristics therefore accounted for only part of the age difference. Relative to income of 400% FPL or higher, fully adjusted prevalence ratios were 2.07 (95% CI, 1.65–2.61) for 200%–399% FPL, 2.50 (95% CI, 1.94–3.21) for 100%–199% FPL, and 2.00 (95% CI, 1.52–2.63) for below 100% FPL. Uninsured survivors had a prevalence ratio of 1.79 (95% CI, 1.49–2.16) relative to privately insured survivors, whereas public coverage without private insurance was associated with a lower adjusted prevalence (PR, 0.72; 95% CI, 0.63–0.83). Disability was associated with a prevalence ratio of 1.19 (95% CI, 1.05–1.35). Female sex (PR, 1.27; 95% CI, 1.12–1.43), coronary heart disease (PR, 1.37; 95% CI, 1.18–1.58), current smoking (PR, 1.21; 95% CI, 1.04–1.42), and fair or poor self-rated health (PR, 1.58; 95% CI, 1.37–1.82) were also independently associated with barriers (Table S8).</w:t>
       </w:r>
     </w:p>
     <w:p>
@@ -376,7 +376,7 @@
     </w:p>
     <w:p>
       <w:r>
-        <w:t>Results were materially unchanged when 2020 was excluded (income 100%–199% FPL: PR, 2.59; 95% CI, 2.00–3.36; uninsured: PR, 1.82; 95% CI, 1.49–2.21; disability: PR, 1.18; 95% CI, 1.04–1.34) and were consistent in direction across component outcomes and the missing-category analysis (Table S6). Within working-age survivors, the disability association was smaller and imprecise (PR, 1.08; 95% CI, 0.92–1.27). The fully adjusted modified Poisson model produced fitted values above one for approximately 0.2% of records; standardized prevalence ratios from bounded logistic models were closely similar (2.13 (95% CI, 1.86–2.44) for working age, 2.41 (95% CI, 1.88–3.09) for income 100%–199% FPL, 1.99 (95% CI, 1.63–2.43) for uninsured status, and 1.18 (95% CI, 1.04–1.33) for disability; Table S7). Barrier prevalence among the 327 survivors excluded from adjusted models for missing covariates (19.2%; 95% CI, 14.0%–25.5%) was similar to that in the analytic sample (17.8%).</w:t>
+        <w:t>Results were materially unchanged when 2020 was excluded (income 100%–199% FPL: PR, 2.59; 95% CI, 2.00–3.36; uninsured: PR, 1.82; 95% CI, 1.49–2.21; disability: PR, 1.18; 95% CI, 1.04–1.34) and were consistent in direction across component outcomes and the missing-category analysis (Table S9). Within working-age survivors, the disability association was smaller and imprecise (PR, 1.08; 95% CI, 0.92–1.27). The fully adjusted modified Poisson model produced fitted values above one for approximately 0.2% of records; standardized prevalence ratios from bounded logistic models were closely similar: 2.13 (95% CI, 1.86–2.44) for working age, 2.41 (95% CI, 1.88–3.09) for income 100%–199% FPL, 1.99 (95% CI, 1.63–2.43) for uninsured status, and 1.18 (95% CI, 1.04–1.33) for disability (Table S10). Model convergence and fitted-value diagnostics are given in Table S11. Barrier prevalence among the 327 survivors excluded from adjusted models for missing covariates (19.2%; 95% CI, 14.0%–25.5%) was similar to that in the analytic sample (17.8%).</w:t>
       </w:r>
     </w:p>
     <w:p>
@@ -409,7 +409,7 @@
     </w:p>
     <w:p>
       <w:r>
-        <w:t>These results have direct implications for post-stroke care. Cost-related nonadherence is a modifiable cause of treatment failure, and clinicians rarely detect it unless they ask.[4,6] Brief affordability screening at follow-up, particularly for survivors younger than 65 years, those with lower income, and those with disability, could identify patients for whom generic substitution, patient assistance programs, insurance navigation, or social work referral would preserve secondary prevention. At the system level, the absence of improvement over seven years indicates that recent coverage policies have not resolved affordability for this high-risk population, and that stroke survivors merit specific consideration in policies addressing cost sharing for chronic disease medications.</w:t>
+        <w:t>These results have direct implications for post-stroke care. Cost-related nonadherence after stroke is common and modifiable,[4,6] but it is unlikely to be identified unless clinicians ask about it. Brief affordability screening at follow-up, particularly for survivors younger than 65 years, those with lower income, and those with disability, could identify patients for whom generic substitution, patient assistance programs, insurance navigation, or social work referral would preserve secondary prevention. At the system level, the absence of improvement over seven years indicates that recent coverage policies have not resolved affordability for this high-risk population, and that stroke survivors merit specific consideration in policies addressing cost sharing for chronic disease medications.</w:t>
       </w:r>
     </w:p>
     <w:p>
@@ -541,7 +541,7 @@
     </w:p>
     <w:p>
       <w:r>
-        <w:t>6. Ansong R, Kyei G, Miezah D, Abubakari M, Kyei E. Cost-related medication nonadherence among adults with stroke in the United States: insight from the 2020-2023 National Health Interview Survey. J Racial Ethn Health Disparities. Published online January 27, 2026. doi:10.1007/s40615-026-02863-w</w:t>
+        <w:t>6. Ansong R, Kyei G, Miezah D, Abubakari M, Kyei E. Cost-related medication nonadherence among adults with stroke in the United States: insight from the 2020–2023 National Health Interview Survey. J Racial Ethn Health Disparities. Published online January 27, 2026. doi:10.1007/s40615-026-02863-w</w:t>
       </w:r>
     </w:p>
     <w:p>
@@ -566,7 +566,7 @@
     </w:p>
     <w:p>
       <w:r>
-        <w:t>11. Parker JD, Talih M, Malec DJ, et al. National Center for Health Statistics Data Presentation Standards for Proportions. Vital Health Stat 2. 2017;:1–22.</w:t>
+        <w:t>11. Parker JD, Talih M, Malec DJ, et al. National Center for Health Statistics Data Presentation Standards for Proportions. Vital Health Stat 2. 2017;175:1–22.</w:t>
       </w:r>
     </w:p>
     <w:p>
@@ -586,7 +586,7 @@
     </w:p>
     <w:p>
       <w:r>
-        <w:t>15. von Elm E, Altman DG, Egger M, Pocock SJ, Gøtzsche PC, Vandenbroucke JP, STROBE Initiative. The Strengthening the Reporting of Observational Studies in Epidemiology Statement Guidelines for Reporting Observational Studies. PLoS Med. 2007;4:e296. doi:10.1371/journal.pmed.0040296</w:t>
+        <w:t>15. von Elm E, Altman DG, Egger M, Pocock SJ, Gøtzsche PC, Vandenbroucke JP; STROBE Initiative. The Strengthening the Reporting of Observational Studies in Epidemiology (STROBE) statement: guidelines for reporting observational studies. PLoS Med. 2007;4:e296. doi:10.1371/journal.pmed.0040296</w:t>
       </w:r>
     </w:p>
     <w:p>
@@ -2429,7 +2429,7 @@
         <w:rPr>
           <w:sz w:val="18"/>
         </w:rPr>
-        <w:t>Values are unweighted number (survey-weighted column percentage). Income counts are averaged across the ten NCHS imputations and may be fractional. Unknown values are retained in denominators; percentages within a variable may not sum to 100 because of rounding. FPL indicates federal poverty level; NHIS, National Health Interview Survey. Additional characteristics are given in Table S3.</w:t>
+        <w:t>Values are unweighted number (survey-weighted column percentage). Income counts are averaged across the ten NCHS imputations and may be fractional. Unknown values are retained in denominators; percentages within a variable may not sum to 100 because of rounding. FPL indicates federal poverty level; NHIS, National Health Interview Survey. Additional characteristics are given in Table S5.</w:t>
       </w:r>
     </w:p>
     <w:p>
@@ -4792,7 +4792,7 @@
         <w:rPr>
           <w:sz w:val="18"/>
         </w:rPr>
-        <w:t>Survey-weighted modified Poisson regression with ten income imputations; all models include the same 6,777 survivors (1,117 with a barrier). Model 1 adjusts for survey year, age (spline), sex, race and Hispanic origin, and region. Model 2 adds education, family income, and insurance. Model 3 adds hypertension, diabetes, coronary heart disease, smoking, self-rated health, and disability. The age-group estimate is from a parallel model that replaces the age spline with an age-group indicator. Private coverage (with or without public coverage) is the reference for insurance. A dash indicates that the variable was not in the model. FPL indicates federal poverty level; GED, General Educational Development; PR, prevalence ratio. Complete Model 3 estimates are given in Table S5.</w:t>
+        <w:t>Survey-weighted modified Poisson regression with ten income imputations; all models include the same 6,777 survivors (1,117 with a barrier). Model 1 adjusts for survey year, age (spline), sex, race and Hispanic origin, and region. Model 2 adds education, family income, and insurance. Model 3 adds hypertension, diabetes, coronary heart disease, smoking, self-rated health, and disability. The age-group estimate is from a parallel model that replaces the age spline with an age-group indicator. Private coverage (with or without public coverage) is the reference for insurance. A dash indicates that the variable was not in the model. FPL indicates federal poverty level; GED, General Educational Development; PR, prevalence ratio. Complete Model 3 estimates are given in Table S8.</w:t>
       </w:r>
     </w:p>
     <w:p>

</xml_diff>

<commit_message>
Update title-page correspondence and ORCID lines
Co-Authored-By: Claude Opus 5.5 <noreply@anthropic.com>
</commit_message>
<xml_diff>
--- a/manuscript/manuscript.docx
+++ b/manuscript/manuscript.docx
@@ -81,7 +81,7 @@
         <w:spacing w:line="276" w:lineRule="auto" w:after="160"/>
       </w:pPr>
       <w:r>
-        <w:t>*Correspondence: G. Blake Pierpoint, Macon &amp; Joan Brock Virginia Health Sciences Eastern Virginia Medical School at Old Dominion University, Norfolk, Virginia, USA. E-mail: pierpogb@odu.edu</w:t>
+        <w:t>*Correspondence: G. Blake Pierpoint; pierpogb@odu.edu</w:t>
       </w:r>
     </w:p>
     <w:p>
@@ -89,7 +89,7 @@
         <w:spacing w:line="276" w:lineRule="auto" w:after="160"/>
       </w:pPr>
       <w:r>
-        <w:t>ORCID: G. Blake Pierpoint, 0000-0001-8288-8549; Alberto E. Musto, 0000-0002-0877-8883</w:t>
+        <w:t>ORCID identifiers: G. Blake Pierpoint, 0000-0001-8288-8549; Alberto E. Musto, 0000-0002-0877-8883</w:t>
       </w:r>
     </w:p>
     <w:p>
@@ -113,7 +113,7 @@
         <w:spacing w:line="276" w:lineRule="auto" w:after="160"/>
       </w:pPr>
       <w:r>
-        <w:t>Total word count: 5,071 (title page, abstract, text, references, tables, and figure legends). Main text: 2,945 words. Abstract: 289 words. Tables: 3. Figures: 2.</w:t>
+        <w:t>Total word count: 5,053 (title page, abstract, text, references, tables, and figure legends). Main text: 2,945 words. Abstract: 289 words. Tables: 3. Figures: 2.</w:t>
       </w:r>
     </w:p>
     <w:p>

</xml_diff>

<commit_message>
Add author degrees and corresponding-author postal address
Co-Authored-By: Claude Opus 5.5 <noreply@anthropic.com>
</commit_message>
<xml_diff>
--- a/manuscript/manuscript.docx
+++ b/manuscript/manuscript.docx
@@ -16,7 +16,7 @@
         <w:jc w:val="center"/>
       </w:pPr>
       <w:r>
-        <w:t>G. Blake Pierpoint</w:t>
+        <w:t>G. Blake Pierpoint, BS</w:t>
       </w:r>
       <w:r>
         <w:rPr>
@@ -25,7 +25,7 @@
         <w:t>1,*</w:t>
       </w:r>
       <w:r>
-        <w:t xml:space="preserve"> and Alberto E. Musto</w:t>
+        <w:t xml:space="preserve"> and Alberto E. Musto, MD, PhD</w:t>
       </w:r>
       <w:r>
         <w:rPr>
@@ -81,7 +81,7 @@
         <w:spacing w:line="276" w:lineRule="auto" w:after="160"/>
       </w:pPr>
       <w:r>
-        <w:t>*Correspondence: G. Blake Pierpoint; pierpogb@odu.edu</w:t>
+        <w:t>*Correspondence: G. Blake Pierpoint, BS, Macon &amp; Joan Brock Virginia Health Sciences Eastern Virginia Medical School at Old Dominion University, 700 West Olney Road, Norfolk, VA 23507, USA; pierpogb@odu.edu</w:t>
       </w:r>
     </w:p>
     <w:p>
@@ -113,7 +113,7 @@
         <w:spacing w:line="276" w:lineRule="auto" w:after="160"/>
       </w:pPr>
       <w:r>
-        <w:t>Total word count: 5,053 (title page, abstract, text, references, tables, and figure legends). Main text: 2,945 words. Abstract: 289 words. Tables: 3. Figures: 2.</w:t>
+        <w:t>Total word count: 5,080 (title page, abstract, text, references, tables, and figure legends). Main text: 2,945 words. Abstract: 289 words. Tables: 3. Figures: 2.</w:t>
       </w:r>
     </w:p>
     <w:p>

</xml_diff>

<commit_message>
Redesign Figure 1 and tighten manuscript prose
Stack Figure 1 panels at full width with larger type, and revise the
abstract, introduction, discussion, conclusions, and cover letter to a
plainer, more measured scientific register.

Co-Authored-By: Claude Opus 5.5 <noreply@anthropic.com>
</commit_message>
<xml_diff>
--- a/manuscript/manuscript.docx
+++ b/manuscript/manuscript.docx
@@ -113,7 +113,7 @@
         <w:spacing w:line="276" w:lineRule="auto" w:after="160"/>
       </w:pPr>
       <w:r>
-        <w:t>Total word count: 5,080 (title page, abstract, text, references, tables, and figure legends). Main text: 2,945 words. Abstract: 289 words. Tables: 3. Figures: 2.</w:t>
+        <w:t>Total word count: 4,912 (title page, abstract, text, references, tables, and figure legends). Main text: 2,771 words. Abstract: 295 words. Tables: 3. Figures: 2.</w:t>
       </w:r>
     </w:p>
     <w:p>
@@ -133,7 +133,7 @@
         <w:t>Background:</w:t>
       </w:r>
       <w:r>
-        <w:t xml:space="preserve"> Secondary prevention after stroke depends on sustained access to follow-up care and medications, yet no contemporary national estimate describes how often US stroke survivors cannot afford them. We quantified cost-related barriers to medical care and medications among stroke survivors from 2019 through 2025 and identified the groups most affected.</w:t>
+        <w:t xml:space="preserve"> Secondary prevention after stroke requires continued access to follow-up care and medications. Recent national estimates for stroke survivors have addressed medication costs only. We estimated the prevalence of cost-related barriers to both medical care and medications among US stroke survivors from 2019 through 2025 and examined which groups were most affected.</w:t>
       </w:r>
     </w:p>
     <w:p>
@@ -166,7 +166,7 @@
         <w:t>Conclusions:</w:t>
       </w:r>
       <w:r>
-        <w:t xml:space="preserve"> One in six US stroke survivors, and more than one in four of working age, reported forgoing or rationing care because of cost, with no improvement over seven years. Affordability is a persistent, measurable threat to secondary prevention that concentrates in identifiable groups and warrants routine attention in post-stroke care.</w:t>
+        <w:t xml:space="preserve"> About 1 in 6 US stroke survivors, and more than 1 in 4 of those aged 18–64 years, reported delaying or forgoing care or medications because of cost, and prevalence did not decline between 2019 and 2025. Routine assessment of affordability during post-stroke follow-up may help identify survivors at risk of interrupted secondary prevention.</w:t>
       </w:r>
     </w:p>
     <w:p>
@@ -193,17 +193,17 @@
     </w:p>
     <w:p>
       <w:r>
-        <w:t>Millions of US adults are living after a stroke, and their risk of recurrent vascular events is highest when medical follow-up and preventive medications lapse.[1,2] Current guidelines call for sustained control of blood pressure, lipids, and glucose and for continuous antithrombotic therapy, all of which require regular contact with the health system and uninterrupted access to prescriptions.[2] For many survivors, the constraint is not the availability of effective therapy but the ability to pay for it.</w:t>
+        <w:t>Millions of US adults have survived a stroke and remain at elevated risk of recurrent vascular events.[1] Guidelines for secondary prevention recommend long-term control of blood pressure, lipids, and glucose and continued antithrombotic therapy,[2] which require regular outpatient follow-up and uninterrupted access to prescription medications. Out-of-pocket costs can limit both.</w:t>
       </w:r>
     </w:p>
     <w:p>
       <w:r>
-        <w:t>Cost has long shaped access to care after stroke. In the 1998–2002 National Health Interview Survey (NHIS), younger stroke survivors were markedly less likely than older survivors to obtain physician care and medications,[3] and NHIS data from 1999–2010 documented substantial cost-related medication nonadherence that varied with age and insurance.[4] Financial stress and food insecurity were linked to medication nonadherence among stroke survivors in 2014–2018,[5] and a recent analysis of the 2020–2023 NHIS reported that 13% of stroke survivors had cost-related medication nonadherence, most often those who were younger, uninsured, or of lower income.[6] Parallel work in adults with multiple chronic conditions suggested that cost-related nonadherence may have declined between 2019 and 2023.[7]</w:t>
+        <w:t>Cost-related barriers after stroke have been described for more than 2 decades. In the 1998–2002 National Health Interview Survey (NHIS), younger stroke survivors were markedly less likely than older survivors to obtain physician care and medications,[3] and NHIS data from 1999–2010 documented substantial cost-related medication nonadherence that varied with age and insurance.[4] Financial stress and food insecurity were linked to medication nonadherence among stroke survivors in 2014–2018,[5] and a recent analysis of the 2020–2023 NHIS reported that 13% of stroke survivors had cost-related medication nonadherence, most often those who were younger, uninsured, or of lower income.[6] Parallel work in adults with multiple chronic conditions suggested that cost-related nonadherence may have declined between 2019 and 2023.[7]</w:t>
       </w:r>
     </w:p>
     <w:p>
       <w:r>
-        <w:t>Three gaps remain. First, existing stroke-specific estimates focus on medications alone, whereas cost also causes survivors to delay or forgo physician visits, the point of contact at which secondary prevention is prescribed and adjusted. Second, no analysis spans the full period from 2019, the first year of the redesigned NHIS, through 2025, a period that included the COVID-19 pandemic and its temporary coverage protections. Third, prior work has not examined whether the excess burden among working-age survivors is explained by their income, insurance, or health status, which bears on where interventions should be aimed.</w:t>
+        <w:t>Recent stroke-specific studies have examined medication nonadherence but not delayed or forgone medical care, which affects the visits at which preventive therapy is prescribed and adjusted. No study has covered the full period from 2019, the first year of the redesigned NHIS, through 2025, which included the COVID-19 pandemic and temporary coverage protections. It is also unclear how much of the higher prevalence among working-age survivors reflects differences in income, insurance, or health status.</w:t>
       </w:r>
     </w:p>
     <w:p>
@@ -340,7 +340,7 @@
     </w:p>
     <w:p>
       <w:r>
-        <w:t>Overall, 1,184 survivors reported at least one cost-related barrier, a weighted prevalence of 17.9% (95% CI, 16.8%–19.1%), or approximately one in six stroke survivors (Table 2). The most common barrier was needing but not getting a prescription medication because of cost (10.0%; 95% CI, 9.1%–11.0%), followed by delaying medical care (8.5%; 95% CI, 7.7%–9.4%) and forgoing medical care (8.4%; 95% CI, 7.6%–9.3%). Among survivors prescribed medication, 10.1% (95% CI, 9.2%–11.1%) reported skipping doses, taking less, or delaying fills to save money. Restricting the composite to the three universal questions gave a prevalence of 15.5% (95% CI, 14.3%–16.6%) (Figure 1B; Table S6).</w:t>
+        <w:t>Overall, 1,184 survivors reported at least one cost-related barrier, a weighted prevalence of 17.9% (95% CI, 16.8%–19.1%), or approximately 1 in 6 stroke survivors (Table 2). The most common barrier was needing but not getting a prescription medication because of cost (10.0%; 95% CI, 9.1%–11.0%), followed by delaying medical care (8.5%; 95% CI, 7.7%–9.4%) and forgoing medical care (8.4%; 95% CI, 7.6%–9.3%). Among survivors prescribed medication, 10.1% (95% CI, 9.2%–11.1%) reported skipping doses, taking less, or delaying fills to save money. Restricting the composite to the three universal questions gave a prevalence of 15.5% (95% CI, 14.3%–16.6%) (Figure 1B; Table S6).</w:t>
       </w:r>
     </w:p>
     <w:p>
@@ -358,12 +358,12 @@
     </w:p>
     <w:p>
       <w:r>
-        <w:t>Cost-related barriers were strongly patterned by age, income, and insurance (Figure 2; Table S7). Working-age survivors reported barriers at 28.0% (95% CI, 25.9%–30.2%), compared with 10.9% (95% CI, 9.8%–12.0%) among survivors aged 65 years and older. Prevalence rose steeply with lower income, from 8.2% at 400% FPL or higher to 18.0% at 200%–399% FPL, 23.5% at 100%–199% FPL, and 22.5% below 100% FPL. Nearly three in five uninsured survivors reported a barrier (58.7%; 95% CI, 50.7%–66.3%), compared with 16.6% (95% CI, 14.9%–18.4%) of privately insured survivors and 15.8% (95% CI, 14.5%–17.3%) of those with public coverage only. Survivors with a disability reported barriers more often than those without: 20.2% (95% CI, 18.4%–22.1%) versus 16.5% (95% CI, 15.1%–17.9%).</w:t>
+        <w:t>Prevalence differed by age, income, and insurance (Figure 2; Table S7). Working-age survivors reported barriers at 28.0% (95% CI, 25.9%–30.2%), compared with 10.9% (95% CI, 9.8%–12.0%) among survivors aged 65 years and older. Prevalence was higher at lower income levels: 8.2% at 400% FPL or higher to 18.0% at 200%–399% FPL, 23.5% at 100%–199% FPL, and 22.5% below 100% FPL. A barrier was reported by 58.7% (95% CI, 50.7%–66.3%) of uninsured survivors, compared with 16.6% (95% CI, 14.9%–18.4%) of privately insured survivors and 15.8% (95% CI, 14.5%–17.3%) of those with public coverage only. Survivors with a disability reported barriers more often than those without: 20.2% (95% CI, 18.4%–22.1%) versus 16.5% (95% CI, 15.1%–17.9%).</w:t>
       </w:r>
     </w:p>
     <w:p>
       <w:r>
-        <w:t>In adjusted models, the working-age association attenuated but persisted (Table 3). The prevalence ratio for ages 18–64 versus 65 years and older was 2.51 (95% CI, 2.20–2.87) with demographic adjustment, 2.27 (95% CI, 1.98–2.61) after adding education, income, and insurance, and 2.18 (95% CI, 1.90–2.50) after further adjustment for clinical and health-status characteristics. Socioeconomic and clinical characteristics therefore accounted for only part of the age difference. Relative to income of 400% FPL or higher, fully adjusted prevalence ratios were 2.07 (95% CI, 1.65–2.61) for 200%–399% FPL, 2.50 (95% CI, 1.94–3.21) for 100%–199% FPL, and 2.00 (95% CI, 1.52–2.63) for below 100% FPL. Uninsured survivors had a prevalence ratio of 1.79 (95% CI, 1.49–2.16) relative to privately insured survivors, whereas public coverage without private insurance was associated with a lower adjusted prevalence (PR, 0.72; 95% CI, 0.63–0.83). Disability was associated with a prevalence ratio of 1.19 (95% CI, 1.05–1.35). Female sex (PR, 1.27; 95% CI, 1.12–1.43), coronary heart disease (PR, 1.37; 95% CI, 1.18–1.58), current smoking (PR, 1.21; 95% CI, 1.04–1.42), and fair or poor self-rated health (PR, 1.58; 95% CI, 1.37–1.82) were also independently associated with barriers (Table S8).</w:t>
+        <w:t>In adjusted models, the association with working age was attenuated but persisted (Table 3). The prevalence ratio for ages 18–64 versus 65 years and older was 2.51 (95% CI, 2.20–2.87) with demographic adjustment, 2.27 (95% CI, 1.98–2.61) after adding education, income, and insurance, and 2.18 (95% CI, 1.90–2.50) after further adjustment for clinical and health-status characteristics. Relative to income of 400% FPL or higher, fully adjusted prevalence ratios were 2.07 (95% CI, 1.65–2.61) for 200%–399% FPL, 2.50 (95% CI, 1.94–3.21) for 100%–199% FPL, and 2.00 (95% CI, 1.52–2.63) for below 100% FPL. Uninsured survivors had a prevalence ratio of 1.79 (95% CI, 1.49–2.16) relative to privately insured survivors, whereas public coverage without private insurance was associated with a lower adjusted prevalence (PR, 0.72; 95% CI, 0.63–0.83). Disability was associated with a prevalence ratio of 1.19 (95% CI, 1.05–1.35). Female sex (PR, 1.27; 95% CI, 1.12–1.43), coronary heart disease (PR, 1.37; 95% CI, 1.18–1.58), current smoking (PR, 1.21; 95% CI, 1.04–1.42), and fair or poor self-rated health (PR, 1.58; 95% CI, 1.37–1.82) were also independently associated with barriers (Table S8).</w:t>
       </w:r>
     </w:p>
     <w:p>
@@ -376,7 +376,7 @@
     </w:p>
     <w:p>
       <w:r>
-        <w:t>Results were materially unchanged when 2020 was excluded (income 100%–199% FPL: PR, 2.59; 95% CI, 2.00–3.36; uninsured: PR, 1.82; 95% CI, 1.49–2.21; disability: PR, 1.18; 95% CI, 1.04–1.34) and were consistent in direction across component outcomes and the missing-category analysis (Table S9). Within working-age survivors, the disability association was smaller and imprecise (PR, 1.08; 95% CI, 0.92–1.27). The fully adjusted modified Poisson model produced fitted values above one for approximately 0.2% of records; standardized prevalence ratios from bounded logistic models were closely similar: 2.13 (95% CI, 1.86–2.44) for working age, 2.41 (95% CI, 1.88–3.09) for income 100%–199% FPL, 1.99 (95% CI, 1.63–2.43) for uninsured status, and 1.18 (95% CI, 1.04–1.33) for disability (Table S10). Model convergence and fitted-value diagnostics are given in Table S11. Barrier prevalence among the 327 survivors excluded from adjusted models for missing covariates (19.2%; 95% CI, 14.0%–25.5%) was similar to that in the analytic sample (17.8%).</w:t>
+        <w:t>Results were similar when 2020 was excluded (income 100%–199% FPL: PR, 2.59; 95% CI, 2.00–3.36; uninsured: PR, 1.82; 95% CI, 1.49–2.21; disability: PR, 1.18; 95% CI, 1.04–1.34) and were consistent in direction across component outcomes and the missing-category analysis (Table S9). Within working-age survivors, the disability association was smaller and imprecise (PR, 1.08; 95% CI, 0.92–1.27). The fully adjusted modified Poisson model produced fitted values above one for approximately 0.2% of records; standardized prevalence ratios from bounded logistic models were similar: 2.13 (95% CI, 1.86–2.44) for working age, 2.41 (95% CI, 1.88–3.09) for income 100%–199% FPL, 1.99 (95% CI, 1.63–2.43) for uninsured status, and 1.18 (95% CI, 1.04–1.33) for disability (Table S10). Model convergence and fitted-value diagnostics are given in Table S11. Barrier prevalence among the 327 survivors excluded from adjusted models for missing covariates (19.2%; 95% CI, 14.0%–25.5%) was similar to that in the analytic sample (17.8%).</w:t>
       </w:r>
     </w:p>
     <w:p>
@@ -389,27 +389,27 @@
     </w:p>
     <w:p>
       <w:r>
-        <w:t>In this nationally representative analysis spanning 2019 through 2025, roughly one in six US stroke survivors reported delaying or forgoing medical care, going without a needed prescription, or rationing medication because of cost in the preceding year. The burden was not evenly distributed. More than one in four working-age survivors and nearly three in five uninsured survivors reported a barrier, prevalence rose steeply as income fell, and survivors with disability were affected more often than those without. Working-age survivors remained more than twice as likely as older survivors to report a barrier even after accounting for income, insurance, education, and health status. Across seven years that included the pandemic and its temporary coverage protections, there was no evidence that affordability improved.</w:t>
+        <w:t>In this nationally representative analysis spanning 2019 through 2025, approximately 1 in 6 US stroke survivors reported delaying or forgoing medical care, going without a needed prescription, or rationing medication because of cost in the preceding year. More than 1 in 4 working-age survivors and nearly 3 in 5 uninsured survivors reported a barrier, prevalence was higher at lower income levels, and survivors with disability were affected more often than those without. Working-age survivors remained more than twice as likely as older survivors to report a barrier after adjustment for income, insurance, education, and health status. Prevalence did not change meaningfully between 2019 and 2025.</w:t>
       </w:r>
     </w:p>
     <w:p>
       <w:r>
-        <w:t>These findings update and extend a consistent body of evidence. Two decades ago, younger stroke survivors in NHIS were already less able to obtain physician care and medications,[3] and cost-related medication nonadherence was common through 2010.[4] The most recent stroke-specific estimate, 13% cost-related medication nonadherence in 2020–2023,[6] is consistent with the 10.1% (95% CI, 9.2%–11.1%) medication underuse and 10.0% (95% CI, 9.1%–11.0%) forgone prescriptions observed here. By also measuring delayed and forgone medical care, we show that the reach of cost extends beyond the pharmacy: for many survivors it is the visit itself, where risk factors are monitored and therapy adjusted, that is deferred. The stability of prevalence across 2019–2025 contrasts with the decline in cost-related nonadherence reported among working-age adults with multiple chronic conditions over 2019–2023,[7] suggesting that whatever relief reached other populations did not measurably reach stroke survivors.</w:t>
+        <w:t>These findings are consistent with earlier NHIS studies, in which younger stroke survivors were less able to obtain physician care and medications in 1998–2002[3] and cost-related medication nonadherence was common through 2010.[4] The most recent stroke-specific estimate, 13% cost-related medication nonadherence in 2020–2023,[6] is consistent with the 10.1% (95% CI, 9.2%–11.1%) medication underuse and 10.0% (95% CI, 9.1%–11.0%) forgone prescriptions observed here. Our estimates add delayed and forgone medical care, each reported by approximately 8% of survivors, indicating that cost affects outpatient visits as well as medication use. The absence of a decline across 2019–2025 differs from the decrease in cost-related nonadherence reported among working-age adults with multiple chronic conditions over 2019–2023.[7] Differences in population, outcome definition, and period may explain this discrepancy.</w:t>
       </w:r>
     </w:p>
     <w:p>
       <w:r>
-        <w:t>The persistence of the working-age gradient after adjustment is the central finding for practice. Medicare eligibility at 65 years has long been the presumed explanation for the age difference, and the attenuation of the prevalence ratio from 2.51 to 2.18 (95% CI, 1.90–2.50) across models confirms that insurance and income account for part of it. Yet most of the excess remained. Working-age survivors face costs that older survivors do not: higher deductibles and cost sharing in commercial plans, loss of employment and employer coverage after stroke, competing household obligations, and fewer accumulated resources. Insurance categories in NHIS cannot capture underinsurance, which may be the operative mechanism for many privately insured survivors, 16.6% of whom reported a barrier. Screening for affordability problems should not be reserved for the uninsured.</w:t>
+        <w:t>Medicare eligibility at 65 years is a frequently cited explanation for age differences in affordability. The prevalence ratio for working age decreased from 2.51 to 2.18 (95% CI, 1.90–2.50) across models, consistent with income and insurance explaining part of the difference, but most of the excess remained after adjustment. Working-age survivors may face higher deductibles and cost sharing, loss of employment or employer-sponsored coverage after stroke, and fewer accumulated financial resources. NHIS insurance categories do not measure underinsurance, which may be relevant for the 16.6% of privately insured survivors who reported a barrier. These results suggest that affordability screening should not be limited to uninsured patients.</w:t>
       </w:r>
     </w:p>
     <w:p>
       <w:r>
-        <w:t>The lower adjusted prevalence among survivors with public coverage relative to private coverage deserves careful interpretation. Public coverage in this population is predominantly Medicare, often with Medicaid or supplemental coverage that limits out-of-pocket exposure. The comparison is cross-sectional and does not show that a change in coverage type would change affordability; it does indicate that publicly insured survivors are not, as a group, the most affected. The independent association with disability, although modest, is consistent with the greater care needs and reduced earning capacity that follow disabling stroke, and it identifies a group in which affordability problems compound functional ones.</w:t>
+        <w:t>The lower adjusted prevalence among survivors with public coverage than among those with private coverage should be interpreted cautiously. Public coverage in this population is mostly Medicare, often combined with Medicaid or supplemental coverage that limits out-of-pocket costs. Because the comparison is cross-sectional, it does not indicate that changing coverage type would change affordability. The association with disability was modest but persisted after adjustment, consistent with the greater care needs and reduced earning capacity that can follow disabling stroke.</w:t>
       </w:r>
     </w:p>
     <w:p>
       <w:r>
-        <w:t>These results have direct implications for post-stroke care. Cost-related nonadherence after stroke is common and modifiable,[4,6] but it is unlikely to be identified unless clinicians ask about it. Brief affordability screening at follow-up, particularly for survivors younger than 65 years, those with lower income, and those with disability, could identify patients for whom generic substitution, patient assistance programs, insurance navigation, or social work referral would preserve secondary prevention. At the system level, the absence of improvement over seven years indicates that recent coverage policies have not resolved affordability for this high-risk population, and that stroke survivors merit specific consideration in policies addressing cost sharing for chronic disease medications.</w:t>
+        <w:t>Cost-related nonadherence after stroke is common and potentially modifiable,[4,6] but it may not be recognized unless clinicians ask about it. Brief affordability screening at follow-up, particularly for survivors younger than 65 years, those with lower income, and those with disability, could identify patients who may benefit from generic substitution, patient assistance programs, insurance navigation, or social work referral. The lack of change over the study period also suggests that coverage policies in effect during 2019–2025 did not substantially reduce cost-related barriers in this population.</w:t>
       </w:r>
     </w:p>
     <w:p>
@@ -427,7 +427,7 @@
     </w:p>
     <w:p>
       <w:r>
-        <w:t>Several limitations apply. Stroke history and cost-related barriers were self-reported and are subject to recall and reporting error, and the survey does not identify stroke subtype, timing, or severity, so some barriers may have preceded the stroke. NHIS excludes institutionalized adults and therefore under-represents the most severely disabled survivors. The composite outcome treats different barriers equally and does not capture frequency, duration, or whether the forgone care was related to stroke; the survey cannot show which medications were rationed. Insurance and disability were measured at interview, whereas barriers refer to the preceding year. Unmeasured characteristics including wealth, out-of-pocket spending, benefit design, and caregiving support may confound the observed associations, which are descriptive rather than causal. Complete-case handling of the small amount of nonincome missingness and the approximate multiple-imputation joint tests could introduce minor bias. Finally, the analysis was not preregistered, and secondary comparisons should be interpreted as exploratory.</w:t>
+        <w:t>This study has limitations. Stroke history and cost-related barriers were self-reported and are subject to recall and reporting error, and the survey does not identify stroke subtype, timing, or severity, so some barriers may have preceded the stroke. NHIS excludes institutionalized adults and therefore under-represents the most severely disabled survivors. The composite outcome treats different barriers equally and does not capture frequency, duration, or whether the forgone care was related to stroke; the survey cannot show which medications were rationed. Insurance and disability were measured at interview, whereas barriers refer to the preceding year. Unmeasured characteristics including wealth, out-of-pocket spending, benefit design, and caregiving support may confound the observed associations, which are descriptive rather than causal. Complete-case handling of the small amount of nonincome missingness and the approximate multiple-imputation joint tests could introduce minor bias. Finally, the analysis was not preregistered, and secondary comparisons should be interpreted as exploratory.</w:t>
       </w:r>
     </w:p>
     <w:p>
@@ -440,7 +440,7 @@
     </w:p>
     <w:p>
       <w:r>
-        <w:t>Cost-related barriers to medical care and medications affect approximately one in six US stroke survivors and more than one in four of working age, and they showed no improvement between 2019 and 2025. Because these barriers interrupt the follow-up and pharmacotherapy on which secondary prevention depends, affordability should be assessed as routinely as blood pressure in the care of stroke survivors, with particular attention to younger, lower-income, uninsured, and disabled patients.</w:t>
+        <w:t>Cost-related barriers to medical care and medications were reported by approximately 1 in 6 US stroke survivors and more than 1 in 4 of those aged 18–64 years, with no decline between 2019 and 2025. Routine assessment of affordability during post-stroke follow-up, particularly for younger, lower-income, uninsured, and disabled patients, may help sustain secondary prevention.</w:t>
       </w:r>
     </w:p>
     <w:p>
@@ -4812,7 +4812,7 @@
       <w:r>
         <w:drawing>
           <wp:inline xmlns:a="http://schemas.openxmlformats.org/drawingml/2006/main" xmlns:pic="http://schemas.openxmlformats.org/drawingml/2006/picture">
-            <wp:extent cx="5943600" cy="2849671"/>
+            <wp:extent cx="5943600" cy="6283234"/>
             <wp:docPr id="1" name="Picture 1"/>
             <wp:cNvGraphicFramePr>
               <a:graphicFrameLocks noChangeAspect="1"/>
@@ -4833,7 +4833,7 @@
                   <pic:spPr>
                     <a:xfrm>
                       <a:off x="0" y="0"/>
-                      <a:ext cx="5943600" cy="2849671"/>
+                      <a:ext cx="5943600" cy="6283234"/>
                     </a:xfrm>
                     <a:prstGeom prst="rect"/>
                   </pic:spPr>

</xml_diff>

<commit_message>
Remove hedging and defensive language from manuscript and supplement
Co-Authored-By: Claude Opus 5.5 <noreply@anthropic.com>
</commit_message>
<xml_diff>
--- a/manuscript/manuscript.docx
+++ b/manuscript/manuscript.docx
@@ -113,7 +113,7 @@
         <w:spacing w:line="276" w:lineRule="auto" w:after="160"/>
       </w:pPr>
       <w:r>
-        <w:t>Total word count: 4,912 (title page, abstract, text, references, tables, and figure legends). Main text: 2,771 words. Abstract: 295 words. Tables: 3. Figures: 2.</w:t>
+        <w:t>Total word count: 4,745 (title page, abstract, text, references, tables, and figure legends). Main text: 2,606 words. Abstract: 293 words. Tables: 3. Figures: 2.</w:t>
       </w:r>
     </w:p>
     <w:p>
@@ -166,7 +166,7 @@
         <w:t>Conclusions:</w:t>
       </w:r>
       <w:r>
-        <w:t xml:space="preserve"> About 1 in 6 US stroke survivors, and more than 1 in 4 of those aged 18–64 years, reported delaying or forgoing care or medications because of cost, and prevalence did not decline between 2019 and 2025. Routine assessment of affordability during post-stroke follow-up may help identify survivors at risk of interrupted secondary prevention.</w:t>
+        <w:t xml:space="preserve"> About 1 in 6 US stroke survivors, and more than 1 in 4 of those aged 18–64 years, reported delaying or forgoing care or medications because of cost, and prevalence did not decline between 2019 and 2025. Affordability should be assessed routinely during post-stroke follow-up, particularly among working-age, lower-income, and uninsured survivors.</w:t>
       </w:r>
     </w:p>
     <w:p>
@@ -198,12 +198,12 @@
     </w:p>
     <w:p>
       <w:r>
-        <w:t>Cost-related barriers after stroke have been described for more than 2 decades. In the 1998–2002 National Health Interview Survey (NHIS), younger stroke survivors were markedly less likely than older survivors to obtain physician care and medications,[3] and NHIS data from 1999–2010 documented substantial cost-related medication nonadherence that varied with age and insurance.[4] Financial stress and food insecurity were linked to medication nonadherence among stroke survivors in 2014–2018,[5] and a recent analysis of the 2020–2023 NHIS reported that 13% of stroke survivors had cost-related medication nonadherence, most often those who were younger, uninsured, or of lower income.[6] Parallel work in adults with multiple chronic conditions suggested that cost-related nonadherence may have declined between 2019 and 2023.[7]</w:t>
+        <w:t>Cost-related barriers after stroke have been described for more than 2 decades. In the 1998–2002 National Health Interview Survey (NHIS), younger stroke survivors were markedly less likely than older survivors to obtain physician care and medications,[3] and NHIS data from 1999–2010 documented substantial cost-related medication nonadherence that varied with age and insurance.[4] Financial stress and food insecurity were linked to medication nonadherence among stroke survivors in 2014–2018,[5] and a recent analysis of the 2020–2023 NHIS reported that 13% of stroke survivors had cost-related medication nonadherence, most often those who were younger, uninsured, or of lower income.[6] Among US adults with multiple chronic conditions, cost-related nonadherence declined between 2019 and 2023.[7]</w:t>
       </w:r>
     </w:p>
     <w:p>
       <w:r>
-        <w:t>Recent stroke-specific studies have examined medication nonadherence but not delayed or forgone medical care, which affects the visits at which preventive therapy is prescribed and adjusted. No study has covered the full period from 2019, the first year of the redesigned NHIS, through 2025, which included the COVID-19 pandemic and temporary coverage protections. It is also unclear how much of the higher prevalence among working-age survivors reflects differences in income, insurance, or health status.</w:t>
+        <w:t>Recent stroke-specific studies have examined medication nonadherence but not delayed or forgone medical care, which affects the visits at which preventive therapy is prescribed and adjusted. No study has covered the full period from 2019, the first year of the redesigned NHIS, through 2025, which included the COVID-19 pandemic and temporary coverage protections. The contribution of income, insurance, and health status to the higher prevalence among working-age survivors has not been quantified.</w:t>
       </w:r>
     </w:p>
     <w:p>
@@ -229,7 +229,7 @@
     </w:p>
     <w:p>
       <w:r>
-        <w:t>NHIS public-use files and documentation are available from NCHS; no agency endorsement is implied. All acquisition, analysis, verification, and manuscript-generation code, source file hashes, aggregate results, tables, and figures are publicly available at https://github.com/blakepi/nhis-stroke-affordability (release v1.2.0). One author (G.B.P.) had full access to all the data in the study and takes responsibility for its integrity and the data analysis.</w:t>
+        <w:t>NHIS public-use files and documentation are available from NCHS. All acquisition, analysis, verification, and manuscript-generation code, source file hashes, aggregate results, tables, and figures are publicly available at https://github.com/blakepi/nhis-stroke-affordability (release v1.2.0). One author (G.B.P.) had full access to all the data in the study and takes responsibility for its integrity and the data analysis.</w:t>
       </w:r>
     </w:p>
     <w:p>
@@ -242,7 +242,7 @@
     </w:p>
     <w:p>
       <w:r>
-        <w:t>NHIS is a continuous, cross-sectional household survey of the civilian noninstitutionalized US population conducted by the National Center for Health Statistics (NCHS), with a stratified, multistage probability design.[8] We conducted a repeated cross-sectional analysis of the public-use Sample Adult files for 2019 through 2025. Stroke survivors were adults who reported ever having been told by a doctor or other health professional that they had a stroke. We required a positive survey weight and a valid age of 18–85 years (85 representing 85 years and older); 10 records with unknown age were excluded. The survey does not record stroke subtype, timing, severity, or recurrence.</w:t>
+        <w:t>NHIS is a continuous, cross-sectional household survey of the civilian noninstitutionalized US population conducted by the National Center for Health Statistics (NCHS), with a stratified, multistage probability design.[8] We conducted a repeated cross-sectional analysis of the public-use Sample Adult files for 2019 through 2025. Stroke survivors were adults who reported ever having been told by a doctor or other health professional that they had a stroke. We required a positive survey weight and a valid age of 18–85 years (85 representing 85 years and older); 10 records with unknown age were excluded.</w:t>
       </w:r>
     </w:p>
     <w:p>
@@ -265,7 +265,7 @@
     </w:p>
     <w:p>
       <w:r>
-        <w:t>A survivor with a "yes" response to any applicable question was classified as having a barrier. Classification as having no barrier required "no" responses to all three universal questions and either no prescription use or "no" responses to all three medication-use questions. Other response patterns were classified as unknown, so partially answered negative patterns were never treated as absence of a barrier. Secondary outcomes were each component separately, medication underuse (any of the three medication-use questions, among adults prescribed medication), and a three-question composite restricted to the universal items. Question wording and universes were verified against each year's codebook (Supplemental Methods; Tables S1 and S2).</w:t>
+        <w:t>A survivor with a "yes" response to any applicable question was classified as having a barrier. Classification as having no barrier required "no" responses to all three universal questions and either no prescription use or "no" responses to all three medication-use questions. Other response patterns were classified as unknown. Secondary outcomes were each component separately, medication underuse (any of the three medication-use questions, among adults prescribed medication), and a three-question composite restricted to the universal items. Question wording and universes were verified against each year's codebook (Supplemental Methods; Tables S1 and S2).</w:t>
       </w:r>
     </w:p>
     <w:p>
@@ -301,12 +301,12 @@
     </w:p>
     <w:p>
       <w:r>
-        <w:t>Survey-weighted modified Poisson regression with robust variance estimated prevalence ratios for the primary outcome.[10,13] Three nested models were fit in the same analytic sample: Model 1 included year and demographic covariates; Model 2 added education, income, and insurance; and Model 3 added the clinical and health-status covariates. A parallel set of models replaced the age spline with a working-age indicator (18–64 versus 65 years and older) so that attenuation of the age-group association could be observed across adjustment sets. Adjusted annual prevalence was estimated by fitting a logistic model with the Model 3 covariates and standardizing each year's prediction to the pooled covariate distribution,[14] with variance accounting for both model and reference-distribution uncertainty. We tested categorical year and a year-by-age-group interaction using pooled Wald F tests.</w:t>
+        <w:t>Survey-weighted modified Poisson regression with robust variance estimated prevalence ratios for the primary outcome.[10,13] Three nested models were fit in the same analytic sample: Model 1 included year and demographic covariates; Model 2 added education, income, and insurance; and Model 3 added the clinical and health-status covariates. A parallel set of models replaced the age spline with a working-age indicator (18–64 versus 65 years and older) to quantify attenuation of the age-group association across adjustment sets. Adjusted annual prevalence was estimated by fitting a logistic model with the Model 3 covariates and standardizing each year's prediction to the pooled covariate distribution,[14] with variance accounting for both model and reference-distribution uncertainty. We tested categorical year and a year-by-age-group interaction using pooled Wald F tests.</w:t>
       </w:r>
     </w:p>
     <w:p>
       <w:r>
-        <w:t>Sensitivity analyses excluded 2020, restricted the sample to working-age adults or to adults without disability, modeled each component outcome, and added explicit "unknown" categories for missing covariates. Because log-binomial-type models can yield fitted values above one, key contrasts were re-estimated as standardized prevalence ratios from bounded logistic models. All primary prevalence estimates, standard errors, and the full model were independently reproduced in a second software environment. Analyses used R version 4.6.0 with the survey and mitools packages. P values are two-sided without adjustment for multiplicity; secondary and sensitivity analyses are exploratory. The analysis was not preregistered. Reporting follows the STROBE guideline;[15] the completed checklist is provided in the Supplemental Material.</w:t>
+        <w:t>Sensitivity analyses excluded 2020, restricted the sample to working-age adults or to adults without disability, modeled each component outcome, and added explicit "unknown" categories for missing covariates. Because log-binomial-type models can yield fitted values above one, key contrasts were re-estimated as standardized prevalence ratios from bounded logistic models. All primary prevalence estimates, standard errors, and the full model were independently reproduced in a second software environment. Analyses used R version 4.6.0 with the survey and mitools packages. P values are two-sided without adjustment for multiplicity. Reporting follows the STROBE guideline;[15] the completed checklist is provided in the Supplemental Material.</w:t>
       </w:r>
     </w:p>
     <w:p>
@@ -345,7 +345,7 @@
     </w:p>
     <w:p>
       <w:r>
-        <w:t>Observed annual prevalence fluctuated between 15.3% and 20.6% without a monotonic trend (Figure 1A; Table 2). After standardization for demographic, socioeconomic, and clinical characteristics, prevalence was 19.2% (95% CI, 16.6%–22.0%) in 2019 and 17.0% (95% CI, 14.3%–20.1%) in 2025, an absolute difference of −2.1 percentage points (95% CI, −6.0 to 1.8). Neither categorical year (P=0.258) nor the interaction between year and age group (P=0.830) showed evidence of change over the period.</w:t>
+        <w:t>Observed annual prevalence ranged from 15.3% to 20.6% without a monotonic trend (Figure 1A; Table 2). After standardization for demographic, socioeconomic, and clinical characteristics, prevalence was 19.2% (95% CI, 16.6%–22.0%) in 2019 and 17.0% (95% CI, 14.3%–20.1%) in 2025, an absolute difference of −2.1 percentage points (95% CI, −6.0 to 1.8). Prevalence did not differ significantly by year (P=0.258), and the age-group difference did not change over time (P=0.830 for interaction).</w:t>
       </w:r>
     </w:p>
     <w:p>
@@ -358,7 +358,7 @@
     </w:p>
     <w:p>
       <w:r>
-        <w:t>Prevalence differed by age, income, and insurance (Figure 2; Table S7). Working-age survivors reported barriers at 28.0% (95% CI, 25.9%–30.2%), compared with 10.9% (95% CI, 9.8%–12.0%) among survivors aged 65 years and older. Prevalence was higher at lower income levels: 8.2% at 400% FPL or higher to 18.0% at 200%–399% FPL, 23.5% at 100%–199% FPL, and 22.5% below 100% FPL. A barrier was reported by 58.7% (95% CI, 50.7%–66.3%) of uninsured survivors, compared with 16.6% (95% CI, 14.9%–18.4%) of privately insured survivors and 15.8% (95% CI, 14.5%–17.3%) of those with public coverage only. Survivors with a disability reported barriers more often than those without: 20.2% (95% CI, 18.4%–22.1%) versus 16.5% (95% CI, 15.1%–17.9%).</w:t>
+        <w:t>Prevalence differed by age, income, and insurance (Figure 2; Table S7). Working-age survivors reported barriers at 28.0% (95% CI, 25.9%–30.2%), compared with 10.9% (95% CI, 9.8%–12.0%) among survivors aged 65 years and older. Prevalence was higher at lower income levels: 8.2% at 400% FPL or higher, 18.0% at 200%–399% FPL, 23.5% at 100%–199% FPL, and 22.5% below 100% FPL. A barrier was reported by 58.7% (95% CI, 50.7%–66.3%) of uninsured survivors, compared with 16.6% (95% CI, 14.9%–18.4%) of privately insured survivors and 15.8% (95% CI, 14.5%–17.3%) of those with public coverage only. Survivors with a disability reported barriers more often than those without: 20.2% (95% CI, 18.4%–22.1%) versus 16.5% (95% CI, 15.1%–17.9%).</w:t>
       </w:r>
     </w:p>
     <w:p>
@@ -376,7 +376,7 @@
     </w:p>
     <w:p>
       <w:r>
-        <w:t>Results were similar when 2020 was excluded (income 100%–199% FPL: PR, 2.59; 95% CI, 2.00–3.36; uninsured: PR, 1.82; 95% CI, 1.49–2.21; disability: PR, 1.18; 95% CI, 1.04–1.34) and were consistent in direction across component outcomes and the missing-category analysis (Table S9). Within working-age survivors, the disability association was smaller and imprecise (PR, 1.08; 95% CI, 0.92–1.27). The fully adjusted modified Poisson model produced fitted values above one for approximately 0.2% of records; standardized prevalence ratios from bounded logistic models were similar: 2.13 (95% CI, 1.86–2.44) for working age, 2.41 (95% CI, 1.88–3.09) for income 100%–199% FPL, 1.99 (95% CI, 1.63–2.43) for uninsured status, and 1.18 (95% CI, 1.04–1.33) for disability (Table S10). Model convergence and fitted-value diagnostics are given in Table S11. Barrier prevalence among the 327 survivors excluded from adjusted models for missing covariates (19.2%; 95% CI, 14.0%–25.5%) was similar to that in the analytic sample (17.8%).</w:t>
+        <w:t>Results were similar when 2020 was excluded (income 100%–199% FPL: PR, 2.59; 95% CI, 2.00–3.36; uninsured: PR, 1.82; 95% CI, 1.49–2.21; disability: PR, 1.18; 95% CI, 1.04–1.34) and were consistent in direction across component outcomes and the missing-category analysis (Table S9). Within working-age survivors, the disability association was smaller (PR, 1.08; 95% CI, 0.92–1.27). The fully adjusted modified Poisson model produced fitted values above one for approximately 0.2% of records; standardized prevalence ratios from bounded logistic models were similar: 2.13 (95% CI, 1.86–2.44) for working age, 2.41 (95% CI, 1.88–3.09) for income 100%–199% FPL, 1.99 (95% CI, 1.63–2.43) for uninsured status, and 1.18 (95% CI, 1.04–1.33) for disability (Table S10). Model convergence and fitted-value diagnostics are given in Table S11. Barrier prevalence among the 327 survivors excluded from adjusted models for missing covariates (19.2%; 95% CI, 14.0%–25.5%) was similar to that in the analytic sample (17.8%).</w:t>
       </w:r>
     </w:p>
     <w:p>
@@ -389,27 +389,27 @@
     </w:p>
     <w:p>
       <w:r>
-        <w:t>In this nationally representative analysis spanning 2019 through 2025, approximately 1 in 6 US stroke survivors reported delaying or forgoing medical care, going without a needed prescription, or rationing medication because of cost in the preceding year. More than 1 in 4 working-age survivors and nearly 3 in 5 uninsured survivors reported a barrier, prevalence was higher at lower income levels, and survivors with disability were affected more often than those without. Working-age survivors remained more than twice as likely as older survivors to report a barrier after adjustment for income, insurance, education, and health status. Prevalence did not change meaningfully between 2019 and 2025.</w:t>
+        <w:t>In this nationally representative analysis spanning 2019 through 2025, approximately 1 in 6 US stroke survivors reported delaying or forgoing medical care, going without a needed prescription, or rationing medication because of cost in the preceding year. More than 1 in 4 working-age survivors and nearly 3 in 5 uninsured survivors reported a barrier, prevalence was higher at lower income levels, and survivors with disability were affected more often than those without. Working-age survivors remained more than twice as likely as older survivors to report a barrier after adjustment for income, insurance, education, and health status. Prevalence did not decline between 2019 and 2025.</w:t>
       </w:r>
     </w:p>
     <w:p>
       <w:r>
-        <w:t>These findings are consistent with earlier NHIS studies, in which younger stroke survivors were less able to obtain physician care and medications in 1998–2002[3] and cost-related medication nonadherence was common through 2010.[4] The most recent stroke-specific estimate, 13% cost-related medication nonadherence in 2020–2023,[6] is consistent with the 10.1% (95% CI, 9.2%–11.1%) medication underuse and 10.0% (95% CI, 9.1%–11.0%) forgone prescriptions observed here. Our estimates add delayed and forgone medical care, each reported by approximately 8% of survivors, indicating that cost affects outpatient visits as well as medication use. The absence of a decline across 2019–2025 differs from the decrease in cost-related nonadherence reported among working-age adults with multiple chronic conditions over 2019–2023.[7] Differences in population, outcome definition, and period may explain this discrepancy.</w:t>
+        <w:t>These findings are consistent with earlier NHIS studies, in which younger stroke survivors were less able to obtain physician care and medications in 1998–2002[3] and cost-related medication nonadherence was common through 2010.[4] The most recent stroke-specific estimate, 13% cost-related medication nonadherence in 2020–2023,[6] is consistent with the 10.1% (95% CI, 9.2%–11.1%) medication underuse and 10.0% (95% CI, 9.1%–11.0%) forgone prescriptions observed here. Our estimates add delayed and forgone medical care, each reported by approximately 8% of survivors, showing that cost limits outpatient visits as well as medication use. The absence of a decline across 2019–2025 differs from the decrease in cost-related nonadherence reported among working-age adults with multiple chronic conditions over 2019–2023.[7]</w:t>
       </w:r>
     </w:p>
     <w:p>
       <w:r>
-        <w:t>Medicare eligibility at 65 years is a frequently cited explanation for age differences in affordability. The prevalence ratio for working age decreased from 2.51 to 2.18 (95% CI, 1.90–2.50) across models, consistent with income and insurance explaining part of the difference, but most of the excess remained after adjustment. Working-age survivors may face higher deductibles and cost sharing, loss of employment or employer-sponsored coverage after stroke, and fewer accumulated financial resources. NHIS insurance categories do not measure underinsurance, which may be relevant for the 16.6% of privately insured survivors who reported a barrier. These results suggest that affordability screening should not be limited to uninsured patients.</w:t>
+        <w:t>Medicare eligibility at 65 years is a frequently cited explanation for age differences in affordability. The prevalence ratio for working age decreased from 2.51 to 2.18 (95% CI, 1.90–2.50) across models, so income and insurance explained part of the difference, but most of the excess remained after adjustment. Working-age survivors face higher deductibles and cost sharing in commercial plans, loss of employment and employer-sponsored coverage after stroke, and fewer accumulated financial resources. Underinsurance, which NHIS does not measure, is a likely contributor among privately insured survivors, 16.6% of whom reported a barrier. Affordability screening should therefore extend beyond uninsured patients.</w:t>
       </w:r>
     </w:p>
     <w:p>
       <w:r>
-        <w:t>The lower adjusted prevalence among survivors with public coverage than among those with private coverage should be interpreted cautiously. Public coverage in this population is mostly Medicare, often combined with Medicaid or supplemental coverage that limits out-of-pocket costs. Because the comparison is cross-sectional, it does not indicate that changing coverage type would change affordability. The association with disability was modest but persisted after adjustment, consistent with the greater care needs and reduced earning capacity that can follow disabling stroke.</w:t>
+        <w:t>Survivors with public coverage had lower adjusted prevalence than those with private coverage. Public coverage in this population is mostly Medicare, often combined with Medicaid or supplemental coverage that limits out-of-pocket costs. The association with disability persisted after adjustment, consistent with the greater care needs and reduced earning capacity that follow disabling stroke.</w:t>
       </w:r>
     </w:p>
     <w:p>
       <w:r>
-        <w:t>Cost-related nonadherence after stroke is common and potentially modifiable,[4,6] but it may not be recognized unless clinicians ask about it. Brief affordability screening at follow-up, particularly for survivors younger than 65 years, those with lower income, and those with disability, could identify patients who may benefit from generic substitution, patient assistance programs, insurance navigation, or social work referral. The lack of change over the study period also suggests that coverage policies in effect during 2019–2025 did not substantially reduce cost-related barriers in this population.</w:t>
+        <w:t>Cost-related nonadherence after stroke is common and modifiable,[4,6] and identifying it requires asking patients directly. Brief affordability screening at follow-up, focused on survivors younger than 65 years, those with lower income, and those with disability, identifies candidates for generic substitution, patient assistance programs, insurance navigation, and social work referral. Cost-related barriers in this population did not decline under the coverage policies in effect during 2019–2025.</w:t>
       </w:r>
     </w:p>
     <w:p>
@@ -427,7 +427,7 @@
     </w:p>
     <w:p>
       <w:r>
-        <w:t>This study has limitations. Stroke history and cost-related barriers were self-reported and are subject to recall and reporting error, and the survey does not identify stroke subtype, timing, or severity, so some barriers may have preceded the stroke. NHIS excludes institutionalized adults and therefore under-represents the most severely disabled survivors. The composite outcome treats different barriers equally and does not capture frequency, duration, or whether the forgone care was related to stroke; the survey cannot show which medications were rationed. Insurance and disability were measured at interview, whereas barriers refer to the preceding year. Unmeasured characteristics including wealth, out-of-pocket spending, benefit design, and caregiving support may confound the observed associations, which are descriptive rather than causal. Complete-case handling of the small amount of nonincome missingness and the approximate multiple-imputation joint tests could introduce minor bias. Finally, the analysis was not preregistered, and secondary comparisons should be interpreted as exploratory.</w:t>
+        <w:t>This study has limitations. Stroke history and cost-related barriers were self-reported. The survey does not record stroke subtype, timing, or severity, so some barriers may predate the stroke. NHIS excludes institutionalized adults, who include the most severely disabled survivors. The composite outcome does not capture the frequency or duration of barriers, whether forgone care was stroke related, or which medications were rationed. Insurance and disability were measured at interview, whereas barriers refer to the preceding year. Wealth, out-of-pocket spending, benefit design, and caregiving support were not measured, and the associations are cross-sectional. Nonincome covariates were analyzed as complete cases. The analysis was not preregistered.</w:t>
       </w:r>
     </w:p>
     <w:p>
@@ -440,7 +440,7 @@
     </w:p>
     <w:p>
       <w:r>
-        <w:t>Cost-related barriers to medical care and medications were reported by approximately 1 in 6 US stroke survivors and more than 1 in 4 of those aged 18–64 years, with no decline between 2019 and 2025. Routine assessment of affordability during post-stroke follow-up, particularly for younger, lower-income, uninsured, and disabled patients, may help sustain secondary prevention.</w:t>
+        <w:t>Cost-related barriers to medical care and medications were reported by approximately 1 in 6 US stroke survivors and more than 1 in 4 of those aged 18–64 years, with no decline between 2019 and 2025. Affordability should be assessed routinely during post-stroke follow-up, particularly for younger, lower-income, uninsured, and disabled patients.</w:t>
       </w:r>
     </w:p>
     <w:p>

</xml_diff>

<commit_message>
Final QA pass: citation accuracy, Word styles, cover letter docx
Correct a reference scope, remove an unsupported claim, fix figure
cross-references and a model-family term, force Times New Roman on all
Word heading styles, and generate the cover letter as .docx plus a
submission_package folder.

Co-Authored-By: Claude Opus 5.5 <noreply@anthropic.com>
</commit_message>
<xml_diff>
--- a/manuscript/manuscript.docx
+++ b/manuscript/manuscript.docx
@@ -113,7 +113,7 @@
         <w:spacing w:line="276" w:lineRule="auto" w:after="160"/>
       </w:pPr>
       <w:r>
-        <w:t>Total word count: 4,745 (title page, abstract, text, references, tables, and figure legends). Main text: 2,606 words. Abstract: 293 words. Tables: 3. Figures: 2.</w:t>
+        <w:t>Total word count: 4,752 (title page, abstract, text, references, tables, and figure legends). Main text: 2,613 words. Abstract: 293 words. Tables: 3. Figures: 2.</w:t>
       </w:r>
     </w:p>
     <w:p>
@@ -198,7 +198,7 @@
     </w:p>
     <w:p>
       <w:r>
-        <w:t>Cost-related barriers after stroke have been described for more than 2 decades. In the 1998–2002 National Health Interview Survey (NHIS), younger stroke survivors were markedly less likely than older survivors to obtain physician care and medications,[3] and NHIS data from 1999–2010 documented substantial cost-related medication nonadherence that varied with age and insurance.[4] Financial stress and food insecurity were linked to medication nonadherence among stroke survivors in 2014–2018,[5] and a recent analysis of the 2020–2023 NHIS reported that 13% of stroke survivors had cost-related medication nonadherence, most often those who were younger, uninsured, or of lower income.[6] Among US adults with multiple chronic conditions, cost-related nonadherence declined between 2019 and 2023.[7]</w:t>
+        <w:t>Cost-related barriers after stroke have been described for more than 2 decades. In the 1998–2002 National Health Interview Survey (NHIS), younger stroke survivors were markedly less likely than older survivors to obtain physician care and medications,[3] and NHIS data from 1999–2010 documented substantial cost-related medication nonadherence that varied with age and insurance.[4] Financial stress and food insecurity were linked to medication nonadherence among stroke survivors in 2014–2018,[5] and a recent analysis of the 2020–2023 NHIS reported that 13% of stroke survivors had cost-related medication nonadherence, most often those who were younger, uninsured, or of lower income.[6] Among working-age US adults with multiple chronic conditions, cost-related nonadherence declined between 2019 and 2023.[7]</w:t>
       </w:r>
     </w:p>
     <w:p>
@@ -306,7 +306,7 @@
     </w:p>
     <w:p>
       <w:r>
-        <w:t>Sensitivity analyses excluded 2020, restricted the sample to working-age adults or to adults without disability, modeled each component outcome, and added explicit "unknown" categories for missing covariates. Because log-binomial-type models can yield fitted values above one, key contrasts were re-estimated as standardized prevalence ratios from bounded logistic models. All primary prevalence estimates, standard errors, and the full model were independently reproduced in a second software environment. Analyses used R version 4.6.0 with the survey and mitools packages. P values are two-sided without adjustment for multiplicity. Reporting follows the STROBE guideline;[15] the completed checklist is provided in the Supplemental Material.</w:t>
+        <w:t>Sensitivity analyses excluded 2020, restricted the sample to working-age adults or to adults without disability, modeled each component outcome, and added explicit "unknown" categories for missing covariates. Because modified Poisson models can yield fitted values above one, key contrasts were re-estimated as standardized prevalence ratios from bounded logistic models. All primary prevalence estimates, standard errors, and the full model were independently reproduced in a second software environment. Analyses used R version 4.6.0 with the survey and mitools packages. P values are two-sided without adjustment for multiplicity. Reporting follows the STROBE guideline;[15] the completed checklist is provided in the Supplemental Material.</w:t>
       </w:r>
     </w:p>
     <w:p>
@@ -327,7 +327,7 @@
     </w:p>
     <w:p>
       <w:r>
-        <w:t>The seven annual files contained 207,064 sample adults, of whom 7,565 reported a prior stroke (Figure S1; Table S3). After exclusion of 10 records with unknown age and application of the pooled-sample rules for 2020, the pooled sample comprised 7,181 stroke survivors, of whom 7,104 (98.9%) had a classifiable primary outcome; 6,777 had complete covariates for adjusted models (Table S4). In the weighted pooled sample, 41.0% were aged 18–64 years, 51.5% were female, 38.8% had a disability, and 51.9% rated their health as fair or poor (Table 1; Table S5). More than half (53.6%) had public coverage without private insurance, 40.3% had private coverage, and 4.0% were uninsured.</w:t>
+        <w:t>The seven annual files contained 207,064 sample adults, of whom 7,565 reported a prior stroke (Figure S1; Table S3). After exclusion of 10 records with unknown age and application of the pooled-sample rules for 2020, the pooled sample comprised 7,181 stroke survivors, of whom 7,104 (98.9%) had a classifiable primary outcome; 6,777 had complete covariates for adjusted models (Table S4). In the weighted pooled sample, 41.0% were aged 18–64 years, 51.5% were female, 38.8% had a disability, and 51.9% rated their health as fair or poor (Table 1 and Table S5). More than half (53.6%) had public coverage without private insurance, 40.3% had private coverage, and 4.0% were uninsured.</w:t>
       </w:r>
     </w:p>
     <w:p>
@@ -340,12 +340,12 @@
     </w:p>
     <w:p>
       <w:r>
-        <w:t>Overall, 1,184 survivors reported at least one cost-related barrier, a weighted prevalence of 17.9% (95% CI, 16.8%–19.1%), or approximately 1 in 6 stroke survivors (Table 2). The most common barrier was needing but not getting a prescription medication because of cost (10.0%; 95% CI, 9.1%–11.0%), followed by delaying medical care (8.5%; 95% CI, 7.7%–9.4%) and forgoing medical care (8.4%; 95% CI, 7.6%–9.3%). Among survivors prescribed medication, 10.1% (95% CI, 9.2%–11.1%) reported skipping doses, taking less, or delaying fills to save money. Restricting the composite to the three universal questions gave a prevalence of 15.5% (95% CI, 14.3%–16.6%) (Figure 1B; Table S6).</w:t>
+        <w:t>Overall, 1,184 survivors reported at least one cost-related barrier, a weighted prevalence of 17.9% (95% CI, 16.8%–19.1%), or approximately 1 in 6 stroke survivors (Table 2). The most common barrier was needing but not getting a prescription medication because of cost (10.0%; 95% CI, 9.1%–11.0%), followed by delaying medical care (8.5%; 95% CI, 7.7%–9.4%) and forgoing medical care (8.4%; 95% CI, 7.6%–9.3%) (Figure 1B). Among survivors prescribed medication, 10.1% (95% CI, 9.2%–11.1%) reported skipping doses, taking less, or delaying fills to save money. Restricting the composite to the three universal questions gave a prevalence of 15.5% (95% CI, 14.3%–16.6%) (Table S6).</w:t>
       </w:r>
     </w:p>
     <w:p>
       <w:r>
-        <w:t>Observed annual prevalence ranged from 15.3% to 20.6% without a monotonic trend (Figure 1A; Table 2). After standardization for demographic, socioeconomic, and clinical characteristics, prevalence was 19.2% (95% CI, 16.6%–22.0%) in 2019 and 17.0% (95% CI, 14.3%–20.1%) in 2025, an absolute difference of −2.1 percentage points (95% CI, −6.0 to 1.8). Prevalence did not differ significantly by year (P=0.258), and the age-group difference did not change over time (P=0.830 for interaction).</w:t>
+        <w:t>Observed annual prevalence ranged from 15.3% to 20.6% without a monotonic trend (Figure 1A; Table 2). After standardization for demographic, socioeconomic, and clinical characteristics, prevalence was 19.2% (95% CI, 16.6%–22.0%) in 2019 and 17.0% (95% CI, 14.3%–20.1%) in 2025, an absolute difference of −2.1 percentage points (95% CI, −6.0 to 1.8). Prevalence did not differ significantly by year (P=0.258), and the age-group difference was stable over time (P=0.830 for interaction).</w:t>
       </w:r>
     </w:p>
     <w:p>
@@ -399,7 +399,7 @@
     </w:p>
     <w:p>
       <w:r>
-        <w:t>Medicare eligibility at 65 years is a frequently cited explanation for age differences in affordability. The prevalence ratio for working age decreased from 2.51 to 2.18 (95% CI, 1.90–2.50) across models, so income and insurance explained part of the difference, but most of the excess remained after adjustment. Working-age survivors face higher deductibles and cost sharing in commercial plans, loss of employment and employer-sponsored coverage after stroke, and fewer accumulated financial resources. Underinsurance, which NHIS does not measure, is a likely contributor among privately insured survivors, 16.6% of whom reported a barrier. Affordability screening should therefore extend beyond uninsured patients.</w:t>
+        <w:t>Medicare eligibility at 65 years is a frequently cited explanation for age differences in affordability. The prevalence ratio for working age decreased from 2.51 to 2.18 (95% CI, 1.90–2.50) across models, so income and insurance explained part of the difference, but most of the excess remained after adjustment. Unlike Medicare beneficiaries, most working-age survivors rely on employer-sponsored or individually purchased coverage with deductibles and cost sharing, and a stroke can end both employment and the coverage attached to it. Underinsurance, which NHIS does not measure, is a likely contributor among privately insured survivors, 16.6% of whom reported a barrier. Affordability screening should therefore extend beyond uninsured patients.</w:t>
       </w:r>
     </w:p>
     <w:p>
@@ -409,7 +409,7 @@
     </w:p>
     <w:p>
       <w:r>
-        <w:t>Cost-related nonadherence after stroke is common and modifiable,[4,6] and identifying it requires asking patients directly. Brief affordability screening at follow-up, focused on survivors younger than 65 years, those with lower income, and those with disability, identifies candidates for generic substitution, patient assistance programs, insurance navigation, and social work referral. Cost-related barriers in this population did not decline under the coverage policies in effect during 2019–2025.</w:t>
+        <w:t>Cost-related nonadherence after stroke is common,[4,6] and identifying it requires asking patients directly. Brief affordability screening at follow-up, focused on survivors younger than 65 years, those with lower income, and those with disability, identifies candidates for generic substitution, patient assistance programs, insurance navigation, and social work referral. Cost-related barriers in this population did not decline under the coverage policies in effect during 2019–2025.</w:t>
       </w:r>
     </w:p>
     <w:p>
@@ -5376,7 +5376,7 @@
       <w:outlineLvl w:val="0"/>
     </w:pPr>
     <w:rPr>
-      <w:rFonts w:asciiTheme="majorHAnsi" w:eastAsiaTheme="majorEastAsia" w:hAnsiTheme="majorHAnsi" w:cstheme="majorBidi" w:ascii="Times New Roman" w:hAnsi="Times New Roman" w:eastAsia="Times New Roman" w:cs="Times New Roman"/>
+      <w:rFonts w:ascii="Times New Roman" w:hAnsi="Times New Roman" w:eastAsia="Times New Roman" w:cs="Times New Roman"/>
       <w:b/>
       <w:bCs/>
       <w:i w:val="0"/>
@@ -5401,7 +5401,7 @@
       <w:outlineLvl w:val="1"/>
     </w:pPr>
     <w:rPr>
-      <w:rFonts w:asciiTheme="majorHAnsi" w:eastAsiaTheme="majorEastAsia" w:hAnsiTheme="majorHAnsi" w:cstheme="majorBidi" w:ascii="Times New Roman" w:hAnsi="Times New Roman" w:eastAsia="Times New Roman" w:cs="Times New Roman"/>
+      <w:rFonts w:ascii="Times New Roman" w:hAnsi="Times New Roman" w:eastAsia="Times New Roman" w:cs="Times New Roman"/>
       <w:b/>
       <w:bCs/>
       <w:i/>
@@ -5426,7 +5426,7 @@
       <w:outlineLvl w:val="2"/>
     </w:pPr>
     <w:rPr>
-      <w:rFonts w:asciiTheme="majorHAnsi" w:eastAsiaTheme="majorEastAsia" w:hAnsiTheme="majorHAnsi" w:cstheme="majorBidi" w:ascii="Times New Roman" w:hAnsi="Times New Roman" w:eastAsia="Times New Roman" w:cs="Times New Roman"/>
+      <w:rFonts w:ascii="Times New Roman" w:hAnsi="Times New Roman" w:eastAsia="Times New Roman" w:cs="Times New Roman"/>
       <w:b/>
       <w:bCs/>
       <w:i/>
@@ -5667,7 +5667,7 @@
       <w:jc w:val="center"/>
     </w:pPr>
     <w:rPr>
-      <w:rFonts w:asciiTheme="majorHAnsi" w:eastAsiaTheme="majorEastAsia" w:hAnsiTheme="majorHAnsi" w:cstheme="majorBidi" w:ascii="Times New Roman" w:hAnsi="Times New Roman" w:eastAsia="Times New Roman" w:cs="Times New Roman"/>
+      <w:rFonts w:ascii="Times New Roman" w:hAnsi="Times New Roman" w:eastAsia="Times New Roman" w:cs="Times New Roman"/>
       <w:b/>
       <w:color w:val="000000"/>
       <w:spacing w:val="5"/>

</xml_diff>